<commit_message>
update doc and pdf
</commit_message>
<xml_diff>
--- a/Ransomware.docx
+++ b/Ransomware.docx
@@ -487,7 +487,7 @@
             <w:rPr>
               <w:rFonts w:asciiTheme="minorHAnsi" w:eastAsiaTheme="minorEastAsia" w:hAnsiTheme="minorHAnsi"/>
               <w:noProof/>
-              <w:lang w:val="en-US"/>
+              <w:lang w:eastAsia="bg-BG"/>
             </w:rPr>
           </w:pPr>
           <w:r>
@@ -499,7 +499,7 @@
           <w:r>
             <w:fldChar w:fldCharType="separate"/>
           </w:r>
-          <w:hyperlink w:anchor="_Toc223341818" w:history="1">
+          <w:hyperlink w:anchor="_Toc223346797" w:history="1">
             <w:r>
               <w:rPr>
                 <w:rStyle w:val="Hyperlink"/>
@@ -527,7 +527,7 @@
                 <w:noProof/>
                 <w:webHidden/>
               </w:rPr>
-              <w:instrText xml:space="preserve"> PAGEREF _Toc223341818 \h </w:instrText>
+              <w:instrText xml:space="preserve"> PAGEREF _Toc223346797 \h </w:instrText>
             </w:r>
             <w:r>
               <w:rPr>
@@ -567,10 +567,10 @@
             <w:rPr>
               <w:rFonts w:asciiTheme="minorHAnsi" w:eastAsiaTheme="minorEastAsia" w:hAnsiTheme="minorHAnsi"/>
               <w:noProof/>
-              <w:lang w:val="en-US"/>
+              <w:lang w:eastAsia="bg-BG"/>
             </w:rPr>
           </w:pPr>
-          <w:hyperlink w:anchor="_Toc223341819" w:history="1">
+          <w:hyperlink w:anchor="_Toc223346798" w:history="1">
             <w:r>
               <w:rPr>
                 <w:rStyle w:val="Hyperlink"/>
@@ -605,7 +605,7 @@
                 <w:noProof/>
                 <w:webHidden/>
               </w:rPr>
-              <w:instrText xml:space="preserve"> PAGEREF _Toc223341819 \h </w:instrText>
+              <w:instrText xml:space="preserve"> PAGEREF _Toc223346798 \h </w:instrText>
             </w:r>
             <w:r>
               <w:rPr>
@@ -645,10 +645,10 @@
             <w:rPr>
               <w:rFonts w:asciiTheme="minorHAnsi" w:eastAsiaTheme="minorEastAsia" w:hAnsiTheme="minorHAnsi"/>
               <w:noProof/>
-              <w:lang w:val="en-US"/>
+              <w:lang w:eastAsia="bg-BG"/>
             </w:rPr>
           </w:pPr>
-          <w:hyperlink w:anchor="_Toc223341820" w:history="1">
+          <w:hyperlink w:anchor="_Toc223346799" w:history="1">
             <w:r>
               <w:rPr>
                 <w:rStyle w:val="Hyperlink"/>
@@ -683,7 +683,7 @@
                 <w:noProof/>
                 <w:webHidden/>
               </w:rPr>
-              <w:instrText xml:space="preserve"> PAGEREF _Toc223341820 \h </w:instrText>
+              <w:instrText xml:space="preserve"> PAGEREF _Toc223346799 \h </w:instrText>
             </w:r>
             <w:r>
               <w:rPr>
@@ -724,10 +724,10 @@
             <w:rPr>
               <w:rFonts w:asciiTheme="minorHAnsi" w:eastAsiaTheme="minorEastAsia" w:hAnsiTheme="minorHAnsi"/>
               <w:noProof/>
-              <w:lang w:val="en-US"/>
+              <w:lang w:eastAsia="bg-BG"/>
             </w:rPr>
           </w:pPr>
-          <w:hyperlink w:anchor="_Toc223341821" w:history="1">
+          <w:hyperlink w:anchor="_Toc223346800" w:history="1">
             <w:r>
               <w:rPr>
                 <w:rStyle w:val="Hyperlink"/>
@@ -739,34 +739,34 @@
               <w:rPr>
                 <w:rFonts w:asciiTheme="minorHAnsi" w:eastAsiaTheme="minorEastAsia" w:hAnsiTheme="minorHAnsi"/>
                 <w:noProof/>
+                <w:lang w:eastAsia="bg-BG"/>
+              </w:rPr>
+              <w:tab/>
+            </w:r>
+            <w:r>
+              <w:rPr>
+                <w:rStyle w:val="Hyperlink"/>
+                <w:noProof/>
+              </w:rPr>
+              <w:t xml:space="preserve">Ранна фаза на </w:t>
+            </w:r>
+            <w:r>
+              <w:rPr>
+                <w:rStyle w:val="Hyperlink"/>
+                <w:noProof/>
                 <w:lang w:val="en-US"/>
               </w:rPr>
+              <w:t>Ransomware</w:t>
+            </w:r>
+            <w:r>
+              <w:rPr>
+                <w:noProof/>
+                <w:webHidden/>
+              </w:rPr>
               <w:tab/>
             </w:r>
             <w:r>
               <w:rPr>
-                <w:rStyle w:val="Hyperlink"/>
-                <w:noProof/>
-              </w:rPr>
-              <w:t xml:space="preserve">Ранна фаза на </w:t>
-            </w:r>
-            <w:r>
-              <w:rPr>
-                <w:rStyle w:val="Hyperlink"/>
-                <w:noProof/>
-                <w:lang w:val="en-US"/>
-              </w:rPr>
-              <w:t>Ransomware</w:t>
-            </w:r>
-            <w:r>
-              <w:rPr>
-                <w:noProof/>
-                <w:webHidden/>
-              </w:rPr>
-              <w:tab/>
-            </w:r>
-            <w:r>
-              <w:rPr>
                 <w:noProof/>
                 <w:webHidden/>
               </w:rPr>
@@ -777,7 +777,7 @@
                 <w:noProof/>
                 <w:webHidden/>
               </w:rPr>
-              <w:instrText xml:space="preserve"> PAGEREF _Toc223341821 \h </w:instrText>
+              <w:instrText xml:space="preserve"> PAGEREF _Toc223346800 \h </w:instrText>
             </w:r>
             <w:r>
               <w:rPr>
@@ -818,10 +818,10 @@
             <w:rPr>
               <w:rFonts w:asciiTheme="minorHAnsi" w:eastAsiaTheme="minorEastAsia" w:hAnsiTheme="minorHAnsi"/>
               <w:noProof/>
-              <w:lang w:val="en-US"/>
+              <w:lang w:eastAsia="bg-BG"/>
             </w:rPr>
           </w:pPr>
-          <w:hyperlink w:anchor="_Toc223341822" w:history="1">
+          <w:hyperlink w:anchor="_Toc223346801" w:history="1">
             <w:r>
               <w:rPr>
                 <w:rStyle w:val="Hyperlink"/>
@@ -833,49 +833,49 @@
               <w:rPr>
                 <w:rFonts w:asciiTheme="minorHAnsi" w:eastAsiaTheme="minorEastAsia" w:hAnsiTheme="minorHAnsi"/>
                 <w:noProof/>
+                <w:lang w:eastAsia="bg-BG"/>
+              </w:rPr>
+              <w:tab/>
+            </w:r>
+            <w:r>
+              <w:rPr>
+                <w:rStyle w:val="Hyperlink"/>
+                <w:noProof/>
                 <w:lang w:val="en-US"/>
               </w:rPr>
+              <w:t>Ransomware</w:t>
+            </w:r>
+            <w:r>
+              <w:rPr>
+                <w:rStyle w:val="Hyperlink"/>
+                <w:noProof/>
+              </w:rPr>
+              <w:t xml:space="preserve"> използващ </w:t>
+            </w:r>
+            <w:r>
+              <w:rPr>
+                <w:rStyle w:val="Hyperlink"/>
+                <w:noProof/>
+                <w:lang w:val="en-US"/>
+              </w:rPr>
+              <w:t>RSA</w:t>
+            </w:r>
+            <w:r>
+              <w:rPr>
+                <w:rStyle w:val="Hyperlink"/>
+                <w:noProof/>
+              </w:rPr>
+              <w:t xml:space="preserve"> криптиране</w:t>
+            </w:r>
+            <w:r>
+              <w:rPr>
+                <w:noProof/>
+                <w:webHidden/>
+              </w:rPr>
               <w:tab/>
             </w:r>
             <w:r>
               <w:rPr>
-                <w:rStyle w:val="Hyperlink"/>
-                <w:noProof/>
-                <w:lang w:val="en-US"/>
-              </w:rPr>
-              <w:t>Ransomware</w:t>
-            </w:r>
-            <w:r>
-              <w:rPr>
-                <w:rStyle w:val="Hyperlink"/>
-                <w:noProof/>
-              </w:rPr>
-              <w:t xml:space="preserve"> използващ </w:t>
-            </w:r>
-            <w:r>
-              <w:rPr>
-                <w:rStyle w:val="Hyperlink"/>
-                <w:noProof/>
-                <w:lang w:val="en-US"/>
-              </w:rPr>
-              <w:t>RSA</w:t>
-            </w:r>
-            <w:r>
-              <w:rPr>
-                <w:rStyle w:val="Hyperlink"/>
-                <w:noProof/>
-              </w:rPr>
-              <w:t xml:space="preserve"> криптиране</w:t>
-            </w:r>
-            <w:r>
-              <w:rPr>
-                <w:noProof/>
-                <w:webHidden/>
-              </w:rPr>
-              <w:tab/>
-            </w:r>
-            <w:r>
-              <w:rPr>
                 <w:noProof/>
                 <w:webHidden/>
               </w:rPr>
@@ -886,7 +886,7 @@
                 <w:noProof/>
                 <w:webHidden/>
               </w:rPr>
-              <w:instrText xml:space="preserve"> PAGEREF _Toc223341822 \h </w:instrText>
+              <w:instrText xml:space="preserve"> PAGEREF _Toc223346801 \h </w:instrText>
             </w:r>
             <w:r>
               <w:rPr>
@@ -927,10 +927,10 @@
             <w:rPr>
               <w:rFonts w:asciiTheme="minorHAnsi" w:eastAsiaTheme="minorEastAsia" w:hAnsiTheme="minorHAnsi"/>
               <w:noProof/>
-              <w:lang w:val="en-US"/>
+              <w:lang w:eastAsia="bg-BG"/>
             </w:rPr>
           </w:pPr>
-          <w:hyperlink w:anchor="_Toc223341823" w:history="1">
+          <w:hyperlink w:anchor="_Toc223346802" w:history="1">
             <w:r>
               <w:rPr>
                 <w:rStyle w:val="Hyperlink"/>
@@ -943,27 +943,27 @@
               <w:rPr>
                 <w:rFonts w:asciiTheme="minorHAnsi" w:eastAsiaTheme="minorEastAsia" w:hAnsiTheme="minorHAnsi"/>
                 <w:noProof/>
+                <w:lang w:eastAsia="bg-BG"/>
+              </w:rPr>
+              <w:tab/>
+            </w:r>
+            <w:r>
+              <w:rPr>
+                <w:rStyle w:val="Hyperlink"/>
+                <w:noProof/>
                 <w:lang w:val="en-US"/>
               </w:rPr>
+              <w:t>Spear phishing Ransomware</w:t>
+            </w:r>
+            <w:r>
+              <w:rPr>
+                <w:noProof/>
+                <w:webHidden/>
+              </w:rPr>
               <w:tab/>
             </w:r>
             <w:r>
               <w:rPr>
-                <w:rStyle w:val="Hyperlink"/>
-                <w:noProof/>
-                <w:lang w:val="en-US"/>
-              </w:rPr>
-              <w:t>Spear phishing Ransomware</w:t>
-            </w:r>
-            <w:r>
-              <w:rPr>
-                <w:noProof/>
-                <w:webHidden/>
-              </w:rPr>
-              <w:tab/>
-            </w:r>
-            <w:r>
-              <w:rPr>
                 <w:noProof/>
                 <w:webHidden/>
               </w:rPr>
@@ -974,7 +974,7 @@
                 <w:noProof/>
                 <w:webHidden/>
               </w:rPr>
-              <w:instrText xml:space="preserve"> PAGEREF _Toc223341823 \h </w:instrText>
+              <w:instrText xml:space="preserve"> PAGEREF _Toc223346802 \h </w:instrText>
             </w:r>
             <w:r>
               <w:rPr>
@@ -1015,10 +1015,10 @@
             <w:rPr>
               <w:rFonts w:asciiTheme="minorHAnsi" w:eastAsiaTheme="minorEastAsia" w:hAnsiTheme="minorHAnsi"/>
               <w:noProof/>
-              <w:lang w:val="en-US"/>
+              <w:lang w:eastAsia="bg-BG"/>
             </w:rPr>
           </w:pPr>
-          <w:hyperlink w:anchor="_Toc223341824" w:history="1">
+          <w:hyperlink w:anchor="_Toc223346803" w:history="1">
             <w:r>
               <w:rPr>
                 <w:rStyle w:val="Hyperlink"/>
@@ -1031,49 +1031,49 @@
               <w:rPr>
                 <w:rFonts w:asciiTheme="minorHAnsi" w:eastAsiaTheme="minorEastAsia" w:hAnsiTheme="minorHAnsi"/>
                 <w:noProof/>
+                <w:lang w:eastAsia="bg-BG"/>
+              </w:rPr>
+              <w:tab/>
+            </w:r>
+            <w:r>
+              <w:rPr>
+                <w:rStyle w:val="Hyperlink"/>
+                <w:noProof/>
                 <w:lang w:val="en-US"/>
               </w:rPr>
+              <w:t>Ransomware</w:t>
+            </w:r>
+            <w:r>
+              <w:rPr>
+                <w:rStyle w:val="Hyperlink"/>
+                <w:noProof/>
+              </w:rPr>
+              <w:t xml:space="preserve"> в </w:t>
+            </w:r>
+            <w:r>
+              <w:rPr>
+                <w:rStyle w:val="Hyperlink"/>
+                <w:noProof/>
+                <w:lang w:val="en-US"/>
+              </w:rPr>
+              <w:t xml:space="preserve">Android </w:t>
+            </w:r>
+            <w:r>
+              <w:rPr>
+                <w:rStyle w:val="Hyperlink"/>
+                <w:noProof/>
+              </w:rPr>
+              <w:t>базирани системи</w:t>
+            </w:r>
+            <w:r>
+              <w:rPr>
+                <w:noProof/>
+                <w:webHidden/>
+              </w:rPr>
               <w:tab/>
             </w:r>
             <w:r>
               <w:rPr>
-                <w:rStyle w:val="Hyperlink"/>
-                <w:noProof/>
-                <w:lang w:val="en-US"/>
-              </w:rPr>
-              <w:t>Ransomware</w:t>
-            </w:r>
-            <w:r>
-              <w:rPr>
-                <w:rStyle w:val="Hyperlink"/>
-                <w:noProof/>
-              </w:rPr>
-              <w:t xml:space="preserve"> в </w:t>
-            </w:r>
-            <w:r>
-              <w:rPr>
-                <w:rStyle w:val="Hyperlink"/>
-                <w:noProof/>
-                <w:lang w:val="en-US"/>
-              </w:rPr>
-              <w:t xml:space="preserve">Android </w:t>
-            </w:r>
-            <w:r>
-              <w:rPr>
-                <w:rStyle w:val="Hyperlink"/>
-                <w:noProof/>
-              </w:rPr>
-              <w:t>базирани системи</w:t>
-            </w:r>
-            <w:r>
-              <w:rPr>
-                <w:noProof/>
-                <w:webHidden/>
-              </w:rPr>
-              <w:tab/>
-            </w:r>
-            <w:r>
-              <w:rPr>
                 <w:noProof/>
                 <w:webHidden/>
               </w:rPr>
@@ -1084,7 +1084,7 @@
                 <w:noProof/>
                 <w:webHidden/>
               </w:rPr>
-              <w:instrText xml:space="preserve"> PAGEREF _Toc223341824 \h </w:instrText>
+              <w:instrText xml:space="preserve"> PAGEREF _Toc223346803 \h </w:instrText>
             </w:r>
             <w:r>
               <w:rPr>
@@ -1125,10 +1125,10 @@
             <w:rPr>
               <w:rFonts w:asciiTheme="minorHAnsi" w:eastAsiaTheme="minorEastAsia" w:hAnsiTheme="minorHAnsi"/>
               <w:noProof/>
-              <w:lang w:val="en-US"/>
+              <w:lang w:eastAsia="bg-BG"/>
             </w:rPr>
           </w:pPr>
-          <w:hyperlink w:anchor="_Toc223341825" w:history="1">
+          <w:hyperlink w:anchor="_Toc223346804" w:history="1">
             <w:r>
               <w:rPr>
                 <w:rStyle w:val="Hyperlink"/>
@@ -1140,42 +1140,42 @@
               <w:rPr>
                 <w:rFonts w:asciiTheme="minorHAnsi" w:eastAsiaTheme="minorEastAsia" w:hAnsiTheme="minorHAnsi"/>
                 <w:noProof/>
+                <w:lang w:eastAsia="bg-BG"/>
+              </w:rPr>
+              <w:tab/>
+            </w:r>
+            <w:r>
+              <w:rPr>
+                <w:rStyle w:val="Hyperlink"/>
+                <w:noProof/>
                 <w:lang w:val="en-US"/>
               </w:rPr>
+              <w:t xml:space="preserve">Big Game Hunting (BGH) </w:t>
+            </w:r>
+            <w:r>
+              <w:rPr>
+                <w:rStyle w:val="Hyperlink"/>
+                <w:noProof/>
+              </w:rPr>
+              <w:t xml:space="preserve">и </w:t>
+            </w:r>
+            <w:r>
+              <w:rPr>
+                <w:rStyle w:val="Hyperlink"/>
+                <w:noProof/>
+                <w:lang w:val="en-US"/>
+              </w:rPr>
+              <w:t>Ransomware</w:t>
+            </w:r>
+            <w:r>
+              <w:rPr>
+                <w:noProof/>
+                <w:webHidden/>
+              </w:rPr>
               <w:tab/>
             </w:r>
             <w:r>
               <w:rPr>
-                <w:rStyle w:val="Hyperlink"/>
-                <w:noProof/>
-                <w:lang w:val="en-US"/>
-              </w:rPr>
-              <w:t xml:space="preserve">Big Game Hunting (BGH) </w:t>
-            </w:r>
-            <w:r>
-              <w:rPr>
-                <w:rStyle w:val="Hyperlink"/>
-                <w:noProof/>
-              </w:rPr>
-              <w:t xml:space="preserve">и </w:t>
-            </w:r>
-            <w:r>
-              <w:rPr>
-                <w:rStyle w:val="Hyperlink"/>
-                <w:noProof/>
-                <w:lang w:val="en-US"/>
-              </w:rPr>
-              <w:t>Ransomware</w:t>
-            </w:r>
-            <w:r>
-              <w:rPr>
-                <w:noProof/>
-                <w:webHidden/>
-              </w:rPr>
-              <w:tab/>
-            </w:r>
-            <w:r>
-              <w:rPr>
                 <w:noProof/>
                 <w:webHidden/>
               </w:rPr>
@@ -1186,7 +1186,7 @@
                 <w:noProof/>
                 <w:webHidden/>
               </w:rPr>
-              <w:instrText xml:space="preserve"> PAGEREF _Toc223341825 \h </w:instrText>
+              <w:instrText xml:space="preserve"> PAGEREF _Toc223346804 \h </w:instrText>
             </w:r>
             <w:r>
               <w:rPr>
@@ -1226,10 +1226,10 @@
             <w:rPr>
               <w:rFonts w:asciiTheme="minorHAnsi" w:eastAsiaTheme="minorEastAsia" w:hAnsiTheme="minorHAnsi"/>
               <w:noProof/>
-              <w:lang w:val="en-US"/>
+              <w:lang w:eastAsia="bg-BG"/>
             </w:rPr>
           </w:pPr>
-          <w:hyperlink w:anchor="_Toc223341826" w:history="1">
+          <w:hyperlink w:anchor="_Toc223346805" w:history="1">
             <w:r>
               <w:rPr>
                 <w:rStyle w:val="Hyperlink"/>
@@ -1264,7 +1264,7 @@
                 <w:noProof/>
                 <w:webHidden/>
               </w:rPr>
-              <w:instrText xml:space="preserve"> PAGEREF _Toc223341826 \h </w:instrText>
+              <w:instrText xml:space="preserve"> PAGEREF _Toc223346805 \h </w:instrText>
             </w:r>
             <w:r>
               <w:rPr>
@@ -1305,10 +1305,10 @@
             <w:rPr>
               <w:rFonts w:asciiTheme="minorHAnsi" w:eastAsiaTheme="minorEastAsia" w:hAnsiTheme="minorHAnsi"/>
               <w:noProof/>
-              <w:lang w:val="en-US"/>
+              <w:lang w:eastAsia="bg-BG"/>
             </w:rPr>
           </w:pPr>
-          <w:hyperlink w:anchor="_Toc223341827" w:history="1">
+          <w:hyperlink w:anchor="_Toc223346806" w:history="1">
             <w:r>
               <w:rPr>
                 <w:rStyle w:val="Hyperlink"/>
@@ -1320,41 +1320,41 @@
               <w:rPr>
                 <w:rFonts w:asciiTheme="minorHAnsi" w:eastAsiaTheme="minorEastAsia" w:hAnsiTheme="minorHAnsi"/>
                 <w:noProof/>
+                <w:lang w:eastAsia="bg-BG"/>
+              </w:rPr>
+              <w:tab/>
+            </w:r>
+            <w:r>
+              <w:rPr>
+                <w:rStyle w:val="Hyperlink"/>
+                <w:noProof/>
+              </w:rPr>
+              <w:t xml:space="preserve">Подготовка за </w:t>
+            </w:r>
+            <w:r>
+              <w:rPr>
+                <w:rStyle w:val="Hyperlink"/>
+                <w:noProof/>
                 <w:lang w:val="en-US"/>
               </w:rPr>
+              <w:t>Ransomware</w:t>
+            </w:r>
+            <w:r>
+              <w:rPr>
+                <w:rStyle w:val="Hyperlink"/>
+                <w:noProof/>
+              </w:rPr>
+              <w:t xml:space="preserve"> инциденти</w:t>
+            </w:r>
+            <w:r>
+              <w:rPr>
+                <w:noProof/>
+                <w:webHidden/>
+              </w:rPr>
               <w:tab/>
             </w:r>
             <w:r>
               <w:rPr>
-                <w:rStyle w:val="Hyperlink"/>
-                <w:noProof/>
-              </w:rPr>
-              <w:t xml:space="preserve">Подготовка за </w:t>
-            </w:r>
-            <w:r>
-              <w:rPr>
-                <w:rStyle w:val="Hyperlink"/>
-                <w:noProof/>
-                <w:lang w:val="en-US"/>
-              </w:rPr>
-              <w:t>Ransomware</w:t>
-            </w:r>
-            <w:r>
-              <w:rPr>
-                <w:rStyle w:val="Hyperlink"/>
-                <w:noProof/>
-              </w:rPr>
-              <w:t xml:space="preserve"> инциденти</w:t>
-            </w:r>
-            <w:r>
-              <w:rPr>
-                <w:noProof/>
-                <w:webHidden/>
-              </w:rPr>
-              <w:tab/>
-            </w:r>
-            <w:r>
-              <w:rPr>
                 <w:noProof/>
                 <w:webHidden/>
               </w:rPr>
@@ -1365,7 +1365,7 @@
                 <w:noProof/>
                 <w:webHidden/>
               </w:rPr>
-              <w:instrText xml:space="preserve"> PAGEREF _Toc223341827 \h </w:instrText>
+              <w:instrText xml:space="preserve"> PAGEREF _Toc223346806 \h </w:instrText>
             </w:r>
             <w:r>
               <w:rPr>
@@ -1406,10 +1406,10 @@
             <w:rPr>
               <w:rFonts w:asciiTheme="minorHAnsi" w:eastAsiaTheme="minorEastAsia" w:hAnsiTheme="minorHAnsi"/>
               <w:noProof/>
-              <w:lang w:val="en-US"/>
+              <w:lang w:eastAsia="bg-BG"/>
             </w:rPr>
           </w:pPr>
-          <w:hyperlink w:anchor="_Toc223341828" w:history="1">
+          <w:hyperlink w:anchor="_Toc223346807" w:history="1">
             <w:r>
               <w:rPr>
                 <w:rStyle w:val="Hyperlink"/>
@@ -1422,7 +1422,7 @@
               <w:rPr>
                 <w:rFonts w:asciiTheme="minorHAnsi" w:eastAsiaTheme="minorEastAsia" w:hAnsiTheme="minorHAnsi"/>
                 <w:noProof/>
-                <w:lang w:val="en-US"/>
+                <w:lang w:eastAsia="bg-BG"/>
               </w:rPr>
               <w:tab/>
             </w:r>
@@ -1431,7 +1431,21 @@
                 <w:rStyle w:val="Hyperlink"/>
                 <w:noProof/>
               </w:rPr>
-              <w:t>Превенция на интернет-достъпни уязвимости</w:t>
+              <w:t>Превенция на инт</w:t>
+            </w:r>
+            <w:r>
+              <w:rPr>
+                <w:rStyle w:val="Hyperlink"/>
+                <w:noProof/>
+              </w:rPr>
+              <w:t>е</w:t>
+            </w:r>
+            <w:r>
+              <w:rPr>
+                <w:rStyle w:val="Hyperlink"/>
+                <w:noProof/>
+              </w:rPr>
+              <w:t>рнет-достъпни уязвимости</w:t>
             </w:r>
             <w:r>
               <w:rPr>
@@ -1452,7 +1466,7 @@
                 <w:noProof/>
                 <w:webHidden/>
               </w:rPr>
-              <w:instrText xml:space="preserve"> PAGEREF _Toc223341828 \h </w:instrText>
+              <w:instrText xml:space="preserve"> PAGEREF _Toc223346807 \h </w:instrText>
             </w:r>
             <w:r>
               <w:rPr>
@@ -1493,10 +1507,10 @@
             <w:rPr>
               <w:rFonts w:asciiTheme="minorHAnsi" w:eastAsiaTheme="minorEastAsia" w:hAnsiTheme="minorHAnsi"/>
               <w:noProof/>
-              <w:lang w:val="en-US"/>
+              <w:lang w:eastAsia="bg-BG"/>
             </w:rPr>
           </w:pPr>
-          <w:hyperlink w:anchor="_Toc223341829" w:history="1">
+          <w:hyperlink w:anchor="_Toc223346808" w:history="1">
             <w:r>
               <w:rPr>
                 <w:rStyle w:val="Hyperlink"/>
@@ -1508,34 +1522,34 @@
               <w:rPr>
                 <w:rFonts w:asciiTheme="minorHAnsi" w:eastAsiaTheme="minorEastAsia" w:hAnsiTheme="minorHAnsi"/>
                 <w:noProof/>
+                <w:lang w:eastAsia="bg-BG"/>
+              </w:rPr>
+              <w:tab/>
+            </w:r>
+            <w:r>
+              <w:rPr>
+                <w:rStyle w:val="Hyperlink"/>
+                <w:noProof/>
+              </w:rPr>
+              <w:t xml:space="preserve">Компрометирани </w:t>
+            </w:r>
+            <w:r>
+              <w:rPr>
+                <w:rStyle w:val="Hyperlink"/>
+                <w:noProof/>
                 <w:lang w:val="en-US"/>
               </w:rPr>
+              <w:t>credentials</w:t>
+            </w:r>
+            <w:r>
+              <w:rPr>
+                <w:noProof/>
+                <w:webHidden/>
+              </w:rPr>
               <w:tab/>
             </w:r>
             <w:r>
               <w:rPr>
-                <w:rStyle w:val="Hyperlink"/>
-                <w:noProof/>
-              </w:rPr>
-              <w:t xml:space="preserve">Компрометирани </w:t>
-            </w:r>
-            <w:r>
-              <w:rPr>
-                <w:rStyle w:val="Hyperlink"/>
-                <w:noProof/>
-                <w:lang w:val="en-US"/>
-              </w:rPr>
-              <w:t>credentials</w:t>
-            </w:r>
-            <w:r>
-              <w:rPr>
-                <w:noProof/>
-                <w:webHidden/>
-              </w:rPr>
-              <w:tab/>
-            </w:r>
-            <w:r>
-              <w:rPr>
                 <w:noProof/>
                 <w:webHidden/>
               </w:rPr>
@@ -1546,7 +1560,7 @@
                 <w:noProof/>
                 <w:webHidden/>
               </w:rPr>
-              <w:instrText xml:space="preserve"> PAGEREF _Toc223341829 \h </w:instrText>
+              <w:instrText xml:space="preserve"> PAGEREF _Toc223346808 \h </w:instrText>
             </w:r>
             <w:r>
               <w:rPr>
@@ -1586,10 +1600,10 @@
             <w:rPr>
               <w:rFonts w:asciiTheme="minorHAnsi" w:eastAsiaTheme="minorEastAsia" w:hAnsiTheme="minorHAnsi"/>
               <w:noProof/>
-              <w:lang w:val="en-US"/>
+              <w:lang w:eastAsia="bg-BG"/>
             </w:rPr>
           </w:pPr>
-          <w:hyperlink w:anchor="_Toc223341830" w:history="1">
+          <w:hyperlink w:anchor="_Toc223346809" w:history="1">
             <w:r>
               <w:rPr>
                 <w:rStyle w:val="Hyperlink"/>
@@ -1616,7 +1630,7 @@
                 <w:noProof/>
                 <w:webHidden/>
               </w:rPr>
-              <w:instrText xml:space="preserve"> PAGEREF _Toc223341830 \h </w:instrText>
+              <w:instrText xml:space="preserve"> PAGEREF _Toc223346809 \h </w:instrText>
             </w:r>
             <w:r>
               <w:rPr>
@@ -1678,7 +1692,7 @@
           <w:rFonts w:eastAsia="Aptos"/>
         </w:rPr>
       </w:pPr>
-      <w:bookmarkStart w:id="0" w:name="_Toc223341818"/>
+      <w:bookmarkStart w:id="0" w:name="_Toc223346797"/>
       <w:r>
         <w:rPr>
           <w:rFonts w:eastAsia="Aptos"/>
@@ -1846,7 +1860,7 @@
           <w:lang w:val="en-US"/>
         </w:rPr>
       </w:pPr>
-      <w:bookmarkStart w:id="1" w:name="_Toc223341819"/>
+      <w:bookmarkStart w:id="1" w:name="_Toc223346798"/>
       <w:r>
         <w:lastRenderedPageBreak/>
         <w:t xml:space="preserve">История на </w:t>
@@ -2015,7 +2029,7 @@
       <w:pPr>
         <w:pStyle w:val="Heading1"/>
       </w:pPr>
-      <w:bookmarkStart w:id="2" w:name="_Toc223341820"/>
+      <w:bookmarkStart w:id="2" w:name="_Toc223346799"/>
       <w:r>
         <w:lastRenderedPageBreak/>
         <w:t xml:space="preserve">Еволюция на </w:t>
@@ -2042,7 +2056,7 @@
           <w:numId w:val="2"/>
         </w:numPr>
       </w:pPr>
-      <w:bookmarkStart w:id="3" w:name="_Toc223341821"/>
+      <w:bookmarkStart w:id="3" w:name="_Toc223346800"/>
       <w:r>
         <w:t xml:space="preserve">Ранна фаза на </w:t>
       </w:r>
@@ -2290,7 +2304,7 @@
           <w:numId w:val="2"/>
         </w:numPr>
       </w:pPr>
-      <w:bookmarkStart w:id="4" w:name="_Toc223341822"/>
+      <w:bookmarkStart w:id="4" w:name="_Toc223346801"/>
       <w:r>
         <w:rPr>
           <w:lang w:val="en-US"/>
@@ -2701,7 +2715,7 @@
           <w:lang w:val="en-US"/>
         </w:rPr>
       </w:pPr>
-      <w:bookmarkStart w:id="5" w:name="_Toc223341823"/>
+      <w:bookmarkStart w:id="5" w:name="_Toc223346802"/>
       <w:r>
         <w:rPr>
           <w:lang w:val="en-US"/>
@@ -3157,7 +3171,7 @@
           <w:lang w:val="en-US"/>
         </w:rPr>
       </w:pPr>
-      <w:bookmarkStart w:id="6" w:name="_Toc223341824"/>
+      <w:bookmarkStart w:id="6" w:name="_Toc223346803"/>
       <w:r>
         <w:rPr>
           <w:lang w:val="en-US"/>
@@ -3325,7 +3339,7 @@
           <w:numId w:val="2"/>
         </w:numPr>
       </w:pPr>
-      <w:bookmarkStart w:id="7" w:name="_Toc223341825"/>
+      <w:bookmarkStart w:id="7" w:name="_Toc223346804"/>
       <w:r>
         <w:rPr>
           <w:lang w:val="en-US"/>
@@ -3547,7 +3561,7 @@
           <w:lang w:val="en-US"/>
         </w:rPr>
       </w:pPr>
-      <w:bookmarkStart w:id="8" w:name="_Toc223341826"/>
+      <w:bookmarkStart w:id="8" w:name="_Toc223346805"/>
       <w:r>
         <w:lastRenderedPageBreak/>
         <w:t xml:space="preserve">Стратегии и защита от </w:t>
@@ -3601,7 +3615,7 @@
           <w:numId w:val="6"/>
         </w:numPr>
       </w:pPr>
-      <w:bookmarkStart w:id="9" w:name="_Toc223341827"/>
+      <w:bookmarkStart w:id="9" w:name="_Toc223346806"/>
       <w:r>
         <w:t xml:space="preserve">Подготовка за </w:t>
       </w:r>
@@ -3786,10 +3800,7 @@
           <w:lang w:val="en-US"/>
         </w:rPr>
       </w:pPr>
-      <w:r>
-        <w:br w:type="page"/>
-      </w:r>
-      <w:bookmarkStart w:id="10" w:name="_Toc223341828"/>
+      <w:bookmarkStart w:id="10" w:name="_Toc223346807"/>
       <w:r>
         <w:lastRenderedPageBreak/>
         <w:t xml:space="preserve">Превенция </w:t>
@@ -4253,42 +4264,360 @@
         </w:rPr>
         <w:br w:type="page"/>
       </w:r>
-      <w:bookmarkStart w:id="11" w:name="_Toc223341829"/>
+      <w:bookmarkStart w:id="11" w:name="_Toc223346808"/>
       <w:r>
         <w:lastRenderedPageBreak/>
         <w:t xml:space="preserve">Компрометирани </w:t>
       </w:r>
-      <w:r>
-        <w:rPr>
-          <w:lang w:val="en-US"/>
-        </w:rPr>
-        <w:t>credentials</w:t>
-      </w:r>
       <w:bookmarkEnd w:id="11"/>
-    </w:p>
-    <w:p>
-      <w:pPr>
-        <w:ind w:left="360"/>
-        <w:rPr>
-          <w:lang w:val="en-US"/>
-        </w:rPr>
-      </w:pPr>
+      <w:r>
+        <w:t>пароли</w:t>
+      </w:r>
+    </w:p>
+    <w:p>
+      <w:pPr>
+        <w:ind w:firstLine="360"/>
+      </w:pPr>
+      <w:r>
+        <w:t xml:space="preserve">Задължителна имплементация на </w:t>
+      </w:r>
+      <w:r>
+        <w:rPr>
+          <w:lang w:val="en-US"/>
+        </w:rPr>
+        <w:t>MFA</w:t>
+      </w:r>
+      <w:r>
+        <w:t xml:space="preserve"> за всички услуги, особено имейли, </w:t>
+      </w:r>
+      <w:r>
+        <w:rPr>
+          <w:lang w:val="en-US"/>
+        </w:rPr>
+        <w:t>VPNs</w:t>
+      </w:r>
+      <w:r>
+        <w:t xml:space="preserve"> и акаунти, които имат достъп до важни системи. Ескалация към отговорните лица, когато дадена система е установена, че не позволява </w:t>
+      </w:r>
+      <w:r>
+        <w:rPr>
+          <w:lang w:val="en-US"/>
+        </w:rPr>
+        <w:t>MFA</w:t>
+      </w:r>
+      <w:r>
+        <w:t xml:space="preserve"> или потребители, които не използват </w:t>
+      </w:r>
+      <w:r>
+        <w:rPr>
+          <w:lang w:val="en-US"/>
+        </w:rPr>
+        <w:t xml:space="preserve">MFA. </w:t>
+      </w:r>
+      <w:r>
+        <w:t xml:space="preserve">Съвременните </w:t>
+      </w:r>
+      <w:r>
+        <w:rPr>
+          <w:lang w:val="en-US"/>
+        </w:rPr>
+        <w:t xml:space="preserve">Multi factor authentication </w:t>
+      </w:r>
+      <w:r>
+        <w:t xml:space="preserve">заменят процеса с двете пароли към аутентикация с пръстов отпечатък, лицево разпознаване, ПИН на устройството или криптографичен ключ. </w:t>
+      </w:r>
+    </w:p>
+    <w:p>
+      <w:pPr>
+        <w:ind w:firstLine="360"/>
+      </w:pPr>
+      <w:r>
+        <w:t xml:space="preserve">Имплементация на </w:t>
+      </w:r>
+      <w:r>
+        <w:rPr>
+          <w:lang w:val="en-US"/>
+        </w:rPr>
+        <w:t xml:space="preserve">Identity and Access Management (IAM) </w:t>
+      </w:r>
+      <w:r>
+        <w:t xml:space="preserve">системи, за да могат администраторите за мониторинг и менажиране на роли, достъп до мрежи на </w:t>
+      </w:r>
+      <w:r>
+        <w:rPr>
+          <w:lang w:val="en-US"/>
+        </w:rPr>
+        <w:t>on-premise</w:t>
+      </w:r>
+      <w:r>
+        <w:t xml:space="preserve"> и </w:t>
+      </w:r>
+      <w:r>
+        <w:rPr>
+          <w:lang w:val="en-US"/>
+        </w:rPr>
+        <w:t>cloud</w:t>
+      </w:r>
+      <w:r>
+        <w:t xml:space="preserve"> базирани апликации.</w:t>
+      </w:r>
+    </w:p>
+    <w:p>
+      <w:pPr>
+        <w:ind w:firstLine="360"/>
+      </w:pPr>
+      <w:r>
+        <w:t xml:space="preserve">Подмяна на админските пароли. Често по време на разработка на дадена услуга/апликация, програмистите използват пароли, които са известни на целия екип, за да си улеснят работния процес. Това е приемливо, когато продуктът не е деплойнат и само се тестват функционалностите. Ако тези пароли останат в </w:t>
+      </w:r>
+      <w:r>
+        <w:rPr>
+          <w:lang w:val="en-US"/>
+        </w:rPr>
+        <w:t>codebase</w:t>
+      </w:r>
+      <w:r>
+        <w:t xml:space="preserve">, тогава хакерът има </w:t>
+      </w:r>
+      <w:r>
+        <w:rPr>
+          <w:lang w:val="en-US"/>
+        </w:rPr>
+        <w:t>backdoor</w:t>
+      </w:r>
+      <w:r>
+        <w:t xml:space="preserve"> (фиг. 10)</w:t>
+      </w:r>
+      <w:r>
+        <w:rPr>
+          <w:lang w:val="en-US"/>
+        </w:rPr>
+        <w:t xml:space="preserve">. </w:t>
+      </w:r>
+      <w:r>
+        <w:t>Същото важи и за акаунти с</w:t>
+      </w:r>
+      <w:r>
+        <w:rPr>
+          <w:lang w:val="en-US"/>
+        </w:rPr>
+        <w:t xml:space="preserve"> root access,</w:t>
+      </w:r>
+      <w:r>
+        <w:t xml:space="preserve"> които се използват за ежедневни задачи.</w:t>
+      </w:r>
+    </w:p>
+    <w:p>
+      <w:pPr>
+        <w:ind w:firstLine="360"/>
+      </w:pPr>
+      <w:r>
+        <w:t xml:space="preserve">Независимо дали става въпрос за лични акаунти или фирмени, необходимо е една парола да бъде поне 15 символа. Използването на </w:t>
+      </w:r>
+      <w:r>
+        <w:rPr>
+          <w:lang w:val="en-US"/>
+        </w:rPr>
+        <w:t xml:space="preserve">Password managers e </w:t>
+      </w:r>
+      <w:r>
+        <w:t xml:space="preserve">препоръчително, ако потребителят има проблем с запомнянето на паролите. Не трябва пароли да се съхраняват в текстови файлове в </w:t>
+      </w:r>
+      <w:r>
+        <w:t xml:space="preserve">устройствата. </w:t>
+      </w:r>
+      <w:r>
+        <w:t>Не е добре паролите да се съхраняват в браузера.</w:t>
+      </w:r>
+    </w:p>
+    <w:p>
+      <w:pPr>
+        <w:ind w:firstLine="360"/>
+      </w:pPr>
+      <w:r>
+        <w:t xml:space="preserve">Имплементация на заключване на акаунти при множество неуспешни опити. Логване и мониторинг на опитите за логин е необходимо за разпознаване на </w:t>
+      </w:r>
+      <w:r>
+        <w:rPr>
+          <w:lang w:val="en-US"/>
+        </w:rPr>
+        <w:t>brute force</w:t>
+      </w:r>
+      <w:r>
+        <w:t xml:space="preserve"> атаки.</w:t>
+      </w:r>
+    </w:p>
+    <w:p>
+      <w:pPr>
+        <w:ind w:firstLine="360"/>
+      </w:pPr>
+      <w:r>
+        <w:t>Токени и други</w:t>
+      </w:r>
+      <w:r>
+        <w:rPr>
+          <w:lang w:val="en-US"/>
+        </w:rPr>
+        <w:t xml:space="preserve"> private keys</w:t>
+      </w:r>
+      <w:r>
+        <w:t xml:space="preserve"> трябва да се помещават в </w:t>
+      </w:r>
+      <w:r>
+        <w:rPr>
+          <w:lang w:val="en-US"/>
+        </w:rPr>
+        <w:t>vaults.</w:t>
+      </w:r>
+      <w:r>
+        <w:t xml:space="preserve"> Задължително е използването на силно</w:t>
+      </w:r>
+      <w:r>
+        <w:rPr>
+          <w:lang w:val="en-US"/>
+        </w:rPr>
+        <w:t xml:space="preserve"> </w:t>
+      </w:r>
+      <w:r>
+        <w:t>хаширащи алгоритми.</w:t>
+      </w:r>
+      <w:r>
+        <w:t xml:space="preserve"> Едно такова решение е имплементацията на </w:t>
+      </w:r>
+      <w:r>
+        <w:rPr>
+          <w:lang w:val="en-US"/>
+        </w:rPr>
+        <w:t>HashiCorp Vault. Vault</w:t>
+      </w:r>
+      <w:r>
+        <w:t xml:space="preserve"> е система за чувствителна информация – пароли, </w:t>
+      </w:r>
+      <w:r>
+        <w:rPr>
+          <w:lang w:val="en-US"/>
+        </w:rPr>
+        <w:t>API</w:t>
+      </w:r>
+      <w:r>
+        <w:t xml:space="preserve"> ключове, токени, </w:t>
+      </w:r>
+      <w:r>
+        <w:rPr>
+          <w:lang w:val="en-US"/>
+        </w:rPr>
+        <w:t>SSH</w:t>
+      </w:r>
+      <w:r>
+        <w:t xml:space="preserve"> ключове, </w:t>
+      </w:r>
+      <w:r>
+        <w:rPr>
+          <w:lang w:val="en-US"/>
+        </w:rPr>
+        <w:t>TLS</w:t>
+      </w:r>
+      <w:r>
+        <w:t xml:space="preserve"> сертификати и др. Решава проблема на </w:t>
+      </w:r>
+      <w:r>
+        <w:rPr>
+          <w:lang w:val="en-US"/>
+        </w:rPr>
+        <w:t>hardcoded</w:t>
+      </w:r>
+      <w:r>
+        <w:t xml:space="preserve"> пароли, споделени пароли, частни ключове в гит и ръчна ротация. Данните в </w:t>
+      </w:r>
+      <w:r>
+        <w:rPr>
+          <w:lang w:val="en-US"/>
+        </w:rPr>
+        <w:t>vault</w:t>
+      </w:r>
+      <w:r>
+        <w:t xml:space="preserve"> са криптирани, има контрол до достъпа и </w:t>
+      </w:r>
+      <w:r>
+        <w:rPr>
+          <w:lang w:val="en-US"/>
+        </w:rPr>
+        <w:t xml:space="preserve">audit </w:t>
+      </w:r>
+      <w:r>
+        <w:t xml:space="preserve">логове. Поддържа </w:t>
+      </w:r>
+      <w:r>
+        <w:rPr>
+          <w:lang w:val="en-US"/>
+        </w:rPr>
+        <w:t>LDAP, OIDC, IAM</w:t>
+      </w:r>
+      <w:r>
+        <w:t xml:space="preserve"> и много други. </w:t>
+      </w:r>
+    </w:p>
+    <w:p>
+      <w:pPr>
+        <w:ind w:firstLine="360"/>
+      </w:pPr>
+      <w:r>
+        <w:rPr>
+          <w:noProof/>
+        </w:rPr>
+        <w:drawing>
+          <wp:inline distT="0" distB="0" distL="0" distR="0" wp14:anchorId="2539453B" wp14:editId="524CEDBD">
+            <wp:extent cx="5471160" cy="1966047"/>
+            <wp:effectExtent l="0" t="0" r="0" b="0"/>
+            <wp:docPr id="470062905" name="Picture 1"/>
+            <wp:cNvGraphicFramePr>
+              <a:graphicFrameLocks xmlns:a="http://schemas.openxmlformats.org/drawingml/2006/main" noChangeAspect="1"/>
+            </wp:cNvGraphicFramePr>
+            <a:graphic xmlns:a="http://schemas.openxmlformats.org/drawingml/2006/main">
+              <a:graphicData uri="http://schemas.openxmlformats.org/drawingml/2006/picture">
+                <pic:pic xmlns:pic="http://schemas.openxmlformats.org/drawingml/2006/picture">
+                  <pic:nvPicPr>
+                    <pic:cNvPr id="470062905" name=""/>
+                    <pic:cNvPicPr/>
+                  </pic:nvPicPr>
+                  <pic:blipFill>
+                    <a:blip r:embed="rId21"/>
+                    <a:stretch>
+                      <a:fillRect/>
+                    </a:stretch>
+                  </pic:blipFill>
+                  <pic:spPr>
+                    <a:xfrm>
+                      <a:off x="0" y="0"/>
+                      <a:ext cx="5480519" cy="1969410"/>
+                    </a:xfrm>
+                    <a:prstGeom prst="rect">
+                      <a:avLst/>
+                    </a:prstGeom>
+                  </pic:spPr>
+                </pic:pic>
+              </a:graphicData>
+            </a:graphic>
+          </wp:inline>
+        </w:drawing>
+      </w:r>
     </w:p>
     <w:p>
       <w:pPr>
         <w:jc w:val="left"/>
         <w:rPr>
-          <w:lang w:val="en-US"/>
-        </w:rPr>
-      </w:pPr>
-      <w:r>
-        <w:rPr>
-          <w:lang w:val="en-US"/>
-        </w:rPr>
-        <w:br w:type="page"/>
-      </w:r>
-    </w:p>
-    <w:bookmarkStart w:id="12" w:name="_Toc223341830" w:displacedByCustomXml="next"/>
+          <w:sz w:val="20"/>
+          <w:szCs w:val="20"/>
+        </w:rPr>
+      </w:pPr>
+      <w:r>
+        <w:rPr>
+          <w:sz w:val="20"/>
+          <w:szCs w:val="20"/>
+        </w:rPr>
+        <w:t>(Фиг. 10 – диаграма защо използването на пароли по подразбиране не е препоръчително)</w:t>
+      </w:r>
+    </w:p>
+    <w:bookmarkStart w:id="12" w:name="_Toc223346809" w:displacedByCustomXml="next"/>
     <w:sdt>
       <w:sdtPr>
         <w:rPr>
@@ -6812,14 +7141,6 @@
 </file>
 
 <file path=customXml/item1.xml><?xml version="1.0" encoding="utf-8"?>
-<p:properties xmlns:p="http://schemas.microsoft.com/office/2006/metadata/properties" xmlns:xsi="http://www.w3.org/2001/XMLSchema-instance" xmlns:pc="http://schemas.microsoft.com/office/infopath/2007/PartnerControls">
-  <documentManagement>
-    <_activity xmlns="16eb03e4-fe34-41e0-b148-6c2f228be8b6" xsi:nil="true"/>
-  </documentManagement>
-</p:properties>
-</file>
-
-<file path=customXml/item2.xml><?xml version="1.0" encoding="utf-8"?>
 <?mso-contentType ?>
 <FormTemplates xmlns="http://schemas.microsoft.com/sharepoint/v3/contenttype/forms">
   <Display>DocumentLibraryForm</Display>
@@ -6828,7 +7149,143 @@
 </FormTemplates>
 </file>
 
+<file path=customXml/item2.xml><?xml version="1.0" encoding="utf-8"?>
+<p:properties xmlns:p="http://schemas.microsoft.com/office/2006/metadata/properties" xmlns:xsi="http://www.w3.org/2001/XMLSchema-instance" xmlns:pc="http://schemas.microsoft.com/office/infopath/2007/PartnerControls">
+  <documentManagement>
+    <_activity xmlns="16eb03e4-fe34-41e0-b148-6c2f228be8b6" xsi:nil="true"/>
+  </documentManagement>
+</p:properties>
+</file>
+
 <file path=customXml/item3.xml><?xml version="1.0" encoding="utf-8"?>
+<b:Sources xmlns:b="http://schemas.openxmlformats.org/officeDocument/2006/bibliography" xmlns="http://schemas.openxmlformats.org/officeDocument/2006/bibliography" SelectedStyle="\IEEE2006OfficeOnline.xsl" StyleName="IEEE" Version="2006">
+  <b:Source>
+    <b:Tag>Sto</b:Tag>
+    <b:SourceType>InternetSite</b:SourceType>
+    <b:Guid>{2B4BF2B4-2B0E-46EC-8A46-8D9494091BBA}</b:Guid>
+    <b:Title>#StopRansomware Guide</b:Title>
+    <b:ProductionCompany>Americas Cyber Defense Agency</b:ProductionCompany>
+    <b:URL>https://www.cisa.gov/stopransomware/ransomware-guide</b:URL>
+    <b:RefOrder>1</b:RefOrder>
+  </b:Source>
+  <b:Source>
+    <b:Tag>Ran</b:Tag>
+    <b:SourceType>InternetSite</b:SourceType>
+    <b:Guid>{472FD183-EF2C-470D-A6D1-9E653F75936C}</b:Guid>
+    <b:Title>Ransomware </b:Title>
+    <b:ProductionCompany>FBI</b:ProductionCompany>
+    <b:URL>https://www.fbi.gov/how-we-can-help-you/scams-and-safety/common-frauds-and-scams/ransomware</b:URL>
+    <b:RefOrder>2</b:RefOrder>
+  </b:Source>
+  <b:Source>
+    <b:Tag>Kur22</b:Tag>
+    <b:SourceType>InternetSite</b:SourceType>
+    <b:Guid>{45B254F4-2ED7-4796-9145-8DA52FF7374D}</b:Guid>
+    <b:Author>
+      <b:Author>
+        <b:NameList>
+          <b:Person>
+            <b:Last>Baker</b:Last>
+            <b:First>Kurt</b:First>
+          </b:Person>
+        </b:NameList>
+      </b:Author>
+    </b:Author>
+    <b:Title>History of Ransomware</b:Title>
+    <b:ProductionCompany>CrowdStrike</b:ProductionCompany>
+    <b:Year>2022</b:Year>
+    <b:Month>10</b:Month>
+    <b:Day>09</b:Day>
+    <b:URL>https://www.crowdstrike.com/en-us/cybersecurity-101/ransomware/history-of-ransomware/</b:URL>
+    <b:RefOrder>3</b:RefOrder>
+  </b:Source>
+  <b:Source>
+    <b:Tag>Bot</b:Tag>
+    <b:SourceType>InternetSite</b:SourceType>
+    <b:Guid>{20B2E95D-A0FA-4944-85FB-E71D64664F65}</b:Guid>
+    <b:Title>Botnet</b:Title>
+    <b:ProductionCompany>Eset</b:ProductionCompany>
+    <b:URL>https://help.eset.com/glossary/bg-BG/botnet.html</b:URL>
+    <b:RefOrder>4</b:RefOrder>
+  </b:Source>
+  <b:Source>
+    <b:Tag>CCS</b:Tag>
+    <b:SourceType>InternetSite</b:SourceType>
+    <b:Guid>{F37D6060-4B83-48F8-ADC6-94648278B6D6}</b:Guid>
+    <b:Title>CC Server</b:Title>
+    <b:ProductionCompany>Eset</b:ProductionCompany>
+    <b:URL>https://help.eset.com/glossary/bg-BG/cc_server.html</b:URL>
+    <b:RefOrder>5</b:RefOrder>
+  </b:Source>
+  <b:Source>
+    <b:Tag>Фил20</b:Tag>
+    <b:SourceType>InternetSite</b:SourceType>
+    <b:Guid>{D0ACEC89-B82E-4903-BDB0-FD382F8077D3}</b:Guid>
+    <b:Author>
+      <b:Author>
+        <b:NameList>
+          <b:Person>
+            <b:Last>Петров</b:Last>
+            <b:First>Филип</b:First>
+          </b:Person>
+        </b:NameList>
+      </b:Author>
+    </b:Author>
+    <b:Title>RSA</b:Title>
+    <b:Year>2020</b:Year>
+    <b:Month>02</b:Month>
+    <b:Day>16</b:Day>
+    <b:URL>https://www.cphpvb.net/network-security/10840-rsa-with-example/</b:URL>
+    <b:RefOrder>6</b:RefOrder>
+  </b:Source>
+  <b:Source>
+    <b:Tag>Wha25</b:Tag>
+    <b:SourceType>InternetSite</b:SourceType>
+    <b:Guid>{5B16835C-9C43-4285-BAF5-D4B2F3F24F90}</b:Guid>
+    <b:Title>What is RSA Asymmetric Encryption? How Does it Work?</b:Title>
+    <b:ProductionCompany>Secure W2</b:ProductionCompany>
+    <b:Year>2025</b:Year>
+    <b:Month>09</b:Month>
+    <b:Day>15</b:Day>
+    <b:URL>https://www.securew2.com/blog/what-is-rsa-asymmetric-encryption</b:URL>
+    <b:RefOrder>7</b:RefOrder>
+  </b:Source>
+  <b:Source>
+    <b:Tag>arc</b:Tag>
+    <b:SourceType>InternetSite</b:SourceType>
+    <b:Guid>{B1A9D737-2102-49C1-98B1-5A289956686D}</b:Guid>
+    <b:Title>archiveus-trojan</b:Title>
+    <b:ProductionCompany>Knowbe4</b:ProductionCompany>
+    <b:URL>https://www.knowbe4.com/ransomware-knowledgebase/archiveus-trojan</b:URL>
+    <b:RefOrder>8</b:RefOrder>
+  </b:Source>
+  <b:Source>
+    <b:Tag>Spe</b:Tag>
+    <b:SourceType>InternetSite</b:SourceType>
+    <b:Guid>{AC188D98-B7F5-4E78-BC9F-61D0C37525B1}</b:Guid>
+    <b:Title>Spear phishing</b:Title>
+    <b:ProductionCompany>Ibm</b:ProductionCompany>
+    <b:URL>https://www.ibm.com/think/topics/spear-phishing</b:URL>
+    <b:Author>
+      <b:Author>
+        <b:Corporate>Matthew Kosinski</b:Corporate>
+      </b:Author>
+    </b:Author>
+    <b:RefOrder>9</b:RefOrder>
+  </b:Source>
+  <b:Source>
+    <b:Tag>Gpc</b:Tag>
+    <b:SourceType>InternetSite</b:SourceType>
+    <b:Guid>{327CB1AD-525D-4623-BC38-89F7CF280C15}</b:Guid>
+    <b:Title>Gpcode</b:Title>
+    <b:ProductionCompany>Knowbe4</b:ProductionCompany>
+    <b:URL>https://www.knowbe4.com/ransomware-knowledgebase/gpcode</b:URL>
+    <b:RefOrder>10</b:RefOrder>
+  </b:Source>
+</b:Sources>
+</file>
+
+<file path=customXml/item4.xml><?xml version="1.0" encoding="utf-8"?>
 <ct:contentTypeSchema xmlns:ct="http://schemas.microsoft.com/office/2006/metadata/contentType" xmlns:ma="http://schemas.microsoft.com/office/2006/metadata/properties/metaAttributes" ct:_="" ma:_="" ma:contentTypeName="Document" ma:contentTypeID="0x010100EA7F95447AE5CD4A96E24D58484FA3D2" ma:contentTypeVersion="9" ma:contentTypeDescription="Create a new document." ma:contentTypeScope="" ma:versionID="152a1f3b266b5df558eb501d08fa54b7">
   <xsd:schema xmlns:xsd="http://www.w3.org/2001/XMLSchema" xmlns:xs="http://www.w3.org/2001/XMLSchema" xmlns:p="http://schemas.microsoft.com/office/2006/metadata/properties" xmlns:ns3="16eb03e4-fe34-41e0-b148-6c2f228be8b6" xmlns:ns4="c5dcd230-26b3-4f1e-a7d8-2c2a40be033b" targetNamespace="http://schemas.microsoft.com/office/2006/metadata/properties" ma:root="true" ma:fieldsID="ebbaa98d623378dfae11ad7cf338cc80" ns3:_="" ns4:_="">
     <xsd:import namespace="16eb03e4-fe34-41e0-b148-6c2f228be8b6"/>
@@ -7023,135 +7480,15 @@
 </ct:contentTypeSchema>
 </file>
 
-<file path=customXml/item4.xml><?xml version="1.0" encoding="utf-8"?>
-<b:Sources xmlns:b="http://schemas.openxmlformats.org/officeDocument/2006/bibliography" xmlns="http://schemas.openxmlformats.org/officeDocument/2006/bibliography" SelectedStyle="\IEEE2006OfficeOnline.xsl" StyleName="IEEE" Version="2006">
-  <b:Source>
-    <b:Tag>Sto</b:Tag>
-    <b:SourceType>InternetSite</b:SourceType>
-    <b:Guid>{2B4BF2B4-2B0E-46EC-8A46-8D9494091BBA}</b:Guid>
-    <b:Title>#StopRansomware Guide</b:Title>
-    <b:ProductionCompany>Americas Cyber Defense Agency</b:ProductionCompany>
-    <b:URL>https://www.cisa.gov/stopransomware/ransomware-guide</b:URL>
-    <b:RefOrder>1</b:RefOrder>
-  </b:Source>
-  <b:Source>
-    <b:Tag>Ran</b:Tag>
-    <b:SourceType>InternetSite</b:SourceType>
-    <b:Guid>{472FD183-EF2C-470D-A6D1-9E653F75936C}</b:Guid>
-    <b:Title>Ransomware </b:Title>
-    <b:ProductionCompany>FBI</b:ProductionCompany>
-    <b:URL>https://www.fbi.gov/how-we-can-help-you/scams-and-safety/common-frauds-and-scams/ransomware</b:URL>
-    <b:RefOrder>2</b:RefOrder>
-  </b:Source>
-  <b:Source>
-    <b:Tag>Kur22</b:Tag>
-    <b:SourceType>InternetSite</b:SourceType>
-    <b:Guid>{45B254F4-2ED7-4796-9145-8DA52FF7374D}</b:Guid>
-    <b:Author>
-      <b:Author>
-        <b:NameList>
-          <b:Person>
-            <b:Last>Baker</b:Last>
-            <b:First>Kurt</b:First>
-          </b:Person>
-        </b:NameList>
-      </b:Author>
-    </b:Author>
-    <b:Title>History of Ransomware</b:Title>
-    <b:ProductionCompany>CrowdStrike</b:ProductionCompany>
-    <b:Year>2022</b:Year>
-    <b:Month>10</b:Month>
-    <b:Day>09</b:Day>
-    <b:URL>https://www.crowdstrike.com/en-us/cybersecurity-101/ransomware/history-of-ransomware/</b:URL>
-    <b:RefOrder>3</b:RefOrder>
-  </b:Source>
-  <b:Source>
-    <b:Tag>Bot</b:Tag>
-    <b:SourceType>InternetSite</b:SourceType>
-    <b:Guid>{20B2E95D-A0FA-4944-85FB-E71D64664F65}</b:Guid>
-    <b:Title>Botnet</b:Title>
-    <b:ProductionCompany>Eset</b:ProductionCompany>
-    <b:URL>https://help.eset.com/glossary/bg-BG/botnet.html</b:URL>
-    <b:RefOrder>4</b:RefOrder>
-  </b:Source>
-  <b:Source>
-    <b:Tag>CCS</b:Tag>
-    <b:SourceType>InternetSite</b:SourceType>
-    <b:Guid>{F37D6060-4B83-48F8-ADC6-94648278B6D6}</b:Guid>
-    <b:Title>CC Server</b:Title>
-    <b:ProductionCompany>Eset</b:ProductionCompany>
-    <b:URL>https://help.eset.com/glossary/bg-BG/cc_server.html</b:URL>
-    <b:RefOrder>5</b:RefOrder>
-  </b:Source>
-  <b:Source>
-    <b:Tag>Фил20</b:Tag>
-    <b:SourceType>InternetSite</b:SourceType>
-    <b:Guid>{D0ACEC89-B82E-4903-BDB0-FD382F8077D3}</b:Guid>
-    <b:Author>
-      <b:Author>
-        <b:NameList>
-          <b:Person>
-            <b:Last>Петров</b:Last>
-            <b:First>Филип</b:First>
-          </b:Person>
-        </b:NameList>
-      </b:Author>
-    </b:Author>
-    <b:Title>RSA</b:Title>
-    <b:Year>2020</b:Year>
-    <b:Month>02</b:Month>
-    <b:Day>16</b:Day>
-    <b:URL>https://www.cphpvb.net/network-security/10840-rsa-with-example/</b:URL>
-    <b:RefOrder>6</b:RefOrder>
-  </b:Source>
-  <b:Source>
-    <b:Tag>Wha25</b:Tag>
-    <b:SourceType>InternetSite</b:SourceType>
-    <b:Guid>{5B16835C-9C43-4285-BAF5-D4B2F3F24F90}</b:Guid>
-    <b:Title>What is RSA Asymmetric Encryption? How Does it Work?</b:Title>
-    <b:ProductionCompany>Secure W2</b:ProductionCompany>
-    <b:Year>2025</b:Year>
-    <b:Month>09</b:Month>
-    <b:Day>15</b:Day>
-    <b:URL>https://www.securew2.com/blog/what-is-rsa-asymmetric-encryption</b:URL>
-    <b:RefOrder>7</b:RefOrder>
-  </b:Source>
-  <b:Source>
-    <b:Tag>arc</b:Tag>
-    <b:SourceType>InternetSite</b:SourceType>
-    <b:Guid>{B1A9D737-2102-49C1-98B1-5A289956686D}</b:Guid>
-    <b:Title>archiveus-trojan</b:Title>
-    <b:ProductionCompany>Knowbe4</b:ProductionCompany>
-    <b:URL>https://www.knowbe4.com/ransomware-knowledgebase/archiveus-trojan</b:URL>
-    <b:RefOrder>8</b:RefOrder>
-  </b:Source>
-  <b:Source>
-    <b:Tag>Spe</b:Tag>
-    <b:SourceType>InternetSite</b:SourceType>
-    <b:Guid>{AC188D98-B7F5-4E78-BC9F-61D0C37525B1}</b:Guid>
-    <b:Title>Spear phishing</b:Title>
-    <b:ProductionCompany>Ibm</b:ProductionCompany>
-    <b:URL>https://www.ibm.com/think/topics/spear-phishing</b:URL>
-    <b:Author>
-      <b:Author>
-        <b:Corporate>Matthew Kosinski</b:Corporate>
-      </b:Author>
-    </b:Author>
-    <b:RefOrder>9</b:RefOrder>
-  </b:Source>
-  <b:Source>
-    <b:Tag>Gpc</b:Tag>
-    <b:SourceType>InternetSite</b:SourceType>
-    <b:Guid>{327CB1AD-525D-4623-BC38-89F7CF280C15}</b:Guid>
-    <b:Title>Gpcode</b:Title>
-    <b:ProductionCompany>Knowbe4</b:ProductionCompany>
-    <b:URL>https://www.knowbe4.com/ransomware-knowledgebase/gpcode</b:URL>
-    <b:RefOrder>10</b:RefOrder>
-  </b:Source>
-</b:Sources>
+<file path=customXml/itemProps1.xml><?xml version="1.0" encoding="utf-8"?>
+<ds:datastoreItem xmlns:ds="http://schemas.openxmlformats.org/officeDocument/2006/customXml" ds:itemID="{95434D9A-8BA9-420D-93D1-CF746F074EA1}">
+  <ds:schemaRefs>
+    <ds:schemaRef ds:uri="http://schemas.microsoft.com/sharepoint/v3/contenttype/forms"/>
+  </ds:schemaRefs>
+</ds:datastoreItem>
 </file>
 
-<file path=customXml/itemProps1.xml><?xml version="1.0" encoding="utf-8"?>
+<file path=customXml/itemProps2.xml><?xml version="1.0" encoding="utf-8"?>
 <ds:datastoreItem xmlns:ds="http://schemas.openxmlformats.org/officeDocument/2006/customXml" ds:itemID="{6C2A65B6-C891-4DE3-96AA-342988F8CBF9}">
   <ds:schemaRefs>
     <ds:schemaRef ds:uri="http://schemas.microsoft.com/office/2006/metadata/properties"/>
@@ -7161,15 +7498,15 @@
 </ds:datastoreItem>
 </file>
 
-<file path=customXml/itemProps2.xml><?xml version="1.0" encoding="utf-8"?>
-<ds:datastoreItem xmlns:ds="http://schemas.openxmlformats.org/officeDocument/2006/customXml" ds:itemID="{95434D9A-8BA9-420D-93D1-CF746F074EA1}">
+<file path=customXml/itemProps3.xml><?xml version="1.0" encoding="utf-8"?>
+<ds:datastoreItem xmlns:ds="http://schemas.openxmlformats.org/officeDocument/2006/customXml" ds:itemID="{9EC5290A-2DE6-49DB-A151-226064C42EFF}">
   <ds:schemaRefs>
-    <ds:schemaRef ds:uri="http://schemas.microsoft.com/sharepoint/v3/contenttype/forms"/>
+    <ds:schemaRef ds:uri="http://schemas.openxmlformats.org/officeDocument/2006/bibliography"/>
   </ds:schemaRefs>
 </ds:datastoreItem>
 </file>
 
-<file path=customXml/itemProps3.xml><?xml version="1.0" encoding="utf-8"?>
+<file path=customXml/itemProps4.xml><?xml version="1.0" encoding="utf-8"?>
 <ds:datastoreItem xmlns:ds="http://schemas.openxmlformats.org/officeDocument/2006/customXml" ds:itemID="{EC25E0E9-ED1E-4DED-B1D8-B99F35F6AB52}">
   <ds:schemaRefs>
     <ds:schemaRef ds:uri="http://schemas.microsoft.com/office/2006/metadata/contentType"/>
@@ -7188,14 +7525,6 @@
 </ds:datastoreItem>
 </file>
 
-<file path=customXml/itemProps4.xml><?xml version="1.0" encoding="utf-8"?>
-<ds:datastoreItem xmlns:ds="http://schemas.openxmlformats.org/officeDocument/2006/customXml" ds:itemID="{9EC5290A-2DE6-49DB-A151-226064C42EFF}">
-  <ds:schemaRefs>
-    <ds:schemaRef ds:uri="http://schemas.openxmlformats.org/officeDocument/2006/bibliography"/>
-  </ds:schemaRefs>
-</ds:datastoreItem>
-</file>
-
 <file path=docMetadata/LabelInfo.xml><?xml version="1.0" encoding="utf-8"?>
 <clbl:labelList xmlns:clbl="http://schemas.microsoft.com/office/2020/mipLabelMetadata">
   <clbl:label id="{0cf7ac0a-4681-4823-ab0b-04ef02c5f873}" enabled="1" method="Standard" siteId="{42f7676c-f455-423c-82f6-dc2d99791af7}" contentBits="0" removed="0"/>

</xml_diff>

<commit_message>
final doc before revision
</commit_message>
<xml_diff>
--- a/Ransomware.docx
+++ b/Ransomware.docx
@@ -284,11 +284,9 @@
           <w:kern w:val="0"/>
           <w:sz w:val="48"/>
           <w:szCs w:val="48"/>
-          <w:lang w:val="en-US"/>
           <w14:ligatures w14:val="none"/>
         </w:rPr>
       </w:pPr>
-      <w:proofErr w:type="spellStart"/>
       <w:r>
         <w:rPr>
           <w:rFonts w:eastAsia="Times New Roman" w:cs="Times New Roman"/>
@@ -297,12 +295,11 @@
           <w:kern w:val="0"/>
           <w:sz w:val="48"/>
           <w:szCs w:val="48"/>
-          <w:lang w:val="en-US"/>
           <w14:ligatures w14:val="none"/>
         </w:rPr>
-        <w:t>Какво</w:t>
-      </w:r>
-      <w:proofErr w:type="spellEnd"/>
+        <w:t xml:space="preserve">Какво представлява </w:t>
+      </w:r>
+      <w:proofErr w:type="spellStart"/>
       <w:r>
         <w:rPr>
           <w:rFonts w:eastAsia="Times New Roman" w:cs="Times New Roman"/>
@@ -311,12 +308,11 @@
           <w:kern w:val="0"/>
           <w:sz w:val="48"/>
           <w:szCs w:val="48"/>
-          <w:lang w:val="en-US"/>
           <w14:ligatures w14:val="none"/>
         </w:rPr>
-        <w:t xml:space="preserve"> </w:t>
-      </w:r>
-      <w:proofErr w:type="spellStart"/>
+        <w:t>ransomware</w:t>
+      </w:r>
+      <w:proofErr w:type="spellEnd"/>
       <w:r>
         <w:rPr>
           <w:rFonts w:eastAsia="Times New Roman" w:cs="Times New Roman"/>
@@ -325,12 +321,11 @@
           <w:kern w:val="0"/>
           <w:sz w:val="48"/>
           <w:szCs w:val="48"/>
-          <w:lang w:val="en-US"/>
           <w14:ligatures w14:val="none"/>
         </w:rPr>
-        <w:t>представлява</w:t>
-      </w:r>
-      <w:proofErr w:type="spellEnd"/>
+        <w:t xml:space="preserve">? Стратегии и защита от </w:t>
+      </w:r>
+      <w:proofErr w:type="spellStart"/>
       <w:r>
         <w:rPr>
           <w:rFonts w:eastAsia="Times New Roman" w:cs="Times New Roman"/>
@@ -339,12 +334,11 @@
           <w:kern w:val="0"/>
           <w:sz w:val="48"/>
           <w:szCs w:val="48"/>
-          <w:lang w:val="en-US"/>
           <w14:ligatures w14:val="none"/>
         </w:rPr>
-        <w:t xml:space="preserve"> ransomware? </w:t>
-      </w:r>
-      <w:proofErr w:type="spellStart"/>
+        <w:t>ransomware</w:t>
+      </w:r>
+      <w:proofErr w:type="spellEnd"/>
       <w:r>
         <w:rPr>
           <w:rFonts w:eastAsia="Times New Roman" w:cs="Times New Roman"/>
@@ -353,80 +347,9 @@
           <w:kern w:val="0"/>
           <w:sz w:val="48"/>
           <w:szCs w:val="48"/>
-          <w:lang w:val="en-US"/>
           <w14:ligatures w14:val="none"/>
         </w:rPr>
-        <w:t>Стратегии</w:t>
-      </w:r>
-      <w:proofErr w:type="spellEnd"/>
-      <w:r>
-        <w:rPr>
-          <w:rFonts w:eastAsia="Times New Roman" w:cs="Times New Roman"/>
-          <w:b/>
-          <w:bCs/>
-          <w:kern w:val="0"/>
-          <w:sz w:val="48"/>
-          <w:szCs w:val="48"/>
-          <w:lang w:val="en-US"/>
-          <w14:ligatures w14:val="none"/>
-        </w:rPr>
-        <w:t xml:space="preserve"> и </w:t>
-      </w:r>
-      <w:proofErr w:type="spellStart"/>
-      <w:r>
-        <w:rPr>
-          <w:rFonts w:eastAsia="Times New Roman" w:cs="Times New Roman"/>
-          <w:b/>
-          <w:bCs/>
-          <w:kern w:val="0"/>
-          <w:sz w:val="48"/>
-          <w:szCs w:val="48"/>
-          <w:lang w:val="en-US"/>
-          <w14:ligatures w14:val="none"/>
-        </w:rPr>
-        <w:t>защита</w:t>
-      </w:r>
-      <w:proofErr w:type="spellEnd"/>
-      <w:r>
-        <w:rPr>
-          <w:rFonts w:eastAsia="Times New Roman" w:cs="Times New Roman"/>
-          <w:b/>
-          <w:bCs/>
-          <w:kern w:val="0"/>
-          <w:sz w:val="48"/>
-          <w:szCs w:val="48"/>
-          <w:lang w:val="en-US"/>
-          <w14:ligatures w14:val="none"/>
-        </w:rPr>
-        <w:t xml:space="preserve"> </w:t>
-      </w:r>
-      <w:proofErr w:type="spellStart"/>
-      <w:r>
-        <w:rPr>
-          <w:rFonts w:eastAsia="Times New Roman" w:cs="Times New Roman"/>
-          <w:b/>
-          <w:bCs/>
-          <w:kern w:val="0"/>
-          <w:sz w:val="48"/>
-          <w:szCs w:val="48"/>
-          <w:lang w:val="en-US"/>
-          <w14:ligatures w14:val="none"/>
-        </w:rPr>
-        <w:t>от</w:t>
-      </w:r>
-      <w:proofErr w:type="spellEnd"/>
-      <w:r>
-        <w:rPr>
-          <w:rFonts w:eastAsia="Times New Roman" w:cs="Times New Roman"/>
-          <w:b/>
-          <w:bCs/>
-          <w:kern w:val="0"/>
-          <w:sz w:val="48"/>
-          <w:szCs w:val="48"/>
-          <w:lang w:val="en-US"/>
-          <w14:ligatures w14:val="none"/>
-        </w:rPr>
-        <w:t xml:space="preserve"> ransomware.</w:t>
+        <w:t>.</w:t>
       </w:r>
     </w:p>
     <w:p>
@@ -668,7 +591,7 @@
             <w:rPr>
               <w:rFonts w:asciiTheme="minorHAnsi" w:eastAsiaTheme="minorEastAsia" w:hAnsiTheme="minorHAnsi"/>
               <w:noProof/>
-              <w:lang w:val="en-US"/>
+              <w:lang w:eastAsia="bg-BG"/>
             </w:rPr>
           </w:pPr>
           <w:r>
@@ -680,7 +603,7 @@
           <w:r>
             <w:fldChar w:fldCharType="separate"/>
           </w:r>
-          <w:hyperlink w:anchor="_Toc223385505" w:history="1">
+          <w:hyperlink w:anchor="_Toc223468464" w:history="1">
             <w:r>
               <w:rPr>
                 <w:rStyle w:val="Hyperlink"/>
@@ -708,7 +631,7 @@
                 <w:noProof/>
                 <w:webHidden/>
               </w:rPr>
-              <w:instrText xml:space="preserve"> PAGEREF _Toc223385505 \h </w:instrText>
+              <w:instrText xml:space="preserve"> PAGEREF _Toc223468464 \h </w:instrText>
             </w:r>
             <w:r>
               <w:rPr>
@@ -748,10 +671,10 @@
             <w:rPr>
               <w:rFonts w:asciiTheme="minorHAnsi" w:eastAsiaTheme="minorEastAsia" w:hAnsiTheme="minorHAnsi"/>
               <w:noProof/>
-              <w:lang w:val="en-US"/>
+              <w:lang w:eastAsia="bg-BG"/>
             </w:rPr>
           </w:pPr>
-          <w:hyperlink w:anchor="_Toc223385506" w:history="1">
+          <w:hyperlink w:anchor="_Toc223468465" w:history="1">
             <w:r>
               <w:rPr>
                 <w:rStyle w:val="Hyperlink"/>
@@ -786,7 +709,7 @@
                 <w:noProof/>
                 <w:webHidden/>
               </w:rPr>
-              <w:instrText xml:space="preserve"> PAGEREF _Toc223385506 \h </w:instrText>
+              <w:instrText xml:space="preserve"> PAGEREF _Toc223468465 \h </w:instrText>
             </w:r>
             <w:r>
               <w:rPr>
@@ -826,10 +749,10 @@
             <w:rPr>
               <w:rFonts w:asciiTheme="minorHAnsi" w:eastAsiaTheme="minorEastAsia" w:hAnsiTheme="minorHAnsi"/>
               <w:noProof/>
-              <w:lang w:val="en-US"/>
+              <w:lang w:eastAsia="bg-BG"/>
             </w:rPr>
           </w:pPr>
-          <w:hyperlink w:anchor="_Toc223385507" w:history="1">
+          <w:hyperlink w:anchor="_Toc223468466" w:history="1">
             <w:r>
               <w:rPr>
                 <w:rStyle w:val="Hyperlink"/>
@@ -864,7 +787,7 @@
                 <w:noProof/>
                 <w:webHidden/>
               </w:rPr>
-              <w:instrText xml:space="preserve"> PAGEREF _Toc223385507 \h </w:instrText>
+              <w:instrText xml:space="preserve"> PAGEREF _Toc223468466 \h </w:instrText>
             </w:r>
             <w:r>
               <w:rPr>
@@ -905,10 +828,10 @@
             <w:rPr>
               <w:rFonts w:asciiTheme="minorHAnsi" w:eastAsiaTheme="minorEastAsia" w:hAnsiTheme="minorHAnsi"/>
               <w:noProof/>
-              <w:lang w:val="en-US"/>
+              <w:lang w:eastAsia="bg-BG"/>
             </w:rPr>
           </w:pPr>
-          <w:hyperlink w:anchor="_Toc223385508" w:history="1">
+          <w:hyperlink w:anchor="_Toc223468467" w:history="1">
             <w:r>
               <w:rPr>
                 <w:rStyle w:val="Hyperlink"/>
@@ -920,34 +843,34 @@
               <w:rPr>
                 <w:rFonts w:asciiTheme="minorHAnsi" w:eastAsiaTheme="minorEastAsia" w:hAnsiTheme="minorHAnsi"/>
                 <w:noProof/>
+                <w:lang w:eastAsia="bg-BG"/>
+              </w:rPr>
+              <w:tab/>
+            </w:r>
+            <w:r>
+              <w:rPr>
+                <w:rStyle w:val="Hyperlink"/>
+                <w:noProof/>
+              </w:rPr>
+              <w:t xml:space="preserve">Ранна фаза на </w:t>
+            </w:r>
+            <w:r>
+              <w:rPr>
+                <w:rStyle w:val="Hyperlink"/>
+                <w:noProof/>
                 <w:lang w:val="en-US"/>
               </w:rPr>
+              <w:t>Ransomware</w:t>
+            </w:r>
+            <w:r>
+              <w:rPr>
+                <w:noProof/>
+                <w:webHidden/>
+              </w:rPr>
               <w:tab/>
             </w:r>
             <w:r>
               <w:rPr>
-                <w:rStyle w:val="Hyperlink"/>
-                <w:noProof/>
-              </w:rPr>
-              <w:t xml:space="preserve">Ранна фаза на </w:t>
-            </w:r>
-            <w:r>
-              <w:rPr>
-                <w:rStyle w:val="Hyperlink"/>
-                <w:noProof/>
-                <w:lang w:val="en-US"/>
-              </w:rPr>
-              <w:t>Ransomware</w:t>
-            </w:r>
-            <w:r>
-              <w:rPr>
-                <w:noProof/>
-                <w:webHidden/>
-              </w:rPr>
-              <w:tab/>
-            </w:r>
-            <w:r>
-              <w:rPr>
                 <w:noProof/>
                 <w:webHidden/>
               </w:rPr>
@@ -958,7 +881,7 @@
                 <w:noProof/>
                 <w:webHidden/>
               </w:rPr>
-              <w:instrText xml:space="preserve"> PAGEREF _Toc223385508 \h </w:instrText>
+              <w:instrText xml:space="preserve"> PAGEREF _Toc223468467 \h </w:instrText>
             </w:r>
             <w:r>
               <w:rPr>
@@ -999,10 +922,10 @@
             <w:rPr>
               <w:rFonts w:asciiTheme="minorHAnsi" w:eastAsiaTheme="minorEastAsia" w:hAnsiTheme="minorHAnsi"/>
               <w:noProof/>
-              <w:lang w:val="en-US"/>
+              <w:lang w:eastAsia="bg-BG"/>
             </w:rPr>
           </w:pPr>
-          <w:hyperlink w:anchor="_Toc223385509" w:history="1">
+          <w:hyperlink w:anchor="_Toc223468468" w:history="1">
             <w:r>
               <w:rPr>
                 <w:rStyle w:val="Hyperlink"/>
@@ -1014,49 +937,49 @@
               <w:rPr>
                 <w:rFonts w:asciiTheme="minorHAnsi" w:eastAsiaTheme="minorEastAsia" w:hAnsiTheme="minorHAnsi"/>
                 <w:noProof/>
+                <w:lang w:eastAsia="bg-BG"/>
+              </w:rPr>
+              <w:tab/>
+            </w:r>
+            <w:r>
+              <w:rPr>
+                <w:rStyle w:val="Hyperlink"/>
+                <w:noProof/>
                 <w:lang w:val="en-US"/>
               </w:rPr>
+              <w:t>Ransomware</w:t>
+            </w:r>
+            <w:r>
+              <w:rPr>
+                <w:rStyle w:val="Hyperlink"/>
+                <w:noProof/>
+              </w:rPr>
+              <w:t xml:space="preserve"> използващ </w:t>
+            </w:r>
+            <w:r>
+              <w:rPr>
+                <w:rStyle w:val="Hyperlink"/>
+                <w:noProof/>
+                <w:lang w:val="en-US"/>
+              </w:rPr>
+              <w:t>RSA</w:t>
+            </w:r>
+            <w:r>
+              <w:rPr>
+                <w:rStyle w:val="Hyperlink"/>
+                <w:noProof/>
+              </w:rPr>
+              <w:t xml:space="preserve"> криптиране</w:t>
+            </w:r>
+            <w:r>
+              <w:rPr>
+                <w:noProof/>
+                <w:webHidden/>
+              </w:rPr>
               <w:tab/>
             </w:r>
             <w:r>
               <w:rPr>
-                <w:rStyle w:val="Hyperlink"/>
-                <w:noProof/>
-                <w:lang w:val="en-US"/>
-              </w:rPr>
-              <w:t>Ransomware</w:t>
-            </w:r>
-            <w:r>
-              <w:rPr>
-                <w:rStyle w:val="Hyperlink"/>
-                <w:noProof/>
-              </w:rPr>
-              <w:t xml:space="preserve"> използващ </w:t>
-            </w:r>
-            <w:r>
-              <w:rPr>
-                <w:rStyle w:val="Hyperlink"/>
-                <w:noProof/>
-                <w:lang w:val="en-US"/>
-              </w:rPr>
-              <w:t>RSA</w:t>
-            </w:r>
-            <w:r>
-              <w:rPr>
-                <w:rStyle w:val="Hyperlink"/>
-                <w:noProof/>
-              </w:rPr>
-              <w:t xml:space="preserve"> криптиране</w:t>
-            </w:r>
-            <w:r>
-              <w:rPr>
-                <w:noProof/>
-                <w:webHidden/>
-              </w:rPr>
-              <w:tab/>
-            </w:r>
-            <w:r>
-              <w:rPr>
                 <w:noProof/>
                 <w:webHidden/>
               </w:rPr>
@@ -1067,7 +990,7 @@
                 <w:noProof/>
                 <w:webHidden/>
               </w:rPr>
-              <w:instrText xml:space="preserve"> PAGEREF _Toc223385509 \h </w:instrText>
+              <w:instrText xml:space="preserve"> PAGEREF _Toc223468468 \h </w:instrText>
             </w:r>
             <w:r>
               <w:rPr>
@@ -1108,10 +1031,10 @@
             <w:rPr>
               <w:rFonts w:asciiTheme="minorHAnsi" w:eastAsiaTheme="minorEastAsia" w:hAnsiTheme="minorHAnsi"/>
               <w:noProof/>
-              <w:lang w:val="en-US"/>
+              <w:lang w:eastAsia="bg-BG"/>
             </w:rPr>
           </w:pPr>
-          <w:hyperlink w:anchor="_Toc223385510" w:history="1">
+          <w:hyperlink w:anchor="_Toc223468469" w:history="1">
             <w:r>
               <w:rPr>
                 <w:rStyle w:val="Hyperlink"/>
@@ -1124,27 +1047,27 @@
               <w:rPr>
                 <w:rFonts w:asciiTheme="minorHAnsi" w:eastAsiaTheme="minorEastAsia" w:hAnsiTheme="minorHAnsi"/>
                 <w:noProof/>
+                <w:lang w:eastAsia="bg-BG"/>
+              </w:rPr>
+              <w:tab/>
+            </w:r>
+            <w:r>
+              <w:rPr>
+                <w:rStyle w:val="Hyperlink"/>
+                <w:noProof/>
                 <w:lang w:val="en-US"/>
               </w:rPr>
+              <w:t>Spear phishing Ransomware</w:t>
+            </w:r>
+            <w:r>
+              <w:rPr>
+                <w:noProof/>
+                <w:webHidden/>
+              </w:rPr>
               <w:tab/>
             </w:r>
             <w:r>
               <w:rPr>
-                <w:rStyle w:val="Hyperlink"/>
-                <w:noProof/>
-                <w:lang w:val="en-US"/>
-              </w:rPr>
-              <w:t>Spear phishing Ransomware</w:t>
-            </w:r>
-            <w:r>
-              <w:rPr>
-                <w:noProof/>
-                <w:webHidden/>
-              </w:rPr>
-              <w:tab/>
-            </w:r>
-            <w:r>
-              <w:rPr>
                 <w:noProof/>
                 <w:webHidden/>
               </w:rPr>
@@ -1155,7 +1078,7 @@
                 <w:noProof/>
                 <w:webHidden/>
               </w:rPr>
-              <w:instrText xml:space="preserve"> PAGEREF _Toc223385510 \h </w:instrText>
+              <w:instrText xml:space="preserve"> PAGEREF _Toc223468469 \h </w:instrText>
             </w:r>
             <w:r>
               <w:rPr>
@@ -1196,10 +1119,10 @@
             <w:rPr>
               <w:rFonts w:asciiTheme="minorHAnsi" w:eastAsiaTheme="minorEastAsia" w:hAnsiTheme="minorHAnsi"/>
               <w:noProof/>
-              <w:lang w:val="en-US"/>
+              <w:lang w:eastAsia="bg-BG"/>
             </w:rPr>
           </w:pPr>
-          <w:hyperlink w:anchor="_Toc223385511" w:history="1">
+          <w:hyperlink w:anchor="_Toc223468470" w:history="1">
             <w:r>
               <w:rPr>
                 <w:rStyle w:val="Hyperlink"/>
@@ -1212,49 +1135,49 @@
               <w:rPr>
                 <w:rFonts w:asciiTheme="minorHAnsi" w:eastAsiaTheme="minorEastAsia" w:hAnsiTheme="minorHAnsi"/>
                 <w:noProof/>
+                <w:lang w:eastAsia="bg-BG"/>
+              </w:rPr>
+              <w:tab/>
+            </w:r>
+            <w:r>
+              <w:rPr>
+                <w:rStyle w:val="Hyperlink"/>
+                <w:noProof/>
                 <w:lang w:val="en-US"/>
               </w:rPr>
+              <w:t>Ransomware</w:t>
+            </w:r>
+            <w:r>
+              <w:rPr>
+                <w:rStyle w:val="Hyperlink"/>
+                <w:noProof/>
+              </w:rPr>
+              <w:t xml:space="preserve"> в </w:t>
+            </w:r>
+            <w:r>
+              <w:rPr>
+                <w:rStyle w:val="Hyperlink"/>
+                <w:noProof/>
+                <w:lang w:val="en-US"/>
+              </w:rPr>
+              <w:t xml:space="preserve">Android </w:t>
+            </w:r>
+            <w:r>
+              <w:rPr>
+                <w:rStyle w:val="Hyperlink"/>
+                <w:noProof/>
+              </w:rPr>
+              <w:t>базирани системи</w:t>
+            </w:r>
+            <w:r>
+              <w:rPr>
+                <w:noProof/>
+                <w:webHidden/>
+              </w:rPr>
               <w:tab/>
             </w:r>
             <w:r>
               <w:rPr>
-                <w:rStyle w:val="Hyperlink"/>
-                <w:noProof/>
-                <w:lang w:val="en-US"/>
-              </w:rPr>
-              <w:t>Ransomware</w:t>
-            </w:r>
-            <w:r>
-              <w:rPr>
-                <w:rStyle w:val="Hyperlink"/>
-                <w:noProof/>
-              </w:rPr>
-              <w:t xml:space="preserve"> в </w:t>
-            </w:r>
-            <w:r>
-              <w:rPr>
-                <w:rStyle w:val="Hyperlink"/>
-                <w:noProof/>
-                <w:lang w:val="en-US"/>
-              </w:rPr>
-              <w:t xml:space="preserve">Android </w:t>
-            </w:r>
-            <w:r>
-              <w:rPr>
-                <w:rStyle w:val="Hyperlink"/>
-                <w:noProof/>
-              </w:rPr>
-              <w:t>базирани системи</w:t>
-            </w:r>
-            <w:r>
-              <w:rPr>
-                <w:noProof/>
-                <w:webHidden/>
-              </w:rPr>
-              <w:tab/>
-            </w:r>
-            <w:r>
-              <w:rPr>
                 <w:noProof/>
                 <w:webHidden/>
               </w:rPr>
@@ -1265,7 +1188,7 @@
                 <w:noProof/>
                 <w:webHidden/>
               </w:rPr>
-              <w:instrText xml:space="preserve"> PAGEREF _Toc223385511 \h </w:instrText>
+              <w:instrText xml:space="preserve"> PAGEREF _Toc223468470 \h </w:instrText>
             </w:r>
             <w:r>
               <w:rPr>
@@ -1306,10 +1229,10 @@
             <w:rPr>
               <w:rFonts w:asciiTheme="minorHAnsi" w:eastAsiaTheme="minorEastAsia" w:hAnsiTheme="minorHAnsi"/>
               <w:noProof/>
-              <w:lang w:val="en-US"/>
+              <w:lang w:eastAsia="bg-BG"/>
             </w:rPr>
           </w:pPr>
-          <w:hyperlink w:anchor="_Toc223385512" w:history="1">
+          <w:hyperlink w:anchor="_Toc223468471" w:history="1">
             <w:r>
               <w:rPr>
                 <w:rStyle w:val="Hyperlink"/>
@@ -1321,42 +1244,42 @@
               <w:rPr>
                 <w:rFonts w:asciiTheme="minorHAnsi" w:eastAsiaTheme="minorEastAsia" w:hAnsiTheme="minorHAnsi"/>
                 <w:noProof/>
+                <w:lang w:eastAsia="bg-BG"/>
+              </w:rPr>
+              <w:tab/>
+            </w:r>
+            <w:r>
+              <w:rPr>
+                <w:rStyle w:val="Hyperlink"/>
+                <w:noProof/>
                 <w:lang w:val="en-US"/>
               </w:rPr>
+              <w:t xml:space="preserve">Big Game Hunting (BGH) </w:t>
+            </w:r>
+            <w:r>
+              <w:rPr>
+                <w:rStyle w:val="Hyperlink"/>
+                <w:noProof/>
+              </w:rPr>
+              <w:t xml:space="preserve">и </w:t>
+            </w:r>
+            <w:r>
+              <w:rPr>
+                <w:rStyle w:val="Hyperlink"/>
+                <w:noProof/>
+                <w:lang w:val="en-US"/>
+              </w:rPr>
+              <w:t>Ransomware</w:t>
+            </w:r>
+            <w:r>
+              <w:rPr>
+                <w:noProof/>
+                <w:webHidden/>
+              </w:rPr>
               <w:tab/>
             </w:r>
             <w:r>
               <w:rPr>
-                <w:rStyle w:val="Hyperlink"/>
-                <w:noProof/>
-                <w:lang w:val="en-US"/>
-              </w:rPr>
-              <w:t xml:space="preserve">Big Game Hunting (BGH) </w:t>
-            </w:r>
-            <w:r>
-              <w:rPr>
-                <w:rStyle w:val="Hyperlink"/>
-                <w:noProof/>
-              </w:rPr>
-              <w:t xml:space="preserve">и </w:t>
-            </w:r>
-            <w:r>
-              <w:rPr>
-                <w:rStyle w:val="Hyperlink"/>
-                <w:noProof/>
-                <w:lang w:val="en-US"/>
-              </w:rPr>
-              <w:t>Ransomware</w:t>
-            </w:r>
-            <w:r>
-              <w:rPr>
-                <w:noProof/>
-                <w:webHidden/>
-              </w:rPr>
-              <w:tab/>
-            </w:r>
-            <w:r>
-              <w:rPr>
                 <w:noProof/>
                 <w:webHidden/>
               </w:rPr>
@@ -1367,7 +1290,7 @@
                 <w:noProof/>
                 <w:webHidden/>
               </w:rPr>
-              <w:instrText xml:space="preserve"> PAGEREF _Toc223385512 \h </w:instrText>
+              <w:instrText xml:space="preserve"> PAGEREF _Toc223468471 \h </w:instrText>
             </w:r>
             <w:r>
               <w:rPr>
@@ -1407,16 +1330,16 @@
             <w:rPr>
               <w:rFonts w:asciiTheme="minorHAnsi" w:eastAsiaTheme="minorEastAsia" w:hAnsiTheme="minorHAnsi"/>
               <w:noProof/>
-              <w:lang w:val="en-US"/>
+              <w:lang w:eastAsia="bg-BG"/>
             </w:rPr>
           </w:pPr>
-          <w:hyperlink w:anchor="_Toc223385513" w:history="1">
+          <w:hyperlink w:anchor="_Toc223468472" w:history="1">
             <w:r>
               <w:rPr>
                 <w:rStyle w:val="Hyperlink"/>
                 <w:noProof/>
               </w:rPr>
-              <w:t xml:space="preserve">Имплементация на </w:t>
+              <w:t xml:space="preserve">Ролята на </w:t>
             </w:r>
             <w:r>
               <w:rPr>
@@ -1424,10 +1347,32 @@
                 <w:noProof/>
                 <w:lang w:val="en-US"/>
               </w:rPr>
+              <w:t xml:space="preserve">AI </w:t>
+            </w:r>
+            <w:r>
+              <w:rPr>
+                <w:rStyle w:val="Hyperlink"/>
+                <w:noProof/>
+              </w:rPr>
+              <w:t xml:space="preserve">в </w:t>
+            </w:r>
+            <w:r>
+              <w:rPr>
+                <w:rStyle w:val="Hyperlink"/>
+                <w:noProof/>
+                <w:lang w:val="en-US"/>
+              </w:rPr>
               <w:t>Ransomware</w:t>
             </w:r>
             <w:r>
               <w:rPr>
+                <w:rStyle w:val="Hyperlink"/>
+                <w:noProof/>
+              </w:rPr>
+              <w:t xml:space="preserve"> атаките</w:t>
+            </w:r>
+            <w:r>
+              <w:rPr>
                 <w:noProof/>
                 <w:webHidden/>
               </w:rPr>
@@ -1445,7 +1390,7 @@
                 <w:noProof/>
                 <w:webHidden/>
               </w:rPr>
-              <w:instrText xml:space="preserve"> PAGEREF _Toc223385513 \h </w:instrText>
+              <w:instrText xml:space="preserve"> PAGEREF _Toc223468472 \h </w:instrText>
             </w:r>
             <w:r>
               <w:rPr>
@@ -1485,15 +1430,93 @@
             <w:rPr>
               <w:rFonts w:asciiTheme="minorHAnsi" w:eastAsiaTheme="minorEastAsia" w:hAnsiTheme="minorHAnsi"/>
               <w:noProof/>
-              <w:lang w:val="en-US"/>
+              <w:lang w:eastAsia="bg-BG"/>
             </w:rPr>
           </w:pPr>
-          <w:hyperlink w:anchor="_Toc223385514" w:history="1">
+          <w:hyperlink w:anchor="_Toc223468473" w:history="1">
             <w:r>
               <w:rPr>
                 <w:rStyle w:val="Hyperlink"/>
                 <w:noProof/>
               </w:rPr>
+              <w:t xml:space="preserve">Имплементация на </w:t>
+            </w:r>
+            <w:r>
+              <w:rPr>
+                <w:rStyle w:val="Hyperlink"/>
+                <w:noProof/>
+                <w:lang w:val="en-US"/>
+              </w:rPr>
+              <w:t>Ransomware</w:t>
+            </w:r>
+            <w:r>
+              <w:rPr>
+                <w:noProof/>
+                <w:webHidden/>
+              </w:rPr>
+              <w:tab/>
+            </w:r>
+            <w:r>
+              <w:rPr>
+                <w:noProof/>
+                <w:webHidden/>
+              </w:rPr>
+              <w:fldChar w:fldCharType="begin"/>
+            </w:r>
+            <w:r>
+              <w:rPr>
+                <w:noProof/>
+                <w:webHidden/>
+              </w:rPr>
+              <w:instrText xml:space="preserve"> PAGEREF _Toc223468473 \h </w:instrText>
+            </w:r>
+            <w:r>
+              <w:rPr>
+                <w:noProof/>
+                <w:webHidden/>
+              </w:rPr>
+            </w:r>
+            <w:r>
+              <w:rPr>
+                <w:noProof/>
+                <w:webHidden/>
+              </w:rPr>
+              <w:fldChar w:fldCharType="separate"/>
+            </w:r>
+            <w:r>
+              <w:rPr>
+                <w:noProof/>
+                <w:webHidden/>
+              </w:rPr>
+              <w:t>13</w:t>
+            </w:r>
+            <w:r>
+              <w:rPr>
+                <w:noProof/>
+                <w:webHidden/>
+              </w:rPr>
+              <w:fldChar w:fldCharType="end"/>
+            </w:r>
+          </w:hyperlink>
+        </w:p>
+        <w:p>
+          <w:pPr>
+            <w:pStyle w:val="TOC1"/>
+            <w:tabs>
+              <w:tab w:val="right" w:leader="dot" w:pos="9016"/>
+            </w:tabs>
+            <w:rPr>
+              <w:rFonts w:asciiTheme="minorHAnsi" w:eastAsiaTheme="minorEastAsia" w:hAnsiTheme="minorHAnsi"/>
+              <w:noProof/>
+              <w:lang w:eastAsia="bg-BG"/>
+            </w:rPr>
+          </w:pPr>
+          <w:hyperlink w:anchor="_Toc223468474" w:history="1">
+            <w:r>
+              <w:rPr>
+                <w:rStyle w:val="Hyperlink"/>
+                <w:noProof/>
+              </w:rPr>
               <w:t xml:space="preserve">Демонстрация на </w:t>
             </w:r>
             <w:r>
@@ -1523,7 +1546,7 @@
                 <w:noProof/>
                 <w:webHidden/>
               </w:rPr>
-              <w:instrText xml:space="preserve"> PAGEREF _Toc223385514 \h </w:instrText>
+              <w:instrText xml:space="preserve"> PAGEREF _Toc223468474 \h </w:instrText>
             </w:r>
             <w:r>
               <w:rPr>
@@ -1543,7 +1566,7 @@
                 <w:noProof/>
                 <w:webHidden/>
               </w:rPr>
-              <w:t>14</w:t>
+              <w:t>15</w:t>
             </w:r>
             <w:r>
               <w:rPr>
@@ -1563,10 +1586,10 @@
             <w:rPr>
               <w:rFonts w:asciiTheme="minorHAnsi" w:eastAsiaTheme="minorEastAsia" w:hAnsiTheme="minorHAnsi"/>
               <w:noProof/>
-              <w:lang w:val="en-US"/>
+              <w:lang w:eastAsia="bg-BG"/>
             </w:rPr>
           </w:pPr>
-          <w:hyperlink w:anchor="_Toc223385515" w:history="1">
+          <w:hyperlink w:anchor="_Toc223468475" w:history="1">
             <w:r>
               <w:rPr>
                 <w:rStyle w:val="Hyperlink"/>
@@ -1593,7 +1616,7 @@
                 <w:noProof/>
                 <w:webHidden/>
               </w:rPr>
-              <w:instrText xml:space="preserve"> PAGEREF _Toc223385515 \h </w:instrText>
+              <w:instrText xml:space="preserve"> PAGEREF _Toc223468475 \h </w:instrText>
             </w:r>
             <w:r>
               <w:rPr>
@@ -1613,7 +1636,7 @@
                 <w:noProof/>
                 <w:webHidden/>
               </w:rPr>
-              <w:t>14</w:t>
+              <w:t>15</w:t>
             </w:r>
             <w:r>
               <w:rPr>
@@ -1633,10 +1656,10 @@
             <w:rPr>
               <w:rFonts w:asciiTheme="minorHAnsi" w:eastAsiaTheme="minorEastAsia" w:hAnsiTheme="minorHAnsi"/>
               <w:noProof/>
-              <w:lang w:val="en-US"/>
+              <w:lang w:eastAsia="bg-BG"/>
             </w:rPr>
           </w:pPr>
-          <w:hyperlink w:anchor="_Toc223385516" w:history="1">
+          <w:hyperlink w:anchor="_Toc223468476" w:history="1">
             <w:r>
               <w:rPr>
                 <w:rStyle w:val="Hyperlink"/>
@@ -1663,7 +1686,7 @@
                 <w:noProof/>
                 <w:webHidden/>
               </w:rPr>
-              <w:instrText xml:space="preserve"> PAGEREF _Toc223385516 \h </w:instrText>
+              <w:instrText xml:space="preserve"> PAGEREF _Toc223468476 \h </w:instrText>
             </w:r>
             <w:r>
               <w:rPr>
@@ -1683,7 +1706,7 @@
                 <w:noProof/>
                 <w:webHidden/>
               </w:rPr>
-              <w:t>15</w:t>
+              <w:t>16</w:t>
             </w:r>
             <w:r>
               <w:rPr>
@@ -1703,10 +1726,10 @@
             <w:rPr>
               <w:rFonts w:asciiTheme="minorHAnsi" w:eastAsiaTheme="minorEastAsia" w:hAnsiTheme="minorHAnsi"/>
               <w:noProof/>
-              <w:lang w:val="en-US"/>
+              <w:lang w:eastAsia="bg-BG"/>
             </w:rPr>
           </w:pPr>
-          <w:hyperlink w:anchor="_Toc223385517" w:history="1">
+          <w:hyperlink w:anchor="_Toc223468477" w:history="1">
             <w:r>
               <w:rPr>
                 <w:rStyle w:val="Hyperlink"/>
@@ -1733,7 +1756,7 @@
                 <w:noProof/>
                 <w:webHidden/>
               </w:rPr>
-              <w:instrText xml:space="preserve"> PAGEREF _Toc223385517 \h </w:instrText>
+              <w:instrText xml:space="preserve"> PAGEREF _Toc223468477 \h </w:instrText>
             </w:r>
             <w:r>
               <w:rPr>
@@ -1753,7 +1776,7 @@
                 <w:noProof/>
                 <w:webHidden/>
               </w:rPr>
-              <w:t>16</w:t>
+              <w:t>17</w:t>
             </w:r>
             <w:r>
               <w:rPr>
@@ -1773,10 +1796,10 @@
             <w:rPr>
               <w:rFonts w:asciiTheme="minorHAnsi" w:eastAsiaTheme="minorEastAsia" w:hAnsiTheme="minorHAnsi"/>
               <w:noProof/>
-              <w:lang w:val="en-US"/>
+              <w:lang w:eastAsia="bg-BG"/>
             </w:rPr>
           </w:pPr>
-          <w:hyperlink w:anchor="_Toc223385518" w:history="1">
+          <w:hyperlink w:anchor="_Toc223468478" w:history="1">
             <w:r>
               <w:rPr>
                 <w:rStyle w:val="Hyperlink"/>
@@ -1811,7 +1834,7 @@
                 <w:noProof/>
                 <w:webHidden/>
               </w:rPr>
-              <w:instrText xml:space="preserve"> PAGEREF _Toc223385518 \h </w:instrText>
+              <w:instrText xml:space="preserve"> PAGEREF _Toc223468478 \h </w:instrText>
             </w:r>
             <w:r>
               <w:rPr>
@@ -1831,7 +1854,7 @@
                 <w:noProof/>
                 <w:webHidden/>
               </w:rPr>
-              <w:t>17</w:t>
+              <w:t>18</w:t>
             </w:r>
             <w:r>
               <w:rPr>
@@ -1851,10 +1874,10 @@
             <w:rPr>
               <w:rFonts w:asciiTheme="minorHAnsi" w:eastAsiaTheme="minorEastAsia" w:hAnsiTheme="minorHAnsi"/>
               <w:noProof/>
-              <w:lang w:val="en-US"/>
+              <w:lang w:eastAsia="bg-BG"/>
             </w:rPr>
           </w:pPr>
-          <w:hyperlink w:anchor="_Toc223385519" w:history="1">
+          <w:hyperlink w:anchor="_Toc223468479" w:history="1">
             <w:r>
               <w:rPr>
                 <w:rStyle w:val="Hyperlink"/>
@@ -1889,7 +1912,7 @@
                 <w:noProof/>
                 <w:webHidden/>
               </w:rPr>
-              <w:instrText xml:space="preserve"> PAGEREF _Toc223385519 \h </w:instrText>
+              <w:instrText xml:space="preserve"> PAGEREF _Toc223468479 \h </w:instrText>
             </w:r>
             <w:r>
               <w:rPr>
@@ -1909,7 +1932,7 @@
                 <w:noProof/>
                 <w:webHidden/>
               </w:rPr>
-              <w:t>18</w:t>
+              <w:t>19</w:t>
             </w:r>
             <w:r>
               <w:rPr>
@@ -1930,10 +1953,10 @@
             <w:rPr>
               <w:rFonts w:asciiTheme="minorHAnsi" w:eastAsiaTheme="minorEastAsia" w:hAnsiTheme="minorHAnsi"/>
               <w:noProof/>
-              <w:lang w:val="en-US"/>
+              <w:lang w:eastAsia="bg-BG"/>
             </w:rPr>
           </w:pPr>
-          <w:hyperlink w:anchor="_Toc223385520" w:history="1">
+          <w:hyperlink w:anchor="_Toc223468480" w:history="1">
             <w:r>
               <w:rPr>
                 <w:rStyle w:val="Hyperlink"/>
@@ -1945,41 +1968,41 @@
               <w:rPr>
                 <w:rFonts w:asciiTheme="minorHAnsi" w:eastAsiaTheme="minorEastAsia" w:hAnsiTheme="minorHAnsi"/>
                 <w:noProof/>
+                <w:lang w:eastAsia="bg-BG"/>
+              </w:rPr>
+              <w:tab/>
+            </w:r>
+            <w:r>
+              <w:rPr>
+                <w:rStyle w:val="Hyperlink"/>
+                <w:noProof/>
+              </w:rPr>
+              <w:t xml:space="preserve">Подготовка за </w:t>
+            </w:r>
+            <w:r>
+              <w:rPr>
+                <w:rStyle w:val="Hyperlink"/>
+                <w:noProof/>
                 <w:lang w:val="en-US"/>
               </w:rPr>
+              <w:t>Ransomware</w:t>
+            </w:r>
+            <w:r>
+              <w:rPr>
+                <w:rStyle w:val="Hyperlink"/>
+                <w:noProof/>
+              </w:rPr>
+              <w:t xml:space="preserve"> инциденти</w:t>
+            </w:r>
+            <w:r>
+              <w:rPr>
+                <w:noProof/>
+                <w:webHidden/>
+              </w:rPr>
               <w:tab/>
             </w:r>
             <w:r>
               <w:rPr>
-                <w:rStyle w:val="Hyperlink"/>
-                <w:noProof/>
-              </w:rPr>
-              <w:t xml:space="preserve">Подготовка за </w:t>
-            </w:r>
-            <w:r>
-              <w:rPr>
-                <w:rStyle w:val="Hyperlink"/>
-                <w:noProof/>
-                <w:lang w:val="en-US"/>
-              </w:rPr>
-              <w:t>Ransomware</w:t>
-            </w:r>
-            <w:r>
-              <w:rPr>
-                <w:rStyle w:val="Hyperlink"/>
-                <w:noProof/>
-              </w:rPr>
-              <w:t xml:space="preserve"> инциденти</w:t>
-            </w:r>
-            <w:r>
-              <w:rPr>
-                <w:noProof/>
-                <w:webHidden/>
-              </w:rPr>
-              <w:tab/>
-            </w:r>
-            <w:r>
-              <w:rPr>
                 <w:noProof/>
                 <w:webHidden/>
               </w:rPr>
@@ -1990,7 +2013,7 @@
                 <w:noProof/>
                 <w:webHidden/>
               </w:rPr>
-              <w:instrText xml:space="preserve"> PAGEREF _Toc223385520 \h </w:instrText>
+              <w:instrText xml:space="preserve"> PAGEREF _Toc223468480 \h </w:instrText>
             </w:r>
             <w:r>
               <w:rPr>
@@ -2010,7 +2033,7 @@
                 <w:noProof/>
                 <w:webHidden/>
               </w:rPr>
-              <w:t>18</w:t>
+              <w:t>19</w:t>
             </w:r>
             <w:r>
               <w:rPr>
@@ -2031,10 +2054,10 @@
             <w:rPr>
               <w:rFonts w:asciiTheme="minorHAnsi" w:eastAsiaTheme="minorEastAsia" w:hAnsiTheme="minorHAnsi"/>
               <w:noProof/>
-              <w:lang w:val="en-US"/>
+              <w:lang w:eastAsia="bg-BG"/>
             </w:rPr>
           </w:pPr>
-          <w:hyperlink w:anchor="_Toc223385521" w:history="1">
+          <w:hyperlink w:anchor="_Toc223468481" w:history="1">
             <w:r>
               <w:rPr>
                 <w:rStyle w:val="Hyperlink"/>
@@ -2047,7 +2070,7 @@
               <w:rPr>
                 <w:rFonts w:asciiTheme="minorHAnsi" w:eastAsiaTheme="minorEastAsia" w:hAnsiTheme="minorHAnsi"/>
                 <w:noProof/>
-                <w:lang w:val="en-US"/>
+                <w:lang w:eastAsia="bg-BG"/>
               </w:rPr>
               <w:tab/>
             </w:r>
@@ -2077,7 +2100,7 @@
                 <w:noProof/>
                 <w:webHidden/>
               </w:rPr>
-              <w:instrText xml:space="preserve"> PAGEREF _Toc223385521 \h </w:instrText>
+              <w:instrText xml:space="preserve"> PAGEREF _Toc223468481 \h </w:instrText>
             </w:r>
             <w:r>
               <w:rPr>
@@ -2097,7 +2120,7 @@
                 <w:noProof/>
                 <w:webHidden/>
               </w:rPr>
-              <w:t>19</w:t>
+              <w:t>20</w:t>
             </w:r>
             <w:r>
               <w:rPr>
@@ -2118,10 +2141,10 @@
             <w:rPr>
               <w:rFonts w:asciiTheme="minorHAnsi" w:eastAsiaTheme="minorEastAsia" w:hAnsiTheme="minorHAnsi"/>
               <w:noProof/>
-              <w:lang w:val="en-US"/>
+              <w:lang w:eastAsia="bg-BG"/>
             </w:rPr>
           </w:pPr>
-          <w:hyperlink w:anchor="_Toc223385522" w:history="1">
+          <w:hyperlink w:anchor="_Toc223468482" w:history="1">
             <w:r>
               <w:rPr>
                 <w:rStyle w:val="Hyperlink"/>
@@ -2133,7 +2156,7 @@
               <w:rPr>
                 <w:rFonts w:asciiTheme="minorHAnsi" w:eastAsiaTheme="minorEastAsia" w:hAnsiTheme="minorHAnsi"/>
                 <w:noProof/>
-                <w:lang w:val="en-US"/>
+                <w:lang w:eastAsia="bg-BG"/>
               </w:rPr>
               <w:tab/>
             </w:r>
@@ -2163,7 +2186,7 @@
                 <w:noProof/>
                 <w:webHidden/>
               </w:rPr>
-              <w:instrText xml:space="preserve"> PAGEREF _Toc223385522 \h </w:instrText>
+              <w:instrText xml:space="preserve"> PAGEREF _Toc223468482 \h </w:instrText>
             </w:r>
             <w:r>
               <w:rPr>
@@ -2183,7 +2206,7 @@
                 <w:noProof/>
                 <w:webHidden/>
               </w:rPr>
-              <w:t>20</w:t>
+              <w:t>21</w:t>
             </w:r>
             <w:r>
               <w:rPr>
@@ -2204,10 +2227,10 @@
             <w:rPr>
               <w:rFonts w:asciiTheme="minorHAnsi" w:eastAsiaTheme="minorEastAsia" w:hAnsiTheme="minorHAnsi"/>
               <w:noProof/>
-              <w:lang w:val="en-US"/>
+              <w:lang w:eastAsia="bg-BG"/>
             </w:rPr>
           </w:pPr>
-          <w:hyperlink w:anchor="_Toc223385523" w:history="1">
+          <w:hyperlink w:anchor="_Toc223468483" w:history="1">
             <w:r>
               <w:rPr>
                 <w:rStyle w:val="Hyperlink"/>
@@ -2220,34 +2243,34 @@
               <w:rPr>
                 <w:rFonts w:asciiTheme="minorHAnsi" w:eastAsiaTheme="minorEastAsia" w:hAnsiTheme="minorHAnsi"/>
                 <w:noProof/>
+                <w:lang w:eastAsia="bg-BG"/>
+              </w:rPr>
+              <w:tab/>
+            </w:r>
+            <w:r>
+              <w:rPr>
+                <w:rStyle w:val="Hyperlink"/>
+                <w:noProof/>
                 <w:lang w:val="en-US"/>
               </w:rPr>
+              <w:t xml:space="preserve">Phishing </w:t>
+            </w:r>
+            <w:r>
+              <w:rPr>
+                <w:rStyle w:val="Hyperlink"/>
+                <w:noProof/>
+              </w:rPr>
+              <w:t>атаки</w:t>
+            </w:r>
+            <w:r>
+              <w:rPr>
+                <w:noProof/>
+                <w:webHidden/>
+              </w:rPr>
               <w:tab/>
             </w:r>
             <w:r>
               <w:rPr>
-                <w:rStyle w:val="Hyperlink"/>
-                <w:noProof/>
-                <w:lang w:val="en-US"/>
-              </w:rPr>
-              <w:t xml:space="preserve">Phishing </w:t>
-            </w:r>
-            <w:r>
-              <w:rPr>
-                <w:rStyle w:val="Hyperlink"/>
-                <w:noProof/>
-              </w:rPr>
-              <w:t>атаки</w:t>
-            </w:r>
-            <w:r>
-              <w:rPr>
-                <w:noProof/>
-                <w:webHidden/>
-              </w:rPr>
-              <w:tab/>
-            </w:r>
-            <w:r>
-              <w:rPr>
                 <w:noProof/>
                 <w:webHidden/>
               </w:rPr>
@@ -2258,7 +2281,7 @@
                 <w:noProof/>
                 <w:webHidden/>
               </w:rPr>
-              <w:instrText xml:space="preserve"> PAGEREF _Toc223385523 \h </w:instrText>
+              <w:instrText xml:space="preserve"> PAGEREF _Toc223468483 \h </w:instrText>
             </w:r>
             <w:r>
               <w:rPr>
@@ -2278,7 +2301,7 @@
                 <w:noProof/>
                 <w:webHidden/>
               </w:rPr>
-              <w:t>21</w:t>
+              <w:t>22</w:t>
             </w:r>
             <w:r>
               <w:rPr>
@@ -2299,10 +2322,10 @@
             <w:rPr>
               <w:rFonts w:asciiTheme="minorHAnsi" w:eastAsiaTheme="minorEastAsia" w:hAnsiTheme="minorHAnsi"/>
               <w:noProof/>
-              <w:lang w:val="en-US"/>
+              <w:lang w:eastAsia="bg-BG"/>
             </w:rPr>
           </w:pPr>
-          <w:hyperlink w:anchor="_Toc223385524" w:history="1">
+          <w:hyperlink w:anchor="_Toc223468484" w:history="1">
             <w:r>
               <w:rPr>
                 <w:rStyle w:val="Hyperlink"/>
@@ -2315,34 +2338,34 @@
               <w:rPr>
                 <w:rFonts w:asciiTheme="minorHAnsi" w:eastAsiaTheme="minorEastAsia" w:hAnsiTheme="minorHAnsi"/>
                 <w:noProof/>
+                <w:lang w:eastAsia="bg-BG"/>
+              </w:rPr>
+              <w:tab/>
+            </w:r>
+            <w:r>
+              <w:rPr>
+                <w:rStyle w:val="Hyperlink"/>
+                <w:noProof/>
+              </w:rPr>
+              <w:t xml:space="preserve">Други форми на </w:t>
+            </w:r>
+            <w:r>
+              <w:rPr>
+                <w:rStyle w:val="Hyperlink"/>
+                <w:noProof/>
                 <w:lang w:val="en-US"/>
               </w:rPr>
+              <w:t>Social Engineering</w:t>
+            </w:r>
+            <w:r>
+              <w:rPr>
+                <w:noProof/>
+                <w:webHidden/>
+              </w:rPr>
               <w:tab/>
             </w:r>
             <w:r>
               <w:rPr>
-                <w:rStyle w:val="Hyperlink"/>
-                <w:noProof/>
-              </w:rPr>
-              <w:t xml:space="preserve">Други форми на </w:t>
-            </w:r>
-            <w:r>
-              <w:rPr>
-                <w:rStyle w:val="Hyperlink"/>
-                <w:noProof/>
-                <w:lang w:val="en-US"/>
-              </w:rPr>
-              <w:t>Social Engineering</w:t>
-            </w:r>
-            <w:r>
-              <w:rPr>
-                <w:noProof/>
-                <w:webHidden/>
-              </w:rPr>
-              <w:tab/>
-            </w:r>
-            <w:r>
-              <w:rPr>
                 <w:noProof/>
                 <w:webHidden/>
               </w:rPr>
@@ -2353,7 +2376,7 @@
                 <w:noProof/>
                 <w:webHidden/>
               </w:rPr>
-              <w:instrText xml:space="preserve"> PAGEREF _Toc223385524 \h </w:instrText>
+              <w:instrText xml:space="preserve"> PAGEREF _Toc223468484 \h </w:instrText>
             </w:r>
             <w:r>
               <w:rPr>
@@ -2373,7 +2396,7 @@
                 <w:noProof/>
                 <w:webHidden/>
               </w:rPr>
-              <w:t>22</w:t>
+              <w:t>23</w:t>
             </w:r>
             <w:r>
               <w:rPr>
@@ -2393,15 +2416,100 @@
             <w:rPr>
               <w:rFonts w:asciiTheme="minorHAnsi" w:eastAsiaTheme="minorEastAsia" w:hAnsiTheme="minorHAnsi"/>
               <w:noProof/>
-              <w:lang w:val="en-US"/>
+              <w:lang w:eastAsia="bg-BG"/>
             </w:rPr>
           </w:pPr>
-          <w:hyperlink w:anchor="_Toc223385525" w:history="1">
+          <w:hyperlink w:anchor="_Toc223468485" w:history="1">
             <w:r>
               <w:rPr>
                 <w:rStyle w:val="Hyperlink"/>
                 <w:noProof/>
               </w:rPr>
+              <w:t>Какво да направим, ако станем жертва на</w:t>
+            </w:r>
+            <w:r>
+              <w:rPr>
+                <w:rStyle w:val="Hyperlink"/>
+                <w:noProof/>
+                <w:lang w:val="en-US"/>
+              </w:rPr>
+              <w:t xml:space="preserve"> ransomware</w:t>
+            </w:r>
+            <w:r>
+              <w:rPr>
+                <w:rStyle w:val="Hyperlink"/>
+                <w:noProof/>
+              </w:rPr>
+              <w:t xml:space="preserve"> атака?</w:t>
+            </w:r>
+            <w:r>
+              <w:rPr>
+                <w:noProof/>
+                <w:webHidden/>
+              </w:rPr>
+              <w:tab/>
+            </w:r>
+            <w:r>
+              <w:rPr>
+                <w:noProof/>
+                <w:webHidden/>
+              </w:rPr>
+              <w:fldChar w:fldCharType="begin"/>
+            </w:r>
+            <w:r>
+              <w:rPr>
+                <w:noProof/>
+                <w:webHidden/>
+              </w:rPr>
+              <w:instrText xml:space="preserve"> PAGEREF _Toc223468485 \h </w:instrText>
+            </w:r>
+            <w:r>
+              <w:rPr>
+                <w:noProof/>
+                <w:webHidden/>
+              </w:rPr>
+            </w:r>
+            <w:r>
+              <w:rPr>
+                <w:noProof/>
+                <w:webHidden/>
+              </w:rPr>
+              <w:fldChar w:fldCharType="separate"/>
+            </w:r>
+            <w:r>
+              <w:rPr>
+                <w:noProof/>
+                <w:webHidden/>
+              </w:rPr>
+              <w:t>24</w:t>
+            </w:r>
+            <w:r>
+              <w:rPr>
+                <w:noProof/>
+                <w:webHidden/>
+              </w:rPr>
+              <w:fldChar w:fldCharType="end"/>
+            </w:r>
+          </w:hyperlink>
+        </w:p>
+        <w:p>
+          <w:pPr>
+            <w:pStyle w:val="TOC1"/>
+            <w:tabs>
+              <w:tab w:val="right" w:leader="dot" w:pos="9016"/>
+            </w:tabs>
+            <w:rPr>
+              <w:rFonts w:asciiTheme="minorHAnsi" w:eastAsiaTheme="minorEastAsia" w:hAnsiTheme="minorHAnsi"/>
+              <w:noProof/>
+              <w:lang w:eastAsia="bg-BG"/>
+            </w:rPr>
+          </w:pPr>
+          <w:hyperlink w:anchor="_Toc223468486" w:history="1">
+            <w:r>
+              <w:rPr>
+                <w:rStyle w:val="Hyperlink"/>
+                <w:noProof/>
+              </w:rPr>
               <w:t>Цитирани източници</w:t>
             </w:r>
             <w:r>
@@ -2423,7 +2531,7 @@
                 <w:noProof/>
                 <w:webHidden/>
               </w:rPr>
-              <w:instrText xml:space="preserve"> PAGEREF _Toc223385525 \h </w:instrText>
+              <w:instrText xml:space="preserve"> PAGEREF _Toc223468486 \h </w:instrText>
             </w:r>
             <w:r>
               <w:rPr>
@@ -2443,7 +2551,7 @@
                 <w:noProof/>
                 <w:webHidden/>
               </w:rPr>
-              <w:t>23</w:t>
+              <w:t>25</w:t>
             </w:r>
             <w:r>
               <w:rPr>
@@ -2486,7 +2594,7 @@
           <w:rFonts w:eastAsia="Aptos"/>
         </w:rPr>
       </w:pPr>
-      <w:bookmarkStart w:id="0" w:name="_Toc223385505"/>
+      <w:bookmarkStart w:id="0" w:name="_Toc223468464"/>
       <w:r>
         <w:rPr>
           <w:rFonts w:eastAsia="Aptos"/>
@@ -2764,7 +2872,7 @@
           <w:lang w:val="en-US"/>
         </w:rPr>
       </w:pPr>
-      <w:bookmarkStart w:id="1" w:name="_Toc223385506"/>
+      <w:bookmarkStart w:id="1" w:name="_Toc223468465"/>
       <w:r>
         <w:lastRenderedPageBreak/>
         <w:t xml:space="preserve">История на </w:t>
@@ -3013,7 +3121,7 @@
       <w:pPr>
         <w:pStyle w:val="Heading1"/>
       </w:pPr>
-      <w:bookmarkStart w:id="2" w:name="_Toc223385507"/>
+      <w:bookmarkStart w:id="2" w:name="_Toc223468466"/>
       <w:r>
         <w:lastRenderedPageBreak/>
         <w:t xml:space="preserve">Еволюция на </w:t>
@@ -3040,7 +3148,7 @@
           <w:numId w:val="2"/>
         </w:numPr>
       </w:pPr>
-      <w:bookmarkStart w:id="3" w:name="_Toc223385508"/>
+      <w:bookmarkStart w:id="3" w:name="_Toc223468467"/>
       <w:r>
         <w:t xml:space="preserve">Ранна фаза на </w:t>
       </w:r>
@@ -3261,24 +3369,14 @@
       <w:r>
         <w:t xml:space="preserve">Фигура </w:t>
       </w:r>
-      <w:r>
-        <w:fldChar w:fldCharType="begin"/>
-      </w:r>
-      <w:r>
-        <w:instrText xml:space="preserve"> SEQ Фигура \* ARABIC </w:instrText>
-      </w:r>
-      <w:r>
-        <w:fldChar w:fldCharType="separate"/>
-      </w:r>
-      <w:r>
-        <w:rPr>
-          <w:noProof/>
-        </w:rPr>
-        <w:t>1</w:t>
-      </w:r>
-      <w:r>
-        <w:fldChar w:fldCharType="end"/>
-      </w:r>
+      <w:fldSimple w:instr=" SEQ Фигура \* ARABIC ">
+        <w:r>
+          <w:rPr>
+            <w:noProof/>
+          </w:rPr>
+          <w:t>1</w:t>
+        </w:r>
+      </w:fldSimple>
       <w:r>
         <w:rPr>
           <w:lang w:val="en-US"/>
@@ -3338,7 +3436,7 @@
           <w:numId w:val="2"/>
         </w:numPr>
       </w:pPr>
-      <w:bookmarkStart w:id="5" w:name="_Toc223385509"/>
+      <w:bookmarkStart w:id="5" w:name="_Toc223468468"/>
       <w:r>
         <w:rPr>
           <w:lang w:val="en-US"/>
@@ -3500,24 +3598,14 @@
       <w:r>
         <w:t xml:space="preserve">Фигура </w:t>
       </w:r>
-      <w:r>
-        <w:fldChar w:fldCharType="begin"/>
-      </w:r>
-      <w:r>
-        <w:instrText xml:space="preserve"> SEQ Фигура \* ARABIC </w:instrText>
-      </w:r>
-      <w:r>
-        <w:fldChar w:fldCharType="separate"/>
-      </w:r>
-      <w:r>
-        <w:rPr>
-          <w:noProof/>
-        </w:rPr>
-        <w:t>2</w:t>
-      </w:r>
-      <w:r>
-        <w:fldChar w:fldCharType="end"/>
-      </w:r>
+      <w:fldSimple w:instr=" SEQ Фигура \* ARABIC ">
+        <w:r>
+          <w:rPr>
+            <w:noProof/>
+          </w:rPr>
+          <w:t>2</w:t>
+        </w:r>
+      </w:fldSimple>
       <w:r>
         <w:rPr>
           <w:lang w:val="en-US"/>
@@ -3839,24 +3927,14 @@
       <w:r>
         <w:t xml:space="preserve">Фигура </w:t>
       </w:r>
-      <w:r>
-        <w:fldChar w:fldCharType="begin"/>
-      </w:r>
-      <w:r>
-        <w:instrText xml:space="preserve"> SEQ Фигура \* ARABIC </w:instrText>
-      </w:r>
-      <w:r>
-        <w:fldChar w:fldCharType="separate"/>
-      </w:r>
-      <w:r>
-        <w:rPr>
-          <w:noProof/>
-        </w:rPr>
-        <w:t>3</w:t>
-      </w:r>
-      <w:r>
-        <w:fldChar w:fldCharType="end"/>
-      </w:r>
+      <w:fldSimple w:instr=" SEQ Фигура \* ARABIC ">
+        <w:r>
+          <w:rPr>
+            <w:noProof/>
+          </w:rPr>
+          <w:t>3</w:t>
+        </w:r>
+      </w:fldSimple>
       <w:r>
         <w:rPr>
           <w:lang w:val="en-US"/>
@@ -3911,7 +3989,7 @@
           <w:lang w:val="en-US"/>
         </w:rPr>
       </w:pPr>
-      <w:bookmarkStart w:id="8" w:name="_Toc223385510"/>
+      <w:bookmarkStart w:id="8" w:name="_Toc223468469"/>
       <w:r>
         <w:rPr>
           <w:lang w:val="en-US"/>
@@ -4002,6 +4080,9 @@
       <w:pPr>
         <w:spacing w:line="360" w:lineRule="auto"/>
         <w:ind w:firstLine="360"/>
+        <w:rPr>
+          <w:lang w:val="en-US"/>
+        </w:rPr>
       </w:pPr>
       <w:r>
         <w:t xml:space="preserve">През 2006 година се появява първия </w:t>
@@ -4038,64 +4119,6 @@
       <w:r>
         <w:t xml:space="preserve"> </w:t>
       </w:r>
-      <w:sdt>
-        <w:sdtPr>
-          <w:id w:val="-1460947716"/>
-          <w:citation/>
-        </w:sdtPr>
-        <w:sdtContent>
-          <w:r>
-            <w:fldChar w:fldCharType="begin"/>
-          </w:r>
-          <w:r>
-            <w:instrText xml:space="preserve"> CITATION Gpc \l 1026 </w:instrText>
-          </w:r>
-          <w:r>
-            <w:fldChar w:fldCharType="separate"/>
-          </w:r>
-          <w:r>
-            <w:rPr>
-              <w:noProof/>
-            </w:rPr>
-            <w:t>[8]</w:t>
-          </w:r>
-          <w:r>
-            <w:fldChar w:fldCharType="end"/>
-          </w:r>
-        </w:sdtContent>
-      </w:sdt>
-      <w:sdt>
-        <w:sdtPr>
-          <w:id w:val="-417558124"/>
-          <w:citation/>
-        </w:sdtPr>
-        <w:sdtContent>
-          <w:r>
-            <w:fldChar w:fldCharType="begin"/>
-          </w:r>
-          <w:r>
-            <w:instrText xml:space="preserve"> CITATION Gpc \l 1026 </w:instrText>
-          </w:r>
-          <w:r>
-            <w:fldChar w:fldCharType="separate"/>
-          </w:r>
-          <w:r>
-            <w:rPr>
-              <w:noProof/>
-            </w:rPr>
-            <w:t xml:space="preserve"> </w:t>
-          </w:r>
-          <w:r>
-            <w:rPr>
-              <w:noProof/>
-            </w:rPr>
-            <w:t>[8]</w:t>
-          </w:r>
-          <w:r>
-            <w:fldChar w:fldCharType="end"/>
-          </w:r>
-        </w:sdtContent>
-      </w:sdt>
     </w:p>
     <w:p>
       <w:pPr>
@@ -4178,6 +4201,8 @@
       <w:proofErr w:type="spellStart"/>
       <w:r>
         <w:rPr>
+          <w:i/>
+          <w:iCs/>
           <w:lang w:val="en-US"/>
         </w:rPr>
         <w:t>Undeletion</w:t>
@@ -4185,6 +4210,8 @@
       <w:proofErr w:type="spellEnd"/>
       <w:r>
         <w:rPr>
+          <w:i/>
+          <w:iCs/>
           <w:lang w:val="en-US"/>
         </w:rPr>
         <w:t xml:space="preserve"> utility</w:t>
@@ -4291,24 +4318,14 @@
       <w:r>
         <w:t xml:space="preserve">Фигура </w:t>
       </w:r>
-      <w:r>
-        <w:fldChar w:fldCharType="begin"/>
-      </w:r>
-      <w:r>
-        <w:instrText xml:space="preserve"> SEQ Фигура \* ARABIC </w:instrText>
-      </w:r>
-      <w:r>
-        <w:fldChar w:fldCharType="separate"/>
-      </w:r>
-      <w:r>
-        <w:rPr>
-          <w:noProof/>
-        </w:rPr>
-        <w:t>4</w:t>
-      </w:r>
-      <w:r>
-        <w:fldChar w:fldCharType="end"/>
-      </w:r>
+      <w:fldSimple w:instr=" SEQ Фигура \* ARABIC ">
+        <w:r>
+          <w:rPr>
+            <w:noProof/>
+          </w:rPr>
+          <w:t>4</w:t>
+        </w:r>
+      </w:fldSimple>
       <w:r>
         <w:t xml:space="preserve">: </w:t>
       </w:r>
@@ -4410,24 +4427,14 @@
       <w:r>
         <w:t xml:space="preserve">Фигура </w:t>
       </w:r>
-      <w:r>
-        <w:fldChar w:fldCharType="begin"/>
-      </w:r>
-      <w:r>
-        <w:instrText xml:space="preserve"> SEQ Фигура \* ARABIC </w:instrText>
-      </w:r>
-      <w:r>
-        <w:fldChar w:fldCharType="separate"/>
-      </w:r>
-      <w:r>
-        <w:rPr>
-          <w:noProof/>
-        </w:rPr>
-        <w:t>5</w:t>
-      </w:r>
-      <w:r>
-        <w:fldChar w:fldCharType="end"/>
-      </w:r>
+      <w:fldSimple w:instr=" SEQ Фигура \* ARABIC ">
+        <w:r>
+          <w:rPr>
+            <w:noProof/>
+          </w:rPr>
+          <w:t>5</w:t>
+        </w:r>
+      </w:fldSimple>
       <w:r>
         <w:t xml:space="preserve">: </w:t>
       </w:r>
@@ -4463,7 +4470,7 @@
           <w:lang w:val="en-US"/>
         </w:rPr>
       </w:pPr>
-      <w:bookmarkStart w:id="11" w:name="_Toc223385511"/>
+      <w:bookmarkStart w:id="11" w:name="_Toc223468470"/>
       <w:r>
         <w:rPr>
           <w:lang w:val="en-US"/>
@@ -4625,24 +4632,14 @@
       <w:r>
         <w:t xml:space="preserve">Фигура </w:t>
       </w:r>
-      <w:r>
-        <w:fldChar w:fldCharType="begin"/>
-      </w:r>
-      <w:r>
-        <w:instrText xml:space="preserve"> SEQ Фигура \* ARABIC </w:instrText>
-      </w:r>
-      <w:r>
-        <w:fldChar w:fldCharType="separate"/>
-      </w:r>
-      <w:r>
-        <w:rPr>
-          <w:noProof/>
-        </w:rPr>
-        <w:t>6</w:t>
-      </w:r>
-      <w:r>
-        <w:fldChar w:fldCharType="end"/>
-      </w:r>
+      <w:fldSimple w:instr=" SEQ Фигура \* ARABIC ">
+        <w:r>
+          <w:rPr>
+            <w:noProof/>
+          </w:rPr>
+          <w:t>6</w:t>
+        </w:r>
+      </w:fldSimple>
       <w:r>
         <w:t xml:space="preserve">: </w:t>
       </w:r>
@@ -4675,7 +4672,7 @@
           <w:numId w:val="2"/>
         </w:numPr>
       </w:pPr>
-      <w:bookmarkStart w:id="13" w:name="_Toc223385512"/>
+      <w:bookmarkStart w:id="13" w:name="_Toc223468471"/>
       <w:r>
         <w:rPr>
           <w:lang w:val="en-US"/>
@@ -4762,24 +4759,14 @@
       <w:r>
         <w:t xml:space="preserve">Фигура </w:t>
       </w:r>
-      <w:r>
-        <w:fldChar w:fldCharType="begin"/>
-      </w:r>
-      <w:r>
-        <w:instrText xml:space="preserve"> SEQ Фигура \* ARABIC </w:instrText>
-      </w:r>
-      <w:r>
-        <w:fldChar w:fldCharType="separate"/>
-      </w:r>
-      <w:r>
-        <w:rPr>
-          <w:noProof/>
-        </w:rPr>
-        <w:t>7</w:t>
-      </w:r>
-      <w:r>
-        <w:fldChar w:fldCharType="end"/>
-      </w:r>
+      <w:fldSimple w:instr=" SEQ Фигура \* ARABIC ">
+        <w:r>
+          <w:rPr>
+            <w:noProof/>
+          </w:rPr>
+          <w:t>7</w:t>
+        </w:r>
+      </w:fldSimple>
       <w:r>
         <w:t xml:space="preserve">: </w:t>
       </w:r>
@@ -4956,21 +4943,430 @@
         </w:rPr>
         <w:t>ransomware-</w:t>
       </w:r>
+      <w:r>
+        <w:t>ът и се изисква откуп в биткойни.</w:t>
+      </w:r>
+    </w:p>
+    <w:p>
+      <w:pPr>
+        <w:jc w:val="left"/>
+      </w:pPr>
+      <w:r>
+        <w:br w:type="page"/>
+      </w:r>
+    </w:p>
+    <w:p>
+      <w:pPr>
+        <w:pStyle w:val="Heading1"/>
+        <w:rPr>
+          <w:lang w:val="en-US"/>
+        </w:rPr>
+      </w:pPr>
+      <w:bookmarkStart w:id="15" w:name="_Toc223468472"/>
+      <w:r>
+        <w:lastRenderedPageBreak/>
+        <w:t xml:space="preserve">Ролята на </w:t>
+      </w:r>
+      <w:r>
+        <w:rPr>
+          <w:lang w:val="en-US"/>
+        </w:rPr>
+        <w:t xml:space="preserve">AI </w:t>
+      </w:r>
+      <w:r>
+        <w:t xml:space="preserve">в </w:t>
+      </w:r>
+      <w:r>
+        <w:rPr>
+          <w:lang w:val="en-US"/>
+        </w:rPr>
+        <w:t>Ransomware</w:t>
+      </w:r>
+      <w:r>
+        <w:t xml:space="preserve"> атаките</w:t>
+      </w:r>
+      <w:bookmarkEnd w:id="15"/>
+    </w:p>
+    <w:p>
+      <w:r>
+        <w:tab/>
+      </w:r>
+      <w:r>
+        <w:t xml:space="preserve">Използването на изкуствен интелект (ИИ) открива нов фронт в продължаващата борба срещу </w:t>
+      </w:r>
       <w:proofErr w:type="spellStart"/>
       <w:r>
-        <w:t>ът</w:t>
+        <w:t>ransomware</w:t>
       </w:r>
       <w:proofErr w:type="spellEnd"/>
       <w:r>
-        <w:t xml:space="preserve"> и се изисква откуп в биткойни.</w:t>
-      </w:r>
-    </w:p>
-    <w:p>
-      <w:pPr>
+        <w:t xml:space="preserve">. Както киберпрестъпниците, така и </w:t>
+      </w:r>
+      <w:r>
+        <w:rPr>
+          <w:lang w:val="en-US"/>
+        </w:rPr>
+        <w:t xml:space="preserve">security </w:t>
+      </w:r>
+      <w:r>
+        <w:t xml:space="preserve">експертите </w:t>
+      </w:r>
+      <w:r>
+        <w:t>използват тази технология, за да подобрят своята производителност</w:t>
+      </w:r>
+      <w:r>
+        <w:t xml:space="preserve">. </w:t>
+      </w:r>
+    </w:p>
+    <w:p>
+      <w:pPr>
+        <w:ind w:firstLine="709"/>
+      </w:pPr>
+      <w:r>
+        <w:t xml:space="preserve">През 2024 г. изкуственият интелект е бил използван за намаляване на </w:t>
+      </w:r>
+      <w:r>
+        <w:t xml:space="preserve">прага </w:t>
+      </w:r>
+      <w:r>
+        <w:t xml:space="preserve">за навлизане на хакери, създаване на по-персонализирани тактики, използване на уязвимости и изискване на по-високи откупи. </w:t>
+      </w:r>
+      <w:r>
+        <w:rPr>
+          <w:lang w:val="en-US"/>
+        </w:rPr>
+        <w:t>Ransomware</w:t>
+      </w:r>
+      <w:r>
+        <w:t xml:space="preserve"> атаките</w:t>
+      </w:r>
+      <w:r>
+        <w:t xml:space="preserve"> </w:t>
+      </w:r>
+      <w:r>
+        <w:t>достигат</w:t>
+      </w:r>
+      <w:r>
+        <w:t xml:space="preserve"> рекордни върхове</w:t>
+      </w:r>
+      <w:r>
+        <w:t xml:space="preserve"> последните две години</w:t>
+      </w:r>
+      <w:r>
+        <w:t xml:space="preserve"> и е много вероятно изкуственият интелект да изостри тази тенденция през 202</w:t>
+      </w:r>
+      <w:r>
+        <w:t>6</w:t>
+      </w:r>
+      <w:r>
+        <w:t xml:space="preserve"> г.</w:t>
+      </w:r>
+    </w:p>
+    <w:p>
+      <w:pPr>
+        <w:ind w:firstLine="709"/>
+        <w:rPr>
+          <w:lang w:val="en-US"/>
+        </w:rPr>
+      </w:pPr>
+      <w:r>
+        <w:t xml:space="preserve">Киберпрестъпниците използват </w:t>
+      </w:r>
+      <w:r>
+        <w:rPr>
+          <w:lang w:val="en-US"/>
+        </w:rPr>
+        <w:t>AI</w:t>
+      </w:r>
+      <w:r>
+        <w:t xml:space="preserve"> з</w:t>
+      </w:r>
+      <w:r>
+        <w:rPr>
+          <w:lang w:val="en-US"/>
+        </w:rPr>
+        <w:t xml:space="preserve">a </w:t>
+      </w:r>
+      <w:r>
+        <w:t xml:space="preserve">автоматизация на стратегиите за изграждане на </w:t>
+      </w:r>
+      <w:r>
+        <w:rPr>
+          <w:lang w:val="en-US"/>
+        </w:rPr>
+        <w:t>ransomware</w:t>
+      </w:r>
+      <w:r>
+        <w:t xml:space="preserve">, </w:t>
+      </w:r>
+      <w:r>
+        <w:t>което позволява бързо идентифициране на уязвимости и внедряване на силно персонализирани фишинг кампании.</w:t>
+      </w:r>
+      <w:r>
+        <w:t xml:space="preserve"> </w:t>
+      </w:r>
+      <w:sdt>
+        <w:sdtPr>
+          <w:id w:val="-2000725777"/>
+          <w:citation/>
+        </w:sdtPr>
+        <w:sdtContent>
+          <w:r>
+            <w:fldChar w:fldCharType="begin"/>
+          </w:r>
+          <w:r>
+            <w:rPr>
+              <w:lang w:val="en-US"/>
+            </w:rPr>
+            <w:instrText xml:space="preserve">CITATION Bre25 \l 1033 </w:instrText>
+          </w:r>
+          <w:r>
+            <w:fldChar w:fldCharType="separate"/>
+          </w:r>
+          <w:r>
+            <w:rPr>
+              <w:noProof/>
+              <w:lang w:val="en-US"/>
+            </w:rPr>
+            <w:t>[9]</w:t>
+          </w:r>
+          <w:r>
+            <w:fldChar w:fldCharType="end"/>
+          </w:r>
+        </w:sdtContent>
+      </w:sdt>
+    </w:p>
+    <w:p>
+      <w:pPr>
+        <w:rPr>
+          <w:lang w:val="en-US"/>
+        </w:rPr>
+      </w:pPr>
+      <w:r>
+        <w:t xml:space="preserve">Ето някои от начините, за които хакерите използват </w:t>
+      </w:r>
+      <w:r>
+        <w:rPr>
+          <w:lang w:val="en-US"/>
+        </w:rPr>
+        <w:t>AI:</w:t>
+      </w:r>
+    </w:p>
+    <w:p>
+      <w:pPr>
+        <w:pStyle w:val="ListParagraph"/>
+        <w:numPr>
+          <w:ilvl w:val="0"/>
+          <w:numId w:val="9"/>
+        </w:numPr>
+        <w:rPr>
+          <w:lang w:val="en-US"/>
+        </w:rPr>
+      </w:pPr>
+      <w:proofErr w:type="spellStart"/>
+      <w:r>
+        <w:t>Полиморфен</w:t>
+      </w:r>
+      <w:proofErr w:type="spellEnd"/>
+      <w:r>
+        <w:t xml:space="preserve"> </w:t>
+      </w:r>
+      <w:r>
+        <w:rPr>
+          <w:lang w:val="en-US"/>
+        </w:rPr>
+        <w:t>AI ransomware</w:t>
+      </w:r>
+      <w:r>
+        <w:t xml:space="preserve"> - Традиционното разпознаване на </w:t>
+      </w:r>
+      <w:r>
+        <w:rPr>
+          <w:lang w:val="en-US"/>
+        </w:rPr>
+        <w:t>ransomware</w:t>
+      </w:r>
+      <w:r>
+        <w:t xml:space="preserve"> атаките разчита на методи, за детекция на често използвани модели. За да избегнат евентуална детекция към </w:t>
+      </w:r>
+      <w:r>
+        <w:rPr>
+          <w:lang w:val="en-US"/>
+        </w:rPr>
+        <w:t>ransomware</w:t>
+      </w:r>
+      <w:r>
+        <w:t xml:space="preserve"> се прилага </w:t>
+      </w:r>
+      <w:r>
+        <w:rPr>
+          <w:lang w:val="en-US"/>
+        </w:rPr>
+        <w:t>AI,</w:t>
+      </w:r>
+      <w:r>
+        <w:t xml:space="preserve"> която непрестанно модифицира кода си, за да го избегне. По този начин остава незабележим за антивирусните.</w:t>
+      </w:r>
+    </w:p>
+    <w:p>
+      <w:pPr>
+        <w:pStyle w:val="ListParagraph"/>
+        <w:numPr>
+          <w:ilvl w:val="0"/>
+          <w:numId w:val="9"/>
+        </w:numPr>
+        <w:rPr>
+          <w:lang w:val="en-US"/>
+        </w:rPr>
+      </w:pPr>
+      <w:r>
+        <w:t>Автоматизация:</w:t>
+      </w:r>
+      <w:r>
+        <w:rPr>
+          <w:lang w:val="en-US"/>
+        </w:rPr>
+        <w:t xml:space="preserve"> AI</w:t>
+      </w:r>
+      <w:r>
+        <w:t xml:space="preserve"> позволява на хакерите да автоматизират и персонализират производството на </w:t>
+      </w:r>
+      <w:r>
+        <w:rPr>
+          <w:lang w:val="en-US"/>
+        </w:rPr>
+        <w:t>ransomware</w:t>
+      </w:r>
+      <w:r>
+        <w:t>.</w:t>
+      </w:r>
+      <w:r>
+        <w:rPr>
+          <w:lang w:val="en-US"/>
+        </w:rPr>
+        <w:t xml:space="preserve"> </w:t>
+      </w:r>
+      <w:r>
+        <w:t>Инструментите за автоматизация позволят бързо сканиране на уязвимости, ефикасно изпълнение на атаки и адаптация в реално време въз основа на защитните механизми. Това позволява множество атаки на различни организации едновреме</w:t>
+      </w:r>
+      <w:r>
+        <w:t>н</w:t>
+      </w:r>
+      <w:r>
+        <w:t>но.</w:t>
+      </w:r>
+    </w:p>
+    <w:p>
+      <w:pPr>
+        <w:ind w:firstLine="709"/>
+        <w:jc w:val="center"/>
+      </w:pPr>
+    </w:p>
+    <w:p>
+      <w:pPr>
+        <w:keepNext/>
+        <w:ind w:firstLine="709"/>
+        <w:jc w:val="center"/>
+      </w:pPr>
+      <w:r>
+        <w:drawing>
+          <wp:inline distT="0" distB="0" distL="0" distR="0" wp14:anchorId="02891911" wp14:editId="4B6B4122">
+            <wp:extent cx="5427980" cy="2679773"/>
+            <wp:effectExtent l="0" t="0" r="1270" b="6350"/>
+            <wp:docPr id="1971879349" name="Picture 2"/>
+            <wp:cNvGraphicFramePr>
+              <a:graphicFrameLocks xmlns:a="http://schemas.openxmlformats.org/drawingml/2006/main" noChangeAspect="1"/>
+            </wp:cNvGraphicFramePr>
+            <a:graphic xmlns:a="http://schemas.openxmlformats.org/drawingml/2006/main">
+              <a:graphicData uri="http://schemas.openxmlformats.org/drawingml/2006/picture">
+                <pic:pic xmlns:pic="http://schemas.openxmlformats.org/drawingml/2006/picture">
+                  <pic:nvPicPr>
+                    <pic:cNvPr id="0" name="Picture 6"/>
+                    <pic:cNvPicPr>
+                      <a:picLocks noChangeAspect="1" noChangeArrowheads="1"/>
+                    </pic:cNvPicPr>
+                  </pic:nvPicPr>
+                  <pic:blipFill rotWithShape="1">
+                    <a:blip r:embed="rId22">
+                      <a:extLst>
+                        <a:ext uri="{28A0092B-C50C-407E-A947-70E740481C1C}">
+                          <a14:useLocalDpi xmlns:a14="http://schemas.microsoft.com/office/drawing/2010/main" val="0"/>
+                        </a:ext>
+                      </a:extLst>
+                    </a:blip>
+                    <a:srcRect l="2937" t="5764" r="2797" b="5660"/>
+                    <a:stretch>
+                      <a:fillRect/>
+                    </a:stretch>
+                  </pic:blipFill>
+                  <pic:spPr bwMode="auto">
+                    <a:xfrm>
+                      <a:off x="0" y="0"/>
+                      <a:ext cx="5429830" cy="2680686"/>
+                    </a:xfrm>
+                    <a:prstGeom prst="rect">
+                      <a:avLst/>
+                    </a:prstGeom>
+                    <a:noFill/>
+                    <a:ln>
+                      <a:noFill/>
+                    </a:ln>
+                    <a:extLst>
+                      <a:ext uri="{53640926-AAD7-44D8-BBD7-CCE9431645EC}">
+                        <a14:shadowObscured xmlns:a14="http://schemas.microsoft.com/office/drawing/2010/main"/>
+                      </a:ext>
+                    </a:extLst>
+                  </pic:spPr>
+                </pic:pic>
+              </a:graphicData>
+            </a:graphic>
+          </wp:inline>
+        </w:drawing>
+      </w:r>
+    </w:p>
+    <w:p>
+      <w:pPr>
+        <w:pStyle w:val="Caption"/>
         <w:jc w:val="left"/>
       </w:pPr>
       <w:r>
-        <w:br w:type="page"/>
+        <w:t xml:space="preserve">Фигура </w:t>
+      </w:r>
+      <w:r>
+        <w:fldChar w:fldCharType="begin"/>
+      </w:r>
+      <w:r>
+        <w:instrText xml:space="preserve"> SEQ Фигура \* ARABIC </w:instrText>
+      </w:r>
+      <w:r>
+        <w:fldChar w:fldCharType="separate"/>
+      </w:r>
+      <w:r>
+        <w:rPr>
+          <w:noProof/>
+        </w:rPr>
+        <w:t>8</w:t>
+      </w:r>
+      <w:r>
+        <w:fldChar w:fldCharType="end"/>
+      </w:r>
+      <w:r>
+        <w:t xml:space="preserve">: </w:t>
+      </w:r>
+      <w:r>
+        <w:rPr>
+          <w:lang w:val="en-US"/>
+        </w:rPr>
+        <w:t>40%</w:t>
+      </w:r>
+      <w:r>
+        <w:t xml:space="preserve"> от фишинг атаките са генерирани от </w:t>
+      </w:r>
+      <w:r>
+        <w:rPr>
+          <w:lang w:val="en-US"/>
+        </w:rPr>
+        <w:t>AI</w:t>
       </w:r>
     </w:p>
     <w:p>
@@ -4980,7 +5376,7 @@
           <w:lang w:val="en-US"/>
         </w:rPr>
       </w:pPr>
-      <w:bookmarkStart w:id="15" w:name="_Toc223385513"/>
+      <w:bookmarkStart w:id="16" w:name="_Toc223468473"/>
       <w:r>
         <w:lastRenderedPageBreak/>
         <w:t xml:space="preserve">Имплементация на </w:t>
@@ -4991,7 +5387,7 @@
         </w:rPr>
         <w:t>Ransomware</w:t>
       </w:r>
-      <w:bookmarkEnd w:id="15"/>
+      <w:bookmarkEnd w:id="16"/>
     </w:p>
     <w:p>
       <w:r>
@@ -5028,16 +5424,64 @@
         <w:t>Spring Framework.</w:t>
       </w:r>
       <w:r>
-        <w:t xml:space="preserve"> Целта на имплементацията е да се покаже колко лесно може да се създаде софтуер за криптиране и декриптиране на файлове, който да се използва за </w:t>
-      </w:r>
-      <w:r>
-        <w:rPr>
-          <w:lang w:val="en-US"/>
-        </w:rPr>
-        <w:t>ransomware.</w:t>
-      </w:r>
-      <w:r>
-        <w:t xml:space="preserve"> В демото има три текстови файла, които съдържат кратко текстово съдържанието. При стартиран на приложението се криптират, когато потребителят „плати“, тогава се декриптират обратно в текстови.</w:t>
+        <w:t xml:space="preserve"> Целта на имплементацията е да се покаже колко лесно може да се създаде софтуер за криптиране и декриптиране на файлове, който да </w:t>
+      </w:r>
+      <w:r>
+        <w:t xml:space="preserve">бъде </w:t>
+      </w:r>
+      <w:r>
+        <w:t>използва</w:t>
+      </w:r>
+      <w:r>
+        <w:t>н</w:t>
+      </w:r>
+      <w:r>
+        <w:t xml:space="preserve"> за </w:t>
+      </w:r>
+      <w:r>
+        <w:rPr>
+          <w:lang w:val="en-US"/>
+        </w:rPr>
+        <w:t>ransomware</w:t>
+      </w:r>
+      <w:r>
+        <w:t xml:space="preserve"> атаки</w:t>
+      </w:r>
+      <w:r>
+        <w:rPr>
+          <w:lang w:val="en-US"/>
+        </w:rPr>
+        <w:t>.</w:t>
+      </w:r>
+      <w:r>
+        <w:t xml:space="preserve"> Такъв тип атака е прилаган в ранните две хилядни.</w:t>
+      </w:r>
+      <w:r>
+        <w:t xml:space="preserve"> В демото има три текстови файла</w:t>
+      </w:r>
+      <w:r>
+        <w:t>.</w:t>
+      </w:r>
+      <w:r>
+        <w:t xml:space="preserve"> При стартиран</w:t>
+      </w:r>
+      <w:r>
+        <w:t>е</w:t>
+      </w:r>
+      <w:r>
+        <w:t xml:space="preserve"> на приложението</w:t>
+      </w:r>
+      <w:r>
+        <w:t>,</w:t>
+      </w:r>
+      <w:r>
+        <w:t xml:space="preserve"> се криптират</w:t>
+      </w:r>
+      <w:r>
+        <w:t xml:space="preserve"> и</w:t>
+      </w:r>
+      <w:r>
+        <w:t xml:space="preserve"> когато потребителят „плати“, тогава се декриптират обратно в текстови.</w:t>
       </w:r>
     </w:p>
     <w:p>
@@ -5282,28 +5726,18 @@
           <w:szCs w:val="20"/>
         </w:rPr>
       </w:pPr>
-      <w:bookmarkStart w:id="16" w:name="_Toc223382614"/>
+      <w:bookmarkStart w:id="17" w:name="_Toc223382614"/>
       <w:r>
         <w:t xml:space="preserve">Фигура </w:t>
       </w:r>
-      <w:r>
-        <w:fldChar w:fldCharType="begin"/>
-      </w:r>
-      <w:r>
-        <w:instrText xml:space="preserve"> SEQ Фигура \* ARABIC </w:instrText>
-      </w:r>
-      <w:r>
-        <w:fldChar w:fldCharType="separate"/>
-      </w:r>
-      <w:r>
-        <w:rPr>
-          <w:noProof/>
-        </w:rPr>
-        <w:t>8</w:t>
-      </w:r>
-      <w:r>
-        <w:fldChar w:fldCharType="end"/>
-      </w:r>
+      <w:fldSimple w:instr=" SEQ Фигура \* ARABIC ">
+        <w:r>
+          <w:rPr>
+            <w:noProof/>
+          </w:rPr>
+          <w:t>9</w:t>
+        </w:r>
+      </w:fldSimple>
       <w:r>
         <w:t>:</w:t>
       </w:r>
@@ -5313,7 +5747,7 @@
         </w:rPr>
         <w:t xml:space="preserve"> pom.xml</w:t>
       </w:r>
-      <w:bookmarkEnd w:id="16"/>
+      <w:bookmarkEnd w:id="17"/>
     </w:p>
     <w:p>
       <w:pPr>
@@ -5434,7 +5868,15 @@
         <w:t xml:space="preserve">    </w:t>
       </w:r>
       <w:r>
-        <w:t xml:space="preserve">String decrypt(String </w:t>
+        <w:t xml:space="preserve">String </w:t>
+      </w:r>
+      <w:proofErr w:type="gramStart"/>
+      <w:r>
+        <w:t>decrypt(</w:t>
+      </w:r>
+      <w:proofErr w:type="gramEnd"/>
+      <w:r>
+        <w:t xml:space="preserve">String </w:t>
       </w:r>
       <w:proofErr w:type="spellStart"/>
       <w:r>
@@ -5457,24 +5899,14 @@
       <w:r>
         <w:t xml:space="preserve">Фигура </w:t>
       </w:r>
-      <w:r>
-        <w:fldChar w:fldCharType="begin"/>
-      </w:r>
-      <w:r>
-        <w:instrText xml:space="preserve"> SEQ Фигура \* ARABIC </w:instrText>
-      </w:r>
-      <w:r>
-        <w:fldChar w:fldCharType="separate"/>
-      </w:r>
-      <w:r>
-        <w:rPr>
-          <w:noProof/>
-        </w:rPr>
-        <w:t>9</w:t>
-      </w:r>
-      <w:r>
-        <w:fldChar w:fldCharType="end"/>
-      </w:r>
+      <w:fldSimple w:instr=" SEQ Фигура \* ARABIC ">
+        <w:r>
+          <w:rPr>
+            <w:noProof/>
+          </w:rPr>
+          <w:t>10</w:t>
+        </w:r>
+      </w:fldSimple>
       <w:r>
         <w:rPr>
           <w:lang w:val="en-US"/>
@@ -5532,6 +5964,7 @@
         <w:t xml:space="preserve">    return new </w:t>
       </w:r>
       <w:proofErr w:type="spellStart"/>
+      <w:proofErr w:type="gramStart"/>
       <w:r>
         <w:t>HexEncodingTextEncryptor</w:t>
       </w:r>
@@ -5547,7 +5980,11 @@
         <w:t>standard</w:t>
       </w:r>
       <w:r>
-        <w:t>(password, salt));</w:t>
+        <w:t>(</w:t>
+      </w:r>
+      <w:proofErr w:type="gramEnd"/>
+      <w:r>
+        <w:t>password, salt));</w:t>
       </w:r>
       <w:r>
         <w:br/>
@@ -5562,29 +5999,24 @@
       <w:r>
         <w:t xml:space="preserve">Фигура </w:t>
       </w:r>
-      <w:r>
-        <w:fldChar w:fldCharType="begin"/>
-      </w:r>
-      <w:r>
-        <w:instrText xml:space="preserve"> SEQ Фигура \* ARABIC </w:instrText>
-      </w:r>
-      <w:r>
-        <w:fldChar w:fldCharType="separate"/>
-      </w:r>
-      <w:r>
-        <w:rPr>
-          <w:noProof/>
-        </w:rPr>
-        <w:t>10</w:t>
-      </w:r>
-      <w:r>
-        <w:fldChar w:fldCharType="end"/>
-      </w:r>
+      <w:fldSimple w:instr=" SEQ Фигура \* ARABIC ">
+        <w:r>
+          <w:rPr>
+            <w:noProof/>
+          </w:rPr>
+          <w:t>11</w:t>
+        </w:r>
+      </w:fldSimple>
       <w:r>
         <w:t>: Метод от класа, която се използва в демото</w:t>
       </w:r>
     </w:p>
     <w:p>
+      <w:pPr>
+        <w:rPr>
+          <w:lang w:val="en-US"/>
+        </w:rPr>
+      </w:pPr>
       <w:r>
         <w:tab/>
         <w:t xml:space="preserve">Използва </w:t>
@@ -5616,6 +6048,54 @@
       <w:r>
         <w:t>низ.</w:t>
       </w:r>
+      <w:r>
+        <w:rPr>
+          <w:lang w:val="en-US"/>
+        </w:rPr>
+        <w:t xml:space="preserve"> </w:t>
+      </w:r>
+      <w:sdt>
+        <w:sdtPr>
+          <w:rPr>
+            <w:lang w:val="en-US"/>
+          </w:rPr>
+          <w:id w:val="667292928"/>
+          <w:citation/>
+        </w:sdtPr>
+        <w:sdtContent>
+          <w:r>
+            <w:rPr>
+              <w:lang w:val="en-US"/>
+            </w:rPr>
+            <w:fldChar w:fldCharType="begin"/>
+          </w:r>
+          <w:r>
+            <w:rPr>
+              <w:lang w:val="en-US"/>
+            </w:rPr>
+            <w:instrText xml:space="preserve"> CITATION Spr \l 1033 </w:instrText>
+          </w:r>
+          <w:r>
+            <w:rPr>
+              <w:lang w:val="en-US"/>
+            </w:rPr>
+            <w:fldChar w:fldCharType="separate"/>
+          </w:r>
+          <w:r>
+            <w:rPr>
+              <w:noProof/>
+              <w:lang w:val="en-US"/>
+            </w:rPr>
+            <w:t>[10]</w:t>
+          </w:r>
+          <w:r>
+            <w:rPr>
+              <w:lang w:val="en-US"/>
+            </w:rPr>
+            <w:fldChar w:fldCharType="end"/>
+          </w:r>
+        </w:sdtContent>
+      </w:sdt>
     </w:p>
     <w:p>
       <w:pPr>
@@ -6357,7 +6837,7 @@
           <w:lang w:val="en-US"/>
         </w:rPr>
       </w:pPr>
-      <w:bookmarkStart w:id="17" w:name="_Toc223385514"/>
+      <w:bookmarkStart w:id="18" w:name="_Toc223468474"/>
       <w:r>
         <w:lastRenderedPageBreak/>
         <w:t xml:space="preserve">Демонстрация на </w:t>
@@ -6368,17 +6848,17 @@
         </w:rPr>
         <w:t>Ransomware</w:t>
       </w:r>
-      <w:bookmarkEnd w:id="17"/>
+      <w:bookmarkEnd w:id="18"/>
     </w:p>
     <w:p>
       <w:pPr>
         <w:pStyle w:val="Heading3"/>
       </w:pPr>
-      <w:bookmarkStart w:id="18" w:name="_Toc223385515"/>
+      <w:bookmarkStart w:id="19" w:name="_Toc223468475"/>
       <w:r>
         <w:t>Съдържание на текстовите файлове преди криптирането:</w:t>
       </w:r>
-      <w:bookmarkEnd w:id="18"/>
+      <w:bookmarkEnd w:id="19"/>
     </w:p>
     <w:p>
       <w:pPr>
@@ -6400,24 +6880,14 @@
       <w:r>
         <w:t xml:space="preserve">Фигура </w:t>
       </w:r>
-      <w:r>
-        <w:fldChar w:fldCharType="begin"/>
-      </w:r>
-      <w:r>
-        <w:instrText xml:space="preserve"> SEQ Фигура \* ARABIC </w:instrText>
-      </w:r>
-      <w:r>
-        <w:fldChar w:fldCharType="separate"/>
-      </w:r>
-      <w:r>
-        <w:rPr>
-          <w:noProof/>
-        </w:rPr>
-        <w:t>11</w:t>
-      </w:r>
-      <w:r>
-        <w:fldChar w:fldCharType="end"/>
-      </w:r>
+      <w:fldSimple w:instr=" SEQ Фигура \* ARABIC ">
+        <w:r>
+          <w:rPr>
+            <w:noProof/>
+          </w:rPr>
+          <w:t>12</w:t>
+        </w:r>
+      </w:fldSimple>
       <w:r>
         <w:t xml:space="preserve">: </w:t>
       </w:r>
@@ -6448,24 +6918,14 @@
       <w:r>
         <w:t xml:space="preserve">Фигура </w:t>
       </w:r>
-      <w:r>
-        <w:fldChar w:fldCharType="begin"/>
-      </w:r>
-      <w:r>
-        <w:instrText xml:space="preserve"> SEQ Фигура \* ARABIC </w:instrText>
-      </w:r>
-      <w:r>
-        <w:fldChar w:fldCharType="separate"/>
-      </w:r>
-      <w:r>
-        <w:rPr>
-          <w:noProof/>
-        </w:rPr>
-        <w:t>12</w:t>
-      </w:r>
-      <w:r>
-        <w:fldChar w:fldCharType="end"/>
-      </w:r>
+      <w:fldSimple w:instr=" SEQ Фигура \* ARABIC ">
+        <w:r>
+          <w:rPr>
+            <w:noProof/>
+          </w:rPr>
+          <w:t>13</w:t>
+        </w:r>
+      </w:fldSimple>
       <w:r>
         <w:rPr>
           <w:lang w:val="en-US"/>
@@ -6490,24 +6950,14 @@
       <w:r>
         <w:t xml:space="preserve">Фигура </w:t>
       </w:r>
-      <w:r>
-        <w:fldChar w:fldCharType="begin"/>
-      </w:r>
-      <w:r>
-        <w:instrText xml:space="preserve"> SEQ Фигура \* ARABIC </w:instrText>
-      </w:r>
-      <w:r>
-        <w:fldChar w:fldCharType="separate"/>
-      </w:r>
-      <w:r>
-        <w:rPr>
-          <w:noProof/>
-        </w:rPr>
-        <w:t>13</w:t>
-      </w:r>
-      <w:r>
-        <w:fldChar w:fldCharType="end"/>
-      </w:r>
+      <w:fldSimple w:instr=" SEQ Фигура \* ARABIC ">
+        <w:r>
+          <w:rPr>
+            <w:noProof/>
+          </w:rPr>
+          <w:t>14</w:t>
+        </w:r>
+      </w:fldSimple>
       <w:r>
         <w:rPr>
           <w:lang w:val="en-US"/>
@@ -6531,11 +6981,11 @@
       <w:pPr>
         <w:pStyle w:val="Heading3"/>
       </w:pPr>
-      <w:bookmarkStart w:id="19" w:name="_Toc223385516"/>
+      <w:bookmarkStart w:id="20" w:name="_Toc223468476"/>
       <w:r>
         <w:t>Стартиране на демото:</w:t>
       </w:r>
-      <w:bookmarkEnd w:id="19"/>
+      <w:bookmarkEnd w:id="20"/>
     </w:p>
     <w:p>
       <w:pPr>
@@ -6589,24 +7039,14 @@
       <w:r>
         <w:t xml:space="preserve">Фигура </w:t>
       </w:r>
-      <w:r>
-        <w:fldChar w:fldCharType="begin"/>
-      </w:r>
-      <w:r>
-        <w:instrText xml:space="preserve"> SEQ Фигура \* ARABIC </w:instrText>
-      </w:r>
-      <w:r>
-        <w:fldChar w:fldCharType="separate"/>
-      </w:r>
-      <w:r>
-        <w:rPr>
-          <w:noProof/>
-        </w:rPr>
-        <w:t>14</w:t>
-      </w:r>
-      <w:r>
-        <w:fldChar w:fldCharType="end"/>
-      </w:r>
+      <w:fldSimple w:instr=" SEQ Фигура \* ARABIC ">
+        <w:r>
+          <w:rPr>
+            <w:noProof/>
+          </w:rPr>
+          <w:t>15</w:t>
+        </w:r>
+      </w:fldSimple>
       <w:r>
         <w:t>: Какво се визуализира първо на потребителя</w:t>
       </w:r>
@@ -6727,24 +7167,14 @@
       <w:r>
         <w:t xml:space="preserve">Фигура </w:t>
       </w:r>
-      <w:r>
-        <w:fldChar w:fldCharType="begin"/>
-      </w:r>
-      <w:r>
-        <w:instrText xml:space="preserve"> SEQ Фигура \* ARABIC </w:instrText>
-      </w:r>
-      <w:r>
-        <w:fldChar w:fldCharType="separate"/>
-      </w:r>
-      <w:r>
-        <w:rPr>
-          <w:noProof/>
-        </w:rPr>
-        <w:t>15</w:t>
-      </w:r>
-      <w:r>
-        <w:fldChar w:fldCharType="end"/>
-      </w:r>
+      <w:fldSimple w:instr=" SEQ Фигура \* ARABIC ">
+        <w:r>
+          <w:rPr>
+            <w:noProof/>
+          </w:rPr>
+          <w:t>16</w:t>
+        </w:r>
+      </w:fldSimple>
       <w:r>
         <w:t>: Симулация на атаката. Файловете са криптирани. Потребителят трябва да потвърди, че е заплатил.</w:t>
       </w:r>
@@ -6769,24 +7199,14 @@
       <w:r>
         <w:t xml:space="preserve">Фигура </w:t>
       </w:r>
-      <w:r>
-        <w:fldChar w:fldCharType="begin"/>
-      </w:r>
-      <w:r>
-        <w:instrText xml:space="preserve"> SEQ Фигура \* ARABIC </w:instrText>
-      </w:r>
-      <w:r>
-        <w:fldChar w:fldCharType="separate"/>
-      </w:r>
-      <w:r>
-        <w:rPr>
-          <w:noProof/>
-        </w:rPr>
-        <w:t>16</w:t>
-      </w:r>
-      <w:r>
-        <w:fldChar w:fldCharType="end"/>
-      </w:r>
+      <w:fldSimple w:instr=" SEQ Фигура \* ARABIC ">
+        <w:r>
+          <w:rPr>
+            <w:noProof/>
+          </w:rPr>
+          <w:t>17</w:t>
+        </w:r>
+      </w:fldSimple>
       <w:r>
         <w:t xml:space="preserve">: </w:t>
       </w:r>
@@ -6820,24 +7240,14 @@
       <w:r>
         <w:t xml:space="preserve">Фигура </w:t>
       </w:r>
-      <w:r>
-        <w:fldChar w:fldCharType="begin"/>
-      </w:r>
-      <w:r>
-        <w:instrText xml:space="preserve"> SEQ Фигура \* ARABIC </w:instrText>
-      </w:r>
-      <w:r>
-        <w:fldChar w:fldCharType="separate"/>
-      </w:r>
-      <w:r>
-        <w:rPr>
-          <w:noProof/>
-        </w:rPr>
-        <w:t>17</w:t>
-      </w:r>
-      <w:r>
-        <w:fldChar w:fldCharType="end"/>
-      </w:r>
+      <w:fldSimple w:instr=" SEQ Фигура \* ARABIC ">
+        <w:r>
+          <w:rPr>
+            <w:noProof/>
+          </w:rPr>
+          <w:t>18</w:t>
+        </w:r>
+      </w:fldSimple>
       <w:r>
         <w:t xml:space="preserve">: </w:t>
       </w:r>
@@ -6868,24 +7278,14 @@
       <w:r>
         <w:t xml:space="preserve">Фигура </w:t>
       </w:r>
-      <w:r>
-        <w:fldChar w:fldCharType="begin"/>
-      </w:r>
-      <w:r>
-        <w:instrText xml:space="preserve"> SEQ Фигура \* ARABIC </w:instrText>
-      </w:r>
-      <w:r>
-        <w:fldChar w:fldCharType="separate"/>
-      </w:r>
-      <w:r>
-        <w:rPr>
-          <w:noProof/>
-        </w:rPr>
-        <w:t>18</w:t>
-      </w:r>
-      <w:r>
-        <w:fldChar w:fldCharType="end"/>
-      </w:r>
+      <w:fldSimple w:instr=" SEQ Фигура \* ARABIC ">
+        <w:r>
+          <w:rPr>
+            <w:noProof/>
+          </w:rPr>
+          <w:t>19</w:t>
+        </w:r>
+      </w:fldSimple>
       <w:r>
         <w:rPr>
           <w:lang w:val="en-US"/>
@@ -6919,12 +7319,12 @@
       <w:pPr>
         <w:pStyle w:val="Heading3"/>
       </w:pPr>
-      <w:bookmarkStart w:id="20" w:name="_Toc223385517"/>
+      <w:bookmarkStart w:id="21" w:name="_Toc223468477"/>
       <w:r>
         <w:lastRenderedPageBreak/>
         <w:t>Жертвата е заплатила откупа:</w:t>
       </w:r>
-      <w:bookmarkEnd w:id="20"/>
+      <w:bookmarkEnd w:id="21"/>
     </w:p>
     <w:p>
       <w:pPr>
@@ -7024,24 +7424,14 @@
       <w:r>
         <w:t xml:space="preserve">Фигура </w:t>
       </w:r>
-      <w:r>
-        <w:fldChar w:fldCharType="begin"/>
-      </w:r>
-      <w:r>
-        <w:instrText xml:space="preserve"> SEQ Фигура \* ARABIC </w:instrText>
-      </w:r>
-      <w:r>
-        <w:fldChar w:fldCharType="separate"/>
-      </w:r>
-      <w:r>
-        <w:rPr>
-          <w:noProof/>
-        </w:rPr>
-        <w:t>19</w:t>
-      </w:r>
-      <w:r>
-        <w:fldChar w:fldCharType="end"/>
-      </w:r>
+      <w:fldSimple w:instr=" SEQ Фигура \* ARABIC ">
+        <w:r>
+          <w:rPr>
+            <w:noProof/>
+          </w:rPr>
+          <w:t>20</w:t>
+        </w:r>
+      </w:fldSimple>
       <w:r>
         <w:t>: Файловете са възстановени</w:t>
       </w:r>
@@ -7071,24 +7461,14 @@
       <w:r>
         <w:t xml:space="preserve">Фигура </w:t>
       </w:r>
-      <w:r>
-        <w:fldChar w:fldCharType="begin"/>
-      </w:r>
-      <w:r>
-        <w:instrText xml:space="preserve"> SEQ Фигура \* ARABIC </w:instrText>
-      </w:r>
-      <w:r>
-        <w:fldChar w:fldCharType="separate"/>
-      </w:r>
-      <w:r>
-        <w:rPr>
-          <w:noProof/>
-        </w:rPr>
-        <w:t>20</w:t>
-      </w:r>
-      <w:r>
-        <w:fldChar w:fldCharType="end"/>
-      </w:r>
+      <w:fldSimple w:instr=" SEQ Фигура \* ARABIC ">
+        <w:r>
+          <w:rPr>
+            <w:noProof/>
+          </w:rPr>
+          <w:t>21</w:t>
+        </w:r>
+      </w:fldSimple>
       <w:r>
         <w:t>:</w:t>
       </w:r>
@@ -7121,24 +7501,14 @@
       <w:r>
         <w:t xml:space="preserve">Фигура </w:t>
       </w:r>
-      <w:r>
-        <w:fldChar w:fldCharType="begin"/>
-      </w:r>
-      <w:r>
-        <w:instrText xml:space="preserve"> SEQ Фигура \* ARABIC </w:instrText>
-      </w:r>
-      <w:r>
-        <w:fldChar w:fldCharType="separate"/>
-      </w:r>
-      <w:r>
-        <w:rPr>
-          <w:noProof/>
-        </w:rPr>
-        <w:t>21</w:t>
-      </w:r>
-      <w:r>
-        <w:fldChar w:fldCharType="end"/>
-      </w:r>
+      <w:fldSimple w:instr=" SEQ Фигура \* ARABIC ">
+        <w:r>
+          <w:rPr>
+            <w:noProof/>
+          </w:rPr>
+          <w:t>22</w:t>
+        </w:r>
+      </w:fldSimple>
       <w:r>
         <w:t xml:space="preserve">: </w:t>
       </w:r>
@@ -7168,24 +7538,14 @@
       <w:r>
         <w:t xml:space="preserve">Фигура </w:t>
       </w:r>
-      <w:r>
-        <w:fldChar w:fldCharType="begin"/>
-      </w:r>
-      <w:r>
-        <w:instrText xml:space="preserve"> SEQ Фигура \* ARABIC </w:instrText>
-      </w:r>
-      <w:r>
-        <w:fldChar w:fldCharType="separate"/>
-      </w:r>
-      <w:r>
-        <w:rPr>
-          <w:noProof/>
-        </w:rPr>
-        <w:t>22</w:t>
-      </w:r>
-      <w:r>
-        <w:fldChar w:fldCharType="end"/>
-      </w:r>
+      <w:fldSimple w:instr=" SEQ Фигура \* ARABIC ">
+        <w:r>
+          <w:rPr>
+            <w:noProof/>
+          </w:rPr>
+          <w:t>23</w:t>
+        </w:r>
+      </w:fldSimple>
       <w:r>
         <w:rPr>
           <w:lang w:val="en-US"/>
@@ -7215,7 +7575,7 @@
       <w:pPr>
         <w:pStyle w:val="Heading3"/>
       </w:pPr>
-      <w:bookmarkStart w:id="21" w:name="_Toc223385518"/>
+      <w:bookmarkStart w:id="22" w:name="_Toc223468478"/>
       <w:r>
         <w:rPr>
           <w:lang w:val="en-US"/>
@@ -7226,7 +7586,7 @@
       <w:r>
         <w:t xml:space="preserve"> към имплементацията:</w:t>
       </w:r>
-      <w:bookmarkEnd w:id="21"/>
+      <w:bookmarkEnd w:id="22"/>
     </w:p>
     <w:p>
       <w:pPr>
@@ -7254,7 +7614,7 @@
                     </pic:cNvPicPr>
                   </pic:nvPicPr>
                   <pic:blipFill>
-                    <a:blip r:embed="rId22">
+                    <a:blip r:embed="rId23">
                       <a:extLst>
                         <a:ext uri="{28A0092B-C50C-407E-A947-70E740481C1C}">
                           <a14:useLocalDpi xmlns:a14="http://schemas.microsoft.com/office/drawing/2010/main" val="0"/>
@@ -7299,7 +7659,7 @@
           <w:lang w:val="en-US"/>
         </w:rPr>
       </w:pPr>
-      <w:bookmarkStart w:id="22" w:name="_Toc223385519"/>
+      <w:bookmarkStart w:id="23" w:name="_Toc223468479"/>
       <w:r>
         <w:lastRenderedPageBreak/>
         <w:t xml:space="preserve">Стратегии и защита от </w:t>
@@ -7310,7 +7670,7 @@
         </w:rPr>
         <w:t>ransomware</w:t>
       </w:r>
-      <w:bookmarkEnd w:id="22"/>
+      <w:bookmarkEnd w:id="23"/>
     </w:p>
     <w:p>
       <w:pPr>
@@ -7361,7 +7721,7 @@
           <w:numId w:val="6"/>
         </w:numPr>
       </w:pPr>
-      <w:bookmarkStart w:id="23" w:name="_Toc223385520"/>
+      <w:bookmarkStart w:id="24" w:name="_Toc223468480"/>
       <w:r>
         <w:t xml:space="preserve">Подготовка за </w:t>
       </w:r>
@@ -7374,7 +7734,7 @@
       <w:r>
         <w:t xml:space="preserve"> инциденти</w:t>
       </w:r>
-      <w:bookmarkEnd w:id="23"/>
+      <w:bookmarkEnd w:id="24"/>
     </w:p>
     <w:p>
       <w:pPr>
@@ -7575,7 +7935,7 @@
           <w:lang w:val="en-US"/>
         </w:rPr>
       </w:pPr>
-      <w:bookmarkStart w:id="24" w:name="_Toc223385521"/>
+      <w:bookmarkStart w:id="25" w:name="_Toc223468481"/>
       <w:r>
         <w:lastRenderedPageBreak/>
         <w:t xml:space="preserve">Превенция </w:t>
@@ -7595,7 +7955,7 @@
       <w:r>
         <w:t>уязвимости</w:t>
       </w:r>
-      <w:bookmarkEnd w:id="24"/>
+      <w:bookmarkEnd w:id="25"/>
     </w:p>
     <w:p>
       <w:pPr>
@@ -7898,7 +8258,7 @@
                     <pic:cNvPicPr/>
                   </pic:nvPicPr>
                   <pic:blipFill>
-                    <a:blip r:embed="rId23"/>
+                    <a:blip r:embed="rId24"/>
                     <a:stretch>
                       <a:fillRect/>
                     </a:stretch>
@@ -7924,28 +8284,18 @@
         <w:pStyle w:val="Caption"/>
         <w:jc w:val="left"/>
       </w:pPr>
-      <w:bookmarkStart w:id="25" w:name="_Toc223382615"/>
+      <w:bookmarkStart w:id="26" w:name="_Toc223382615"/>
       <w:r>
         <w:t xml:space="preserve">Фигура </w:t>
       </w:r>
-      <w:r>
-        <w:fldChar w:fldCharType="begin"/>
-      </w:r>
-      <w:r>
-        <w:instrText xml:space="preserve"> SEQ Фигура \* ARABIC </w:instrText>
-      </w:r>
-      <w:r>
-        <w:fldChar w:fldCharType="separate"/>
-      </w:r>
-      <w:r>
-        <w:rPr>
-          <w:noProof/>
-        </w:rPr>
-        <w:t>23</w:t>
-      </w:r>
-      <w:r>
-        <w:fldChar w:fldCharType="end"/>
-      </w:r>
+      <w:fldSimple w:instr=" SEQ Фигура \* ARABIC ">
+        <w:r>
+          <w:rPr>
+            <w:noProof/>
+          </w:rPr>
+          <w:t>24</w:t>
+        </w:r>
+      </w:fldSimple>
       <w:r>
         <w:rPr>
           <w:lang w:val="en-US"/>
@@ -7995,65 +8345,37 @@
         <w:rPr>
           <w:lang w:val="en-US"/>
         </w:rPr>
-        <w:t xml:space="preserve"> </w:t>
+        <w:t xml:space="preserve"> на internet-facing vulnerabilities. </w:t>
       </w:r>
       <w:proofErr w:type="spellStart"/>
       <w:r>
         <w:rPr>
           <w:lang w:val="en-US"/>
         </w:rPr>
-        <w:t>на</w:t>
+        <w:t>Експлоатация</w:t>
       </w:r>
       <w:proofErr w:type="spellEnd"/>
       <w:r>
         <w:rPr>
           <w:lang w:val="en-US"/>
         </w:rPr>
-        <w:t xml:space="preserve"> internet-facing vulnerabilities. </w:t>
+        <w:t xml:space="preserve"> на </w:t>
       </w:r>
       <w:proofErr w:type="spellStart"/>
       <w:r>
         <w:rPr>
           <w:lang w:val="en-US"/>
         </w:rPr>
-        <w:t>Експлоатация</w:t>
+        <w:t>услуги</w:t>
       </w:r>
       <w:proofErr w:type="spellEnd"/>
       <w:r>
         <w:rPr>
           <w:lang w:val="en-US"/>
         </w:rPr>
-        <w:t xml:space="preserve"> </w:t>
-      </w:r>
-      <w:proofErr w:type="spellStart"/>
-      <w:r>
-        <w:rPr>
-          <w:lang w:val="en-US"/>
-        </w:rPr>
-        <w:t>на</w:t>
-      </w:r>
-      <w:proofErr w:type="spellEnd"/>
-      <w:r>
-        <w:rPr>
-          <w:lang w:val="en-US"/>
-        </w:rPr>
-        <w:t xml:space="preserve"> </w:t>
-      </w:r>
-      <w:proofErr w:type="spellStart"/>
-      <w:r>
-        <w:rPr>
-          <w:lang w:val="en-US"/>
-        </w:rPr>
-        <w:t>услуги</w:t>
-      </w:r>
-      <w:proofErr w:type="spellEnd"/>
-      <w:r>
-        <w:rPr>
-          <w:lang w:val="en-US"/>
-        </w:rPr>
         <w:t>.</w:t>
       </w:r>
-      <w:bookmarkEnd w:id="25"/>
+      <w:bookmarkEnd w:id="26"/>
     </w:p>
     <w:p>
       <w:pPr>
@@ -8081,7 +8403,7 @@
                     <pic:cNvPicPr/>
                   </pic:nvPicPr>
                   <pic:blipFill>
-                    <a:blip r:embed="rId24"/>
+                    <a:blip r:embed="rId25"/>
                     <a:stretch>
                       <a:fillRect/>
                     </a:stretch>
@@ -8107,28 +8429,18 @@
         <w:pStyle w:val="Caption"/>
         <w:jc w:val="left"/>
       </w:pPr>
-      <w:bookmarkStart w:id="26" w:name="_Toc223382616"/>
+      <w:bookmarkStart w:id="27" w:name="_Toc223382616"/>
       <w:r>
         <w:t xml:space="preserve">Фигура </w:t>
       </w:r>
-      <w:r>
-        <w:fldChar w:fldCharType="begin"/>
-      </w:r>
-      <w:r>
-        <w:instrText xml:space="preserve"> SEQ Фигура \* ARABIC </w:instrText>
-      </w:r>
-      <w:r>
-        <w:fldChar w:fldCharType="separate"/>
-      </w:r>
-      <w:r>
-        <w:rPr>
-          <w:noProof/>
-        </w:rPr>
-        <w:t>24</w:t>
-      </w:r>
-      <w:r>
-        <w:fldChar w:fldCharType="end"/>
-      </w:r>
+      <w:fldSimple w:instr=" SEQ Фигура \* ARABIC ">
+        <w:r>
+          <w:rPr>
+            <w:noProof/>
+          </w:rPr>
+          <w:t>25</w:t>
+        </w:r>
+      </w:fldSimple>
       <w:r>
         <w:t>: Д</w:t>
       </w:r>
@@ -8154,7 +8466,7 @@
       <w:r>
         <w:t>.</w:t>
       </w:r>
-      <w:bookmarkEnd w:id="26"/>
+      <w:bookmarkEnd w:id="27"/>
     </w:p>
     <w:p>
       <w:pPr>
@@ -8168,7 +8480,7 @@
           <w:szCs w:val="20"/>
         </w:rPr>
       </w:pPr>
-      <w:bookmarkStart w:id="27" w:name="_Toc223385522"/>
+      <w:bookmarkStart w:id="28" w:name="_Toc223468482"/>
       <w:r>
         <w:lastRenderedPageBreak/>
         <w:t xml:space="preserve">Компрометирани </w:t>
@@ -8176,7 +8488,7 @@
       <w:r>
         <w:t>пароли</w:t>
       </w:r>
-      <w:bookmarkEnd w:id="27"/>
+      <w:bookmarkEnd w:id="28"/>
     </w:p>
     <w:p>
       <w:pPr>
@@ -8228,15 +8540,7 @@
         <w:t xml:space="preserve">Multi factor authentication </w:t>
       </w:r>
       <w:r>
-        <w:t xml:space="preserve">заменят процеса с двете пароли към аутентикация с пръстов отпечатък, лицево разпознаване, ПИН на устройството или </w:t>
-      </w:r>
-      <w:proofErr w:type="spellStart"/>
-      <w:r>
-        <w:t>криптографичен</w:t>
-      </w:r>
-      <w:proofErr w:type="spellEnd"/>
-      <w:r>
-        <w:t xml:space="preserve"> ключ. </w:t>
+        <w:t xml:space="preserve">заменят процеса с двете пароли към аутентикация с пръстов отпечатък, лицево разпознаване, ПИН на устройството или криптографичен ключ. </w:t>
       </w:r>
     </w:p>
     <w:p>
@@ -8565,7 +8869,7 @@
                     <pic:cNvPicPr/>
                   </pic:nvPicPr>
                   <pic:blipFill>
-                    <a:blip r:embed="rId25"/>
+                    <a:blip r:embed="rId26"/>
                     <a:stretch>
                       <a:fillRect/>
                     </a:stretch>
@@ -8594,35 +8898,25 @@
           <w:szCs w:val="20"/>
         </w:rPr>
       </w:pPr>
-      <w:bookmarkStart w:id="28" w:name="_Toc223382617"/>
+      <w:bookmarkStart w:id="29" w:name="_Toc223382617"/>
       <w:r>
         <w:t xml:space="preserve">Фигура </w:t>
       </w:r>
-      <w:r>
-        <w:fldChar w:fldCharType="begin"/>
-      </w:r>
-      <w:r>
-        <w:instrText xml:space="preserve"> SEQ Фигура \* ARABIC </w:instrText>
-      </w:r>
-      <w:r>
-        <w:fldChar w:fldCharType="separate"/>
-      </w:r>
-      <w:r>
-        <w:rPr>
-          <w:noProof/>
-        </w:rPr>
-        <w:t>25</w:t>
-      </w:r>
-      <w:r>
-        <w:fldChar w:fldCharType="end"/>
-      </w:r>
+      <w:fldSimple w:instr=" SEQ Фигура \* ARABIC ">
+        <w:r>
+          <w:rPr>
+            <w:noProof/>
+          </w:rPr>
+          <w:t>26</w:t>
+        </w:r>
+      </w:fldSimple>
       <w:r>
         <w:t xml:space="preserve">: </w:t>
       </w:r>
       <w:r>
         <w:t>Диаграма защо използването на пароли по подразбиране не е препоръчително.</w:t>
       </w:r>
-      <w:bookmarkEnd w:id="28"/>
+      <w:bookmarkEnd w:id="29"/>
     </w:p>
     <w:p>
       <w:pPr>
@@ -8638,7 +8932,7 @@
       <w:r>
         <w:br w:type="page"/>
       </w:r>
-      <w:bookmarkStart w:id="29" w:name="_Toc223385523"/>
+      <w:bookmarkStart w:id="30" w:name="_Toc223468483"/>
       <w:r>
         <w:rPr>
           <w:lang w:val="en-US"/>
@@ -8649,7 +8943,7 @@
       <w:r>
         <w:t>атаки</w:t>
       </w:r>
-      <w:bookmarkEnd w:id="29"/>
+      <w:bookmarkEnd w:id="30"/>
     </w:p>
     <w:p>
       <w:pPr>
@@ -8695,7 +8989,10 @@
         <w:t xml:space="preserve">Липсва обръщение към </w:t>
       </w:r>
       <w:r>
-        <w:t xml:space="preserve">получаващия </w:t>
+        <w:t>получателя</w:t>
+      </w:r>
+      <w:r>
+        <w:t xml:space="preserve"> </w:t>
       </w:r>
       <w:r>
         <w:t>– това не винаги е приложимо, ако потребителят е таргетиран може да припознае и лична информация свързано с него.</w:t>
@@ -8829,7 +9126,7 @@
             <w:rPr>
               <w:noProof/>
             </w:rPr>
-            <w:t>[9]</w:t>
+            <w:t>[11]</w:t>
           </w:r>
           <w:r>
             <w:fldChar w:fldCharType="end"/>
@@ -8862,7 +9159,7 @@
                     <pic:cNvPicPr/>
                   </pic:nvPicPr>
                   <pic:blipFill>
-                    <a:blip r:embed="rId26"/>
+                    <a:blip r:embed="rId27"/>
                     <a:stretch>
                       <a:fillRect/>
                     </a:stretch>
@@ -8891,28 +9188,18 @@
           <w:szCs w:val="20"/>
         </w:rPr>
       </w:pPr>
-      <w:bookmarkStart w:id="30" w:name="_Toc223382618"/>
+      <w:bookmarkStart w:id="31" w:name="_Toc223382618"/>
       <w:r>
         <w:t xml:space="preserve">Фигура </w:t>
       </w:r>
-      <w:r>
-        <w:fldChar w:fldCharType="begin"/>
-      </w:r>
-      <w:r>
-        <w:instrText xml:space="preserve"> SEQ Фигура \* ARABIC </w:instrText>
-      </w:r>
-      <w:r>
-        <w:fldChar w:fldCharType="separate"/>
-      </w:r>
-      <w:r>
-        <w:rPr>
-          <w:noProof/>
-        </w:rPr>
-        <w:t>26</w:t>
-      </w:r>
-      <w:r>
-        <w:fldChar w:fldCharType="end"/>
-      </w:r>
+      <w:fldSimple w:instr=" SEQ Фигура \* ARABIC ">
+        <w:r>
+          <w:rPr>
+            <w:noProof/>
+          </w:rPr>
+          <w:t>27</w:t>
+        </w:r>
+      </w:fldSimple>
       <w:r>
         <w:t xml:space="preserve">: </w:t>
       </w:r>
@@ -8927,7 +9214,7 @@
       <w:r>
         <w:t xml:space="preserve"> фишинг имейл в Outlook.</w:t>
       </w:r>
-      <w:bookmarkEnd w:id="30"/>
+      <w:bookmarkEnd w:id="31"/>
     </w:p>
     <w:p>
       <w:pPr>
@@ -8940,7 +9227,7 @@
           <w:lang w:val="en-US"/>
         </w:rPr>
       </w:pPr>
-      <w:bookmarkStart w:id="31" w:name="_Toc223385524"/>
+      <w:bookmarkStart w:id="32" w:name="_Toc223468484"/>
       <w:r>
         <w:lastRenderedPageBreak/>
         <w:t xml:space="preserve">Други форми на </w:t>
@@ -8951,7 +9238,7 @@
         </w:rPr>
         <w:t>Social Engineering</w:t>
       </w:r>
-      <w:bookmarkEnd w:id="31"/>
+      <w:bookmarkEnd w:id="32"/>
     </w:p>
     <w:p>
       <w:pPr>
@@ -9148,7 +9435,7 @@
             <w:rPr>
               <w:noProof/>
             </w:rPr>
-            <w:t>[9]</w:t>
+            <w:t>[11]</w:t>
           </w:r>
           <w:r>
             <w:fldChar w:fldCharType="end"/>
@@ -9158,19 +9445,379 @@
     </w:p>
     <w:p>
       <w:pPr>
-        <w:ind w:firstLine="360"/>
-        <w:rPr>
-          <w:lang w:val="en-US"/>
-        </w:rPr>
-      </w:pPr>
-      <w:r>
-        <w:rPr>
-          <w:lang w:val="en-US"/>
-        </w:rPr>
+        <w:jc w:val="left"/>
+      </w:pPr>
+      <w:r>
         <w:br w:type="page"/>
       </w:r>
     </w:p>
-    <w:bookmarkStart w:id="32" w:name="_Toc223385525" w:displacedByCustomXml="next"/>
+    <w:p>
+      <w:pPr>
+        <w:pStyle w:val="Heading1"/>
+      </w:pPr>
+      <w:bookmarkStart w:id="33" w:name="_Toc223468485"/>
+      <w:r>
+        <w:lastRenderedPageBreak/>
+        <w:t>Какво да направим, ако станем жертва на</w:t>
+      </w:r>
+      <w:r>
+        <w:rPr>
+          <w:lang w:val="en-US"/>
+        </w:rPr>
+        <w:t xml:space="preserve"> ransomware</w:t>
+      </w:r>
+      <w:r>
+        <w:t xml:space="preserve"> атака</w:t>
+      </w:r>
+      <w:r>
+        <w:t>?</w:t>
+      </w:r>
+      <w:bookmarkEnd w:id="33"/>
+    </w:p>
+    <w:p>
+      <w:r>
+        <w:tab/>
+        <w:t>Най-важното е да се уведомят всички участниците в дадена мрежа. Независимо дали са част от организация или в домашна среда. В случай, че засегнатият е част от организация веднага да се вдигне ескалация на по-висока инстанция. Оттам ще се включат и съответните екипи. Много е важно да се уведомят и всички засегнати клиенти.</w:t>
+      </w:r>
+    </w:p>
+    <w:p>
+      <w:r>
+        <w:t>Ето някои стъпки, които биха били полезни при подобна атака:</w:t>
+      </w:r>
+    </w:p>
+    <w:p>
+      <w:pPr>
+        <w:pStyle w:val="ListParagraph"/>
+        <w:numPr>
+          <w:ilvl w:val="0"/>
+          <w:numId w:val="10"/>
+        </w:numPr>
+      </w:pPr>
+      <w:r>
+        <w:t xml:space="preserve">Веднага да се определят засегнатите системи  и да се изолират. Ако множество системи и/или </w:t>
+      </w:r>
+      <w:r>
+        <w:rPr>
+          <w:lang w:val="en-US"/>
+        </w:rPr>
+        <w:t xml:space="preserve">subnets </w:t>
+      </w:r>
+      <w:r>
+        <w:t>са компрометирани трябва да се изключат от мрежата. В случай, че това е невъзможно</w:t>
+      </w:r>
+      <w:r>
+        <w:t>,</w:t>
+      </w:r>
+      <w:r>
+        <w:t xml:space="preserve"> да се изключат самите машите поотделно. С приоритет са най-критично важните системи. </w:t>
+      </w:r>
+    </w:p>
+    <w:p>
+      <w:pPr>
+        <w:pStyle w:val="ListParagraph"/>
+        <w:numPr>
+          <w:ilvl w:val="0"/>
+          <w:numId w:val="10"/>
+        </w:numPr>
+      </w:pPr>
+      <w:r>
+        <w:t xml:space="preserve">Друг вариант, ако не може да се изключат от мрежата е да се извади мрежовия кабел </w:t>
+      </w:r>
+      <w:r>
+        <w:rPr>
+          <w:lang w:val="en-US"/>
+        </w:rPr>
+        <w:t>(ethernet)</w:t>
+      </w:r>
+      <w:r>
+        <w:t xml:space="preserve"> и да се изключат всички устройства свързани с </w:t>
+      </w:r>
+      <w:r>
+        <w:rPr>
+          <w:lang w:val="en-US"/>
+        </w:rPr>
+        <w:t xml:space="preserve">Wi-Fi. </w:t>
+      </w:r>
+      <w:r>
+        <w:t>Целта е да се ограничи разпространяването.</w:t>
+      </w:r>
+    </w:p>
+    <w:p>
+      <w:pPr>
+        <w:pStyle w:val="ListParagraph"/>
+        <w:numPr>
+          <w:ilvl w:val="0"/>
+          <w:numId w:val="10"/>
+        </w:numPr>
+      </w:pPr>
+      <w:r>
+        <w:t xml:space="preserve">За ресурси намиращи се в </w:t>
+      </w:r>
+      <w:r>
+        <w:rPr>
+          <w:lang w:val="en-US"/>
+        </w:rPr>
+        <w:t>cloud</w:t>
+      </w:r>
+      <w:r>
+        <w:t xml:space="preserve"> да се направят </w:t>
+      </w:r>
+      <w:r>
+        <w:rPr>
+          <w:lang w:val="en-US"/>
+        </w:rPr>
+        <w:t>snapshot-</w:t>
+      </w:r>
+      <w:r>
+        <w:t>и на дисковете. Ще бъде от полза по-късно, когато се прави криминално разследване.</w:t>
+      </w:r>
+    </w:p>
+    <w:p>
+      <w:pPr>
+        <w:pStyle w:val="ListParagraph"/>
+        <w:numPr>
+          <w:ilvl w:val="0"/>
+          <w:numId w:val="10"/>
+        </w:numPr>
+      </w:pPr>
+      <w:r>
+        <w:t>След първоначалната атака киберпрестъпниците могат да имат достъп до вътрешните комуникации и да реагират на всяко едно предприето действие. За това комуникацията трябва да се извършва извънмрежово (</w:t>
+      </w:r>
+      <w:r>
+        <w:rPr>
+          <w:lang w:val="en-US"/>
+        </w:rPr>
+        <w:t>out-of-band)</w:t>
+      </w:r>
+      <w:r>
+        <w:t>, например телефонни разговори.</w:t>
+      </w:r>
+    </w:p>
+    <w:p>
+      <w:pPr>
+        <w:pStyle w:val="ListParagraph"/>
+        <w:numPr>
+          <w:ilvl w:val="0"/>
+          <w:numId w:val="10"/>
+        </w:numPr>
+      </w:pPr>
+      <w:r>
+        <w:t xml:space="preserve">Изключване на устройствата, ако по никакъв начин не могат да се изолират. Това вероятно ще унищожи и доказателства, понеже част от доказателствата се съхраняват и в </w:t>
+      </w:r>
+      <w:r>
+        <w:rPr>
+          <w:lang w:val="en-US"/>
+        </w:rPr>
+        <w:t xml:space="preserve">RAM </w:t>
+      </w:r>
+      <w:r>
+        <w:t xml:space="preserve">паметта. Да се прилага само в крайни случаи. </w:t>
+      </w:r>
+    </w:p>
+    <w:p>
+      <w:pPr>
+        <w:pStyle w:val="ListParagraph"/>
+        <w:numPr>
+          <w:ilvl w:val="0"/>
+          <w:numId w:val="10"/>
+        </w:numPr>
+      </w:pPr>
+      <w:r>
+        <w:t>Ако има системите, които не са засегнати, да се отделят.</w:t>
+      </w:r>
+    </w:p>
+    <w:p>
+      <w:pPr>
+        <w:pStyle w:val="ListParagraph"/>
+        <w:numPr>
+          <w:ilvl w:val="0"/>
+          <w:numId w:val="10"/>
+        </w:numPr>
+      </w:pPr>
+      <w:r>
+        <w:t xml:space="preserve">Прегледайте всички възможни системни, </w:t>
+      </w:r>
+      <w:r>
+        <w:rPr>
+          <w:lang w:val="en-US"/>
+        </w:rPr>
+        <w:t>EDR, IDS, IPS</w:t>
+      </w:r>
+      <w:r>
+        <w:t xml:space="preserve"> </w:t>
+      </w:r>
+      <w:proofErr w:type="spellStart"/>
+      <w:r>
+        <w:t>логове</w:t>
+      </w:r>
+      <w:proofErr w:type="spellEnd"/>
+      <w:r>
+        <w:t>.</w:t>
+      </w:r>
+    </w:p>
+    <w:p>
+      <w:pPr>
+        <w:pStyle w:val="ListParagraph"/>
+        <w:numPr>
+          <w:ilvl w:val="0"/>
+          <w:numId w:val="10"/>
+        </w:numPr>
+      </w:pPr>
+      <w:r>
+        <w:rPr>
+          <w:lang w:val="en-US"/>
+        </w:rPr>
+        <w:t>Ransomware</w:t>
+      </w:r>
+      <w:r>
+        <w:t xml:space="preserve"> е само финалната част, трябва да се прегледат по-ранни </w:t>
+      </w:r>
+      <w:proofErr w:type="spellStart"/>
+      <w:r>
+        <w:t>компроментации</w:t>
+      </w:r>
+      <w:proofErr w:type="spellEnd"/>
+      <w:r>
+        <w:t xml:space="preserve">. Много е вероятно да има други </w:t>
+      </w:r>
+      <w:r>
+        <w:rPr>
+          <w:lang w:val="en-US"/>
+        </w:rPr>
+        <w:t>dropper</w:t>
+      </w:r>
+      <w:r>
+        <w:t xml:space="preserve"> злонамерени софтуери. Трябва да бъдат отстранени преди възстановяване на системата.</w:t>
+      </w:r>
+    </w:p>
+    <w:p>
+      <w:pPr>
+        <w:pStyle w:val="ListParagraph"/>
+        <w:numPr>
+          <w:ilvl w:val="0"/>
+          <w:numId w:val="10"/>
+        </w:numPr>
+      </w:pPr>
+      <w:r>
+        <w:t xml:space="preserve">Всякакви новосъздадени акаунти, ескалирани привилегии или много често </w:t>
+      </w:r>
+      <w:r>
+        <w:rPr>
+          <w:lang w:val="en-US"/>
+        </w:rPr>
+        <w:t>.exe</w:t>
+      </w:r>
+      <w:r>
+        <w:t xml:space="preserve"> файлове трябва да бъдат отстранени.</w:t>
+      </w:r>
+    </w:p>
+    <w:p>
+      <w:pPr>
+        <w:pStyle w:val="ListParagraph"/>
+        <w:numPr>
+          <w:ilvl w:val="0"/>
+          <w:numId w:val="10"/>
+        </w:numPr>
+      </w:pPr>
+      <w:r>
+        <w:t xml:space="preserve">Да се наблюдава изпълнението на </w:t>
+      </w:r>
+      <w:r>
+        <w:rPr>
+          <w:lang w:val="en-US"/>
+        </w:rPr>
+        <w:t>PowerShell</w:t>
+      </w:r>
+      <w:r>
+        <w:t xml:space="preserve"> команди, използването на </w:t>
+      </w:r>
+      <w:r>
+        <w:rPr>
+          <w:lang w:val="en-US"/>
+        </w:rPr>
+        <w:t>RMM</w:t>
+      </w:r>
+      <w:r>
+        <w:t xml:space="preserve"> софтуер, неочаквани комуникации по мрежата и извличане на </w:t>
+      </w:r>
+      <w:proofErr w:type="spellStart"/>
+      <w:r>
+        <w:t>креденшъли</w:t>
+      </w:r>
+      <w:proofErr w:type="spellEnd"/>
+      <w:r>
+        <w:t>.</w:t>
+      </w:r>
+    </w:p>
+    <w:p>
+      <w:pPr>
+        <w:pStyle w:val="ListParagraph"/>
+        <w:numPr>
+          <w:ilvl w:val="0"/>
+          <w:numId w:val="10"/>
+        </w:numPr>
+      </w:pPr>
+      <w:r>
+        <w:t>Ако има неочаквано голям изходящ трафик, най-вероятно се извличат незаконно данни.</w:t>
+      </w:r>
+    </w:p>
+    <w:p>
+      <w:pPr>
+        <w:pStyle w:val="ListParagraph"/>
+        <w:numPr>
+          <w:ilvl w:val="0"/>
+          <w:numId w:val="10"/>
+        </w:numPr>
+      </w:pPr>
+      <w:r>
+        <w:t xml:space="preserve">За облачна инфраструктура да се провери дали на </w:t>
+      </w:r>
+      <w:r>
+        <w:rPr>
+          <w:lang w:val="en-US"/>
+        </w:rPr>
+        <w:t>firewall</w:t>
+      </w:r>
+      <w:r>
+        <w:t>-а не е зададено правило 0.0.0.0/0, което дава достъп на всеки от интернет да влезне.</w:t>
+      </w:r>
+      <w:r>
+        <w:t xml:space="preserve"> </w:t>
+      </w:r>
+      <w:sdt>
+        <w:sdtPr>
+          <w:id w:val="-2139088710"/>
+          <w:citation/>
+        </w:sdtPr>
+        <w:sdtContent>
+          <w:r>
+            <w:fldChar w:fldCharType="begin"/>
+          </w:r>
+          <w:r>
+            <w:instrText xml:space="preserve"> CITATION Sto \l 1026 </w:instrText>
+          </w:r>
+          <w:r>
+            <w:fldChar w:fldCharType="separate"/>
+          </w:r>
+          <w:r>
+            <w:rPr>
+              <w:noProof/>
+            </w:rPr>
+            <w:t>[1]</w:t>
+          </w:r>
+          <w:r>
+            <w:fldChar w:fldCharType="end"/>
+          </w:r>
+        </w:sdtContent>
+      </w:sdt>
+      <w:r>
+        <w:rPr>
+          <w:lang w:val="en-US"/>
+        </w:rPr>
+        <w:br w:type="page"/>
+      </w:r>
+    </w:p>
+    <w:bookmarkStart w:id="34" w:name="_Toc223468486" w:displacedByCustomXml="next"/>
     <w:sdt>
       <w:sdtPr>
         <w:rPr>
@@ -9198,7 +9845,7 @@
           <w:r>
             <w:t>Цитирани източници</w:t>
           </w:r>
-          <w:bookmarkEnd w:id="32"/>
+          <w:bookmarkEnd w:id="34"/>
         </w:p>
         <w:p>
           <w:pPr>
@@ -9235,7 +9882,7 @@
           </w:tblGrid>
           <w:tr>
             <w:trPr>
-              <w:divId w:val="1033652386"/>
+              <w:divId w:val="724986744"/>
               <w:tblCellSpacing w:w="15" w:type="dxa"/>
             </w:trPr>
             <w:tc>
@@ -9283,7 +9930,7 @@
           </w:tr>
           <w:tr>
             <w:trPr>
-              <w:divId w:val="1033652386"/>
+              <w:divId w:val="724986744"/>
               <w:tblCellSpacing w:w="15" w:type="dxa"/>
             </w:trPr>
             <w:tc>
@@ -9329,7 +9976,7 @@
           </w:tr>
           <w:tr>
             <w:trPr>
-              <w:divId w:val="1033652386"/>
+              <w:divId w:val="724986744"/>
               <w:tblCellSpacing w:w="15" w:type="dxa"/>
             </w:trPr>
             <w:tc>
@@ -9375,7 +10022,7 @@
           </w:tr>
           <w:tr>
             <w:trPr>
-              <w:divId w:val="1033652386"/>
+              <w:divId w:val="724986744"/>
               <w:tblCellSpacing w:w="15" w:type="dxa"/>
             </w:trPr>
             <w:tc>
@@ -9421,7 +10068,7 @@
           </w:tr>
           <w:tr>
             <w:trPr>
-              <w:divId w:val="1033652386"/>
+              <w:divId w:val="724986744"/>
               <w:tblCellSpacing w:w="15" w:type="dxa"/>
             </w:trPr>
             <w:tc>
@@ -9467,7 +10114,7 @@
           </w:tr>
           <w:tr>
             <w:trPr>
-              <w:divId w:val="1033652386"/>
+              <w:divId w:val="724986744"/>
               <w:tblCellSpacing w:w="15" w:type="dxa"/>
             </w:trPr>
             <w:tc>
@@ -9513,7 +10160,7 @@
           </w:tr>
           <w:tr>
             <w:trPr>
-              <w:divId w:val="1033652386"/>
+              <w:divId w:val="724986744"/>
               <w:tblCellSpacing w:w="15" w:type="dxa"/>
             </w:trPr>
             <w:tc>
@@ -9559,7 +10206,7 @@
           </w:tr>
           <w:tr>
             <w:trPr>
-              <w:divId w:val="1033652386"/>
+              <w:divId w:val="724986744"/>
               <w:tblCellSpacing w:w="15" w:type="dxa"/>
             </w:trPr>
             <w:tc>
@@ -9605,7 +10252,7 @@
           </w:tr>
           <w:tr>
             <w:trPr>
-              <w:divId w:val="1033652386"/>
+              <w:divId w:val="724986744"/>
               <w:tblCellSpacing w:w="15" w:type="dxa"/>
             </w:trPr>
             <w:tc>
@@ -9644,14 +10291,14 @@
                   <w:rPr>
                     <w:noProof/>
                   </w:rPr>
-                  <w:t>C. M. University, „Social Engineering,“ [Онлайн]. Available: https://www.cmu.edu/iso/aware/dont-take-the-bait/social-engineering.html.</w:t>
+                  <w:t>B. Robb, „AI and Ransomware Prevention: How Smart Tech can Outsmart Cybercriminals,“ BlackFog, 24 06 2025. [Онлайн]. Available: https://www.blackfog.com/ai-and-ransomware-prevention-how-smart-tech-can-outsmart-cybercriminals.</w:t>
                 </w:r>
               </w:p>
             </w:tc>
           </w:tr>
           <w:tr>
             <w:trPr>
-              <w:divId w:val="1033652386"/>
+              <w:divId w:val="724986744"/>
               <w:tblCellSpacing w:w="15" w:type="dxa"/>
             </w:trPr>
             <w:tc>
@@ -9690,14 +10337,14 @@
                   <w:rPr>
                     <w:noProof/>
                   </w:rPr>
-                  <w:t>„Botnet,“ Eset, [Онлайн]. Available: https://help.eset.com/glossary/bg-BG/botnet.html.</w:t>
+                  <w:t>„Spring Security Crypto Module,“ Spring, [Онлайн]. Available: https://docs.spring.io/spring-security/reference/features/integrations/cryptography.html.</w:t>
                 </w:r>
               </w:p>
             </w:tc>
           </w:tr>
           <w:tr>
             <w:trPr>
-              <w:divId w:val="1033652386"/>
+              <w:divId w:val="724986744"/>
               <w:tblCellSpacing w:w="15" w:type="dxa"/>
             </w:trPr>
             <w:tc>
@@ -9736,7 +10383,7 @@
                   <w:rPr>
                     <w:noProof/>
                   </w:rPr>
-                  <w:t>„CC Server,“ Eset, [Онлайн]. Available: https://help.eset.com/glossary/bg-BG/cc_server.html.</w:t>
+                  <w:t>C. M. University, „Social Engineering,“ [Онлайн]. Available: https://www.cmu.edu/iso/aware/dont-take-the-bait/social-engineering.html.</w:t>
                 </w:r>
               </w:p>
             </w:tc>
@@ -9744,7 +10391,7 @@
         </w:tbl>
         <w:p>
           <w:pPr>
-            <w:divId w:val="1033652386"/>
+            <w:divId w:val="724986744"/>
             <w:rPr>
               <w:rFonts w:eastAsia="Times New Roman"/>
               <w:noProof/>
@@ -10280,6 +10927,119 @@
     </w:lvl>
   </w:abstractNum>
   <w:abstractNum w:abstractNumId="3" w15:restartNumberingAfterBreak="0">
+    <w:nsid w:val="24A04B5A"/>
+    <w:multiLevelType w:val="hybridMultilevel"/>
+    <w:tmpl w:val="EBBC4616"/>
+    <w:lvl w:ilvl="0" w:tplc="04020001">
+      <w:start w:val="1"/>
+      <w:numFmt w:val="bullet"/>
+      <w:lvlText w:val=""/>
+      <w:lvlJc w:val="left"/>
+      <w:pPr>
+        <w:ind w:left="720" w:hanging="360"/>
+      </w:pPr>
+      <w:rPr>
+        <w:rFonts w:ascii="Symbol" w:hAnsi="Symbol" w:hint="default"/>
+      </w:rPr>
+    </w:lvl>
+    <w:lvl w:ilvl="1" w:tplc="04020003" w:tentative="1">
+      <w:start w:val="1"/>
+      <w:numFmt w:val="bullet"/>
+      <w:lvlText w:val="o"/>
+      <w:lvlJc w:val="left"/>
+      <w:pPr>
+        <w:ind w:left="1440" w:hanging="360"/>
+      </w:pPr>
+      <w:rPr>
+        <w:rFonts w:ascii="Courier New" w:hAnsi="Courier New" w:cs="Courier New" w:hint="default"/>
+      </w:rPr>
+    </w:lvl>
+    <w:lvl w:ilvl="2" w:tplc="04020005" w:tentative="1">
+      <w:start w:val="1"/>
+      <w:numFmt w:val="bullet"/>
+      <w:lvlText w:val=""/>
+      <w:lvlJc w:val="left"/>
+      <w:pPr>
+        <w:ind w:left="2160" w:hanging="360"/>
+      </w:pPr>
+      <w:rPr>
+        <w:rFonts w:ascii="Wingdings" w:hAnsi="Wingdings" w:hint="default"/>
+      </w:rPr>
+    </w:lvl>
+    <w:lvl w:ilvl="3" w:tplc="04020001" w:tentative="1">
+      <w:start w:val="1"/>
+      <w:numFmt w:val="bullet"/>
+      <w:lvlText w:val=""/>
+      <w:lvlJc w:val="left"/>
+      <w:pPr>
+        <w:ind w:left="2880" w:hanging="360"/>
+      </w:pPr>
+      <w:rPr>
+        <w:rFonts w:ascii="Symbol" w:hAnsi="Symbol" w:hint="default"/>
+      </w:rPr>
+    </w:lvl>
+    <w:lvl w:ilvl="4" w:tplc="04020003" w:tentative="1">
+      <w:start w:val="1"/>
+      <w:numFmt w:val="bullet"/>
+      <w:lvlText w:val="o"/>
+      <w:lvlJc w:val="left"/>
+      <w:pPr>
+        <w:ind w:left="3600" w:hanging="360"/>
+      </w:pPr>
+      <w:rPr>
+        <w:rFonts w:ascii="Courier New" w:hAnsi="Courier New" w:cs="Courier New" w:hint="default"/>
+      </w:rPr>
+    </w:lvl>
+    <w:lvl w:ilvl="5" w:tplc="04020005" w:tentative="1">
+      <w:start w:val="1"/>
+      <w:numFmt w:val="bullet"/>
+      <w:lvlText w:val=""/>
+      <w:lvlJc w:val="left"/>
+      <w:pPr>
+        <w:ind w:left="4320" w:hanging="360"/>
+      </w:pPr>
+      <w:rPr>
+        <w:rFonts w:ascii="Wingdings" w:hAnsi="Wingdings" w:hint="default"/>
+      </w:rPr>
+    </w:lvl>
+    <w:lvl w:ilvl="6" w:tplc="04020001" w:tentative="1">
+      <w:start w:val="1"/>
+      <w:numFmt w:val="bullet"/>
+      <w:lvlText w:val=""/>
+      <w:lvlJc w:val="left"/>
+      <w:pPr>
+        <w:ind w:left="5040" w:hanging="360"/>
+      </w:pPr>
+      <w:rPr>
+        <w:rFonts w:ascii="Symbol" w:hAnsi="Symbol" w:hint="default"/>
+      </w:rPr>
+    </w:lvl>
+    <w:lvl w:ilvl="7" w:tplc="04020003" w:tentative="1">
+      <w:start w:val="1"/>
+      <w:numFmt w:val="bullet"/>
+      <w:lvlText w:val="o"/>
+      <w:lvlJc w:val="left"/>
+      <w:pPr>
+        <w:ind w:left="5760" w:hanging="360"/>
+      </w:pPr>
+      <w:rPr>
+        <w:rFonts w:ascii="Courier New" w:hAnsi="Courier New" w:cs="Courier New" w:hint="default"/>
+      </w:rPr>
+    </w:lvl>
+    <w:lvl w:ilvl="8" w:tplc="04020005" w:tentative="1">
+      <w:start w:val="1"/>
+      <w:numFmt w:val="bullet"/>
+      <w:lvlText w:val=""/>
+      <w:lvlJc w:val="left"/>
+      <w:pPr>
+        <w:ind w:left="6480" w:hanging="360"/>
+      </w:pPr>
+      <w:rPr>
+        <w:rFonts w:ascii="Wingdings" w:hAnsi="Wingdings" w:hint="default"/>
+      </w:rPr>
+    </w:lvl>
+  </w:abstractNum>
+  <w:abstractNum w:abstractNumId="4" w15:restartNumberingAfterBreak="0">
     <w:nsid w:val="48716B86"/>
     <w:multiLevelType w:val="hybridMultilevel"/>
     <w:tmpl w:val="84CC0C2A"/>
@@ -10392,7 +11152,7 @@
       </w:rPr>
     </w:lvl>
   </w:abstractNum>
-  <w:abstractNum w:abstractNumId="4" w15:restartNumberingAfterBreak="0">
+  <w:abstractNum w:abstractNumId="5" w15:restartNumberingAfterBreak="0">
     <w:nsid w:val="5751104B"/>
     <w:multiLevelType w:val="hybridMultilevel"/>
     <w:tmpl w:val="865AD2D2"/>
@@ -10481,7 +11241,120 @@
       </w:pPr>
     </w:lvl>
   </w:abstractNum>
-  <w:abstractNum w:abstractNumId="5" w15:restartNumberingAfterBreak="0">
+  <w:abstractNum w:abstractNumId="6" w15:restartNumberingAfterBreak="0">
+    <w:nsid w:val="64210C10"/>
+    <w:multiLevelType w:val="hybridMultilevel"/>
+    <w:tmpl w:val="FFD65806"/>
+    <w:lvl w:ilvl="0" w:tplc="04020001">
+      <w:start w:val="1"/>
+      <w:numFmt w:val="bullet"/>
+      <w:lvlText w:val=""/>
+      <w:lvlJc w:val="left"/>
+      <w:pPr>
+        <w:ind w:left="720" w:hanging="360"/>
+      </w:pPr>
+      <w:rPr>
+        <w:rFonts w:ascii="Symbol" w:hAnsi="Symbol" w:hint="default"/>
+      </w:rPr>
+    </w:lvl>
+    <w:lvl w:ilvl="1" w:tplc="04020003" w:tentative="1">
+      <w:start w:val="1"/>
+      <w:numFmt w:val="bullet"/>
+      <w:lvlText w:val="o"/>
+      <w:lvlJc w:val="left"/>
+      <w:pPr>
+        <w:ind w:left="1440" w:hanging="360"/>
+      </w:pPr>
+      <w:rPr>
+        <w:rFonts w:ascii="Courier New" w:hAnsi="Courier New" w:cs="Courier New" w:hint="default"/>
+      </w:rPr>
+    </w:lvl>
+    <w:lvl w:ilvl="2" w:tplc="04020005" w:tentative="1">
+      <w:start w:val="1"/>
+      <w:numFmt w:val="bullet"/>
+      <w:lvlText w:val=""/>
+      <w:lvlJc w:val="left"/>
+      <w:pPr>
+        <w:ind w:left="2160" w:hanging="360"/>
+      </w:pPr>
+      <w:rPr>
+        <w:rFonts w:ascii="Wingdings" w:hAnsi="Wingdings" w:hint="default"/>
+      </w:rPr>
+    </w:lvl>
+    <w:lvl w:ilvl="3" w:tplc="04020001" w:tentative="1">
+      <w:start w:val="1"/>
+      <w:numFmt w:val="bullet"/>
+      <w:lvlText w:val=""/>
+      <w:lvlJc w:val="left"/>
+      <w:pPr>
+        <w:ind w:left="2880" w:hanging="360"/>
+      </w:pPr>
+      <w:rPr>
+        <w:rFonts w:ascii="Symbol" w:hAnsi="Symbol" w:hint="default"/>
+      </w:rPr>
+    </w:lvl>
+    <w:lvl w:ilvl="4" w:tplc="04020003" w:tentative="1">
+      <w:start w:val="1"/>
+      <w:numFmt w:val="bullet"/>
+      <w:lvlText w:val="o"/>
+      <w:lvlJc w:val="left"/>
+      <w:pPr>
+        <w:ind w:left="3600" w:hanging="360"/>
+      </w:pPr>
+      <w:rPr>
+        <w:rFonts w:ascii="Courier New" w:hAnsi="Courier New" w:cs="Courier New" w:hint="default"/>
+      </w:rPr>
+    </w:lvl>
+    <w:lvl w:ilvl="5" w:tplc="04020005" w:tentative="1">
+      <w:start w:val="1"/>
+      <w:numFmt w:val="bullet"/>
+      <w:lvlText w:val=""/>
+      <w:lvlJc w:val="left"/>
+      <w:pPr>
+        <w:ind w:left="4320" w:hanging="360"/>
+      </w:pPr>
+      <w:rPr>
+        <w:rFonts w:ascii="Wingdings" w:hAnsi="Wingdings" w:hint="default"/>
+      </w:rPr>
+    </w:lvl>
+    <w:lvl w:ilvl="6" w:tplc="04020001" w:tentative="1">
+      <w:start w:val="1"/>
+      <w:numFmt w:val="bullet"/>
+      <w:lvlText w:val=""/>
+      <w:lvlJc w:val="left"/>
+      <w:pPr>
+        <w:ind w:left="5040" w:hanging="360"/>
+      </w:pPr>
+      <w:rPr>
+        <w:rFonts w:ascii="Symbol" w:hAnsi="Symbol" w:hint="default"/>
+      </w:rPr>
+    </w:lvl>
+    <w:lvl w:ilvl="7" w:tplc="04020003" w:tentative="1">
+      <w:start w:val="1"/>
+      <w:numFmt w:val="bullet"/>
+      <w:lvlText w:val="o"/>
+      <w:lvlJc w:val="left"/>
+      <w:pPr>
+        <w:ind w:left="5760" w:hanging="360"/>
+      </w:pPr>
+      <w:rPr>
+        <w:rFonts w:ascii="Courier New" w:hAnsi="Courier New" w:cs="Courier New" w:hint="default"/>
+      </w:rPr>
+    </w:lvl>
+    <w:lvl w:ilvl="8" w:tplc="04020005" w:tentative="1">
+      <w:start w:val="1"/>
+      <w:numFmt w:val="bullet"/>
+      <w:lvlText w:val=""/>
+      <w:lvlJc w:val="left"/>
+      <w:pPr>
+        <w:ind w:left="6480" w:hanging="360"/>
+      </w:pPr>
+      <w:rPr>
+        <w:rFonts w:ascii="Wingdings" w:hAnsi="Wingdings" w:hint="default"/>
+      </w:rPr>
+    </w:lvl>
+  </w:abstractNum>
+  <w:abstractNum w:abstractNumId="7" w15:restartNumberingAfterBreak="0">
     <w:nsid w:val="6FD929C1"/>
     <w:multiLevelType w:val="hybridMultilevel"/>
     <w:tmpl w:val="383A7A92"/>
@@ -10594,7 +11467,7 @@
       </w:rPr>
     </w:lvl>
   </w:abstractNum>
-  <w:abstractNum w:abstractNumId="6" w15:restartNumberingAfterBreak="0">
+  <w:abstractNum w:abstractNumId="8" w15:restartNumberingAfterBreak="0">
     <w:nsid w:val="71FF1552"/>
     <w:multiLevelType w:val="hybridMultilevel"/>
     <w:tmpl w:val="62A247CA"/>
@@ -10707,7 +11580,7 @@
       </w:rPr>
     </w:lvl>
   </w:abstractNum>
-  <w:abstractNum w:abstractNumId="7" w15:restartNumberingAfterBreak="0">
+  <w:abstractNum w:abstractNumId="9" w15:restartNumberingAfterBreak="0">
     <w:nsid w:val="7235233B"/>
     <w:multiLevelType w:val="hybridMultilevel"/>
     <w:tmpl w:val="82E8934C"/>
@@ -10794,7 +11667,7 @@
     </w:lvl>
   </w:abstractNum>
   <w:num w:numId="1" w16cid:durableId="797143732">
-    <w:abstractNumId w:val="4"/>
+    <w:abstractNumId w:val="5"/>
   </w:num>
   <w:num w:numId="2" w16cid:durableId="646785427">
     <w:abstractNumId w:val="1"/>
@@ -10803,19 +11676,25 @@
     <w:abstractNumId w:val="2"/>
   </w:num>
   <w:num w:numId="4" w16cid:durableId="892738569">
-    <w:abstractNumId w:val="3"/>
+    <w:abstractNumId w:val="4"/>
   </w:num>
   <w:num w:numId="5" w16cid:durableId="1113406297">
-    <w:abstractNumId w:val="7"/>
+    <w:abstractNumId w:val="9"/>
   </w:num>
   <w:num w:numId="6" w16cid:durableId="1349334172">
     <w:abstractNumId w:val="0"/>
   </w:num>
   <w:num w:numId="7" w16cid:durableId="1281380356">
-    <w:abstractNumId w:val="5"/>
+    <w:abstractNumId w:val="7"/>
   </w:num>
   <w:num w:numId="8" w16cid:durableId="511453526">
+    <w:abstractNumId w:val="8"/>
+  </w:num>
+  <w:num w:numId="9" w16cid:durableId="201987702">
     <w:abstractNumId w:val="6"/>
+  </w:num>
+  <w:num w:numId="10" w16cid:durableId="774909101">
+    <w:abstractNumId w:val="3"/>
   </w:num>
 </w:numbering>
 </file>
@@ -11430,7 +12309,6 @@
   <w:style w:type="character" w:default="1" w:styleId="DefaultParagraphFont">
     <w:name w:val="Default Paragraph Font"/>
     <w:uiPriority w:val="1"/>
-    <w:semiHidden/>
     <w:unhideWhenUsed/>
   </w:style>
   <w:style w:type="table" w:default="1" w:styleId="TableNormal">
@@ -12274,6 +13152,15 @@
 </file>
 
 <file path=customXml/item1.xml><?xml version="1.0" encoding="utf-8"?>
+<?mso-contentType ?>
+<FormTemplates xmlns="http://schemas.microsoft.com/sharepoint/v3/contenttype/forms">
+  <Display>DocumentLibraryForm</Display>
+  <Edit>DocumentLibraryForm</Edit>
+  <New>DocumentLibraryForm</New>
+</FormTemplates>
+</file>
+
+<file path=customXml/item2.xml><?xml version="1.0" encoding="utf-8"?>
 <ct:contentTypeSchema xmlns:ct="http://schemas.microsoft.com/office/2006/metadata/contentType" xmlns:ma="http://schemas.microsoft.com/office/2006/metadata/properties/metaAttributes" ct:_="" ma:_="" ma:contentTypeName="Document" ma:contentTypeID="0x010100EA7F95447AE5CD4A96E24D58484FA3D2" ma:contentTypeVersion="9" ma:contentTypeDescription="Create a new document." ma:contentTypeScope="" ma:versionID="152a1f3b266b5df558eb501d08fa54b7">
   <xsd:schema xmlns:xsd="http://www.w3.org/2001/XMLSchema" xmlns:xs="http://www.w3.org/2001/XMLSchema" xmlns:p="http://schemas.microsoft.com/office/2006/metadata/properties" xmlns:ns3="16eb03e4-fe34-41e0-b148-6c2f228be8b6" xmlns:ns4="c5dcd230-26b3-4f1e-a7d8-2c2a40be033b" targetNamespace="http://schemas.microsoft.com/office/2006/metadata/properties" ma:root="true" ma:fieldsID="ebbaa98d623378dfae11ad7cf338cc80" ns3:_="" ns4:_="">
     <xsd:import namespace="16eb03e4-fe34-41e0-b148-6c2f228be8b6"/>
@@ -12468,15 +13355,6 @@
 </ct:contentTypeSchema>
 </file>
 
-<file path=customXml/item2.xml><?xml version="1.0" encoding="utf-8"?>
-<?mso-contentType ?>
-<FormTemplates xmlns="http://schemas.microsoft.com/sharepoint/v3/contenttype/forms">
-  <Display>DocumentLibraryForm</Display>
-  <Edit>DocumentLibraryForm</Edit>
-  <New>DocumentLibraryForm</New>
-</FormTemplates>
-</file>
-
 <file path=customXml/item3.xml><?xml version="1.0" encoding="utf-8"?>
 <p:properties xmlns:p="http://schemas.microsoft.com/office/2006/metadata/properties" xmlns:xsi="http://www.w3.org/2001/XMLSchema-instance" xmlns:pc="http://schemas.microsoft.com/office/infopath/2007/PartnerControls">
   <documentManagement>
@@ -12526,24 +13404,6 @@
     <b:Day>09</b:Day>
     <b:URL>https://www.crowdstrike.com/en-us/cybersecurity-101/ransomware/history-of-ransomware/</b:URL>
     <b:RefOrder>3</b:RefOrder>
-  </b:Source>
-  <b:Source>
-    <b:Tag>Bot</b:Tag>
-    <b:SourceType>InternetSite</b:SourceType>
-    <b:Guid>{20B2E95D-A0FA-4944-85FB-E71D64664F65}</b:Guid>
-    <b:Title>Botnet</b:Title>
-    <b:ProductionCompany>Eset</b:ProductionCompany>
-    <b:URL>https://help.eset.com/glossary/bg-BG/botnet.html</b:URL>
-    <b:RefOrder>10</b:RefOrder>
-  </b:Source>
-  <b:Source>
-    <b:Tag>CCS</b:Tag>
-    <b:SourceType>InternetSite</b:SourceType>
-    <b:Guid>{F37D6060-4B83-48F8-ADC6-94648278B6D6}</b:Guid>
-    <b:Title>CC Server</b:Title>
-    <b:ProductionCompany>Eset</b:ProductionCompany>
-    <b:URL>https://help.eset.com/glossary/bg-BG/cc_server.html</b:URL>
-    <b:RefOrder>11</b:RefOrder>
   </b:Source>
   <b:Source>
     <b:Tag>Фил20</b:Tag>
@@ -12627,12 +13487,51 @@
       </b:Author>
     </b:Author>
     <b:URL>https://www.cmu.edu/iso/aware/dont-take-the-bait/social-engineering.html</b:URL>
+    <b:RefOrder>11</b:RefOrder>
+  </b:Source>
+  <b:Source>
+    <b:Tag>Bre25</b:Tag>
+    <b:SourceType>InternetSite</b:SourceType>
+    <b:Guid>{3DCF498A-E77B-4961-A5CD-77D2C318EE76}</b:Guid>
+    <b:Author>
+      <b:Author>
+        <b:NameList>
+          <b:Person>
+            <b:Last>Robb</b:Last>
+            <b:First>Brenda</b:First>
+          </b:Person>
+        </b:NameList>
+      </b:Author>
+    </b:Author>
+    <b:Title>AI and Ransomware Prevention: How Smart Tech can Outsmart Cybercriminals</b:Title>
+    <b:ProductionCompany>BlackFog</b:ProductionCompany>
+    <b:Year>2025</b:Year>
+    <b:Month>06</b:Month>
+    <b:Day>24</b:Day>
+    <b:URL>https://www.blackfog.com/ai-and-ransomware-prevention-how-smart-tech-can-outsmart-cybercriminals</b:URL>
     <b:RefOrder>9</b:RefOrder>
+  </b:Source>
+  <b:Source>
+    <b:Tag>Spr</b:Tag>
+    <b:SourceType>InternetSite</b:SourceType>
+    <b:Guid>{4BD5D5E2-11B2-43B8-8295-F956C5FB1705}</b:Guid>
+    <b:Title>Spring Security Crypto Module</b:Title>
+    <b:ProductionCompany>Spring</b:ProductionCompany>
+    <b:URL>https://docs.spring.io/spring-security/reference/features/integrations/cryptography.html</b:URL>
+    <b:RefOrder>10</b:RefOrder>
   </b:Source>
 </b:Sources>
 </file>
 
 <file path=customXml/itemProps1.xml><?xml version="1.0" encoding="utf-8"?>
+<ds:datastoreItem xmlns:ds="http://schemas.openxmlformats.org/officeDocument/2006/customXml" ds:itemID="{95434D9A-8BA9-420D-93D1-CF746F074EA1}">
+  <ds:schemaRefs>
+    <ds:schemaRef ds:uri="http://schemas.microsoft.com/sharepoint/v3/contenttype/forms"/>
+  </ds:schemaRefs>
+</ds:datastoreItem>
+</file>
+
+<file path=customXml/itemProps2.xml><?xml version="1.0" encoding="utf-8"?>
 <ds:datastoreItem xmlns:ds="http://schemas.openxmlformats.org/officeDocument/2006/customXml" ds:itemID="{EC25E0E9-ED1E-4DED-B1D8-B99F35F6AB52}">
   <ds:schemaRefs>
     <ds:schemaRef ds:uri="http://schemas.microsoft.com/office/2006/metadata/contentType"/>
@@ -12651,14 +13550,6 @@
 </ds:datastoreItem>
 </file>
 
-<file path=customXml/itemProps2.xml><?xml version="1.0" encoding="utf-8"?>
-<ds:datastoreItem xmlns:ds="http://schemas.openxmlformats.org/officeDocument/2006/customXml" ds:itemID="{95434D9A-8BA9-420D-93D1-CF746F074EA1}">
-  <ds:schemaRefs>
-    <ds:schemaRef ds:uri="http://schemas.microsoft.com/sharepoint/v3/contenttype/forms"/>
-  </ds:schemaRefs>
-</ds:datastoreItem>
-</file>
-
 <file path=customXml/itemProps3.xml><?xml version="1.0" encoding="utf-8"?>
 <ds:datastoreItem xmlns:ds="http://schemas.openxmlformats.org/officeDocument/2006/customXml" ds:itemID="{6C2A65B6-C891-4DE3-96AA-342988F8CBF9}">
   <ds:schemaRefs>
@@ -12670,7 +13561,7 @@
 </file>
 
 <file path=customXml/itemProps4.xml><?xml version="1.0" encoding="utf-8"?>
-<ds:datastoreItem xmlns:ds="http://schemas.openxmlformats.org/officeDocument/2006/customXml" ds:itemID="{EF2CBA0C-06DA-4F41-AA0E-A73FE5799207}">
+<ds:datastoreItem xmlns:ds="http://schemas.openxmlformats.org/officeDocument/2006/customXml" ds:itemID="{1B5A900D-9C4B-489C-9127-E3B977EAB9EC}">
   <ds:schemaRefs>
     <ds:schemaRef ds:uri="http://schemas.openxmlformats.org/officeDocument/2006/bibliography"/>
   </ds:schemaRefs>

</xml_diff>

<commit_message>
update doc by mama
</commit_message>
<xml_diff>
--- a/Ransomware.docx
+++ b/Ransomware.docx
@@ -591,7 +591,7 @@
             <w:rPr>
               <w:rFonts w:asciiTheme="minorHAnsi" w:eastAsiaTheme="minorEastAsia" w:hAnsiTheme="minorHAnsi"/>
               <w:noProof/>
-              <w:lang w:eastAsia="bg-BG"/>
+              <w:lang w:val="en-US"/>
             </w:rPr>
           </w:pPr>
           <w:r>
@@ -603,7 +603,7 @@
           <w:r>
             <w:fldChar w:fldCharType="separate"/>
           </w:r>
-          <w:hyperlink w:anchor="_Toc223468464" w:history="1">
+          <w:hyperlink w:anchor="_Toc223545520" w:history="1">
             <w:r>
               <w:rPr>
                 <w:rStyle w:val="Hyperlink"/>
@@ -631,7 +631,7 @@
                 <w:noProof/>
                 <w:webHidden/>
               </w:rPr>
-              <w:instrText xml:space="preserve"> PAGEREF _Toc223468464 \h </w:instrText>
+              <w:instrText xml:space="preserve"> PAGEREF _Toc223545520 \h </w:instrText>
             </w:r>
             <w:r>
               <w:rPr>
@@ -671,10 +671,10 @@
             <w:rPr>
               <w:rFonts w:asciiTheme="minorHAnsi" w:eastAsiaTheme="minorEastAsia" w:hAnsiTheme="minorHAnsi"/>
               <w:noProof/>
-              <w:lang w:eastAsia="bg-BG"/>
+              <w:lang w:val="en-US"/>
             </w:rPr>
           </w:pPr>
-          <w:hyperlink w:anchor="_Toc223468465" w:history="1">
+          <w:hyperlink w:anchor="_Toc223545521" w:history="1">
             <w:r>
               <w:rPr>
                 <w:rStyle w:val="Hyperlink"/>
@@ -709,7 +709,7 @@
                 <w:noProof/>
                 <w:webHidden/>
               </w:rPr>
-              <w:instrText xml:space="preserve"> PAGEREF _Toc223468465 \h </w:instrText>
+              <w:instrText xml:space="preserve"> PAGEREF _Toc223545521 \h </w:instrText>
             </w:r>
             <w:r>
               <w:rPr>
@@ -749,10 +749,10 @@
             <w:rPr>
               <w:rFonts w:asciiTheme="minorHAnsi" w:eastAsiaTheme="minorEastAsia" w:hAnsiTheme="minorHAnsi"/>
               <w:noProof/>
-              <w:lang w:eastAsia="bg-BG"/>
+              <w:lang w:val="en-US"/>
             </w:rPr>
           </w:pPr>
-          <w:hyperlink w:anchor="_Toc223468466" w:history="1">
+          <w:hyperlink w:anchor="_Toc223545522" w:history="1">
             <w:r>
               <w:rPr>
                 <w:rStyle w:val="Hyperlink"/>
@@ -787,7 +787,7 @@
                 <w:noProof/>
                 <w:webHidden/>
               </w:rPr>
-              <w:instrText xml:space="preserve"> PAGEREF _Toc223468466 \h </w:instrText>
+              <w:instrText xml:space="preserve"> PAGEREF _Toc223545522 \h </w:instrText>
             </w:r>
             <w:r>
               <w:rPr>
@@ -828,10 +828,10 @@
             <w:rPr>
               <w:rFonts w:asciiTheme="minorHAnsi" w:eastAsiaTheme="minorEastAsia" w:hAnsiTheme="minorHAnsi"/>
               <w:noProof/>
-              <w:lang w:eastAsia="bg-BG"/>
+              <w:lang w:val="en-US"/>
             </w:rPr>
           </w:pPr>
-          <w:hyperlink w:anchor="_Toc223468467" w:history="1">
+          <w:hyperlink w:anchor="_Toc223545523" w:history="1">
             <w:r>
               <w:rPr>
                 <w:rStyle w:val="Hyperlink"/>
@@ -843,7 +843,7 @@
               <w:rPr>
                 <w:rFonts w:asciiTheme="minorHAnsi" w:eastAsiaTheme="minorEastAsia" w:hAnsiTheme="minorHAnsi"/>
                 <w:noProof/>
-                <w:lang w:eastAsia="bg-BG"/>
+                <w:lang w:val="en-US"/>
               </w:rPr>
               <w:tab/>
             </w:r>
@@ -881,7 +881,7 @@
                 <w:noProof/>
                 <w:webHidden/>
               </w:rPr>
-              <w:instrText xml:space="preserve"> PAGEREF _Toc223468467 \h </w:instrText>
+              <w:instrText xml:space="preserve"> PAGEREF _Toc223545523 \h </w:instrText>
             </w:r>
             <w:r>
               <w:rPr>
@@ -922,10 +922,10 @@
             <w:rPr>
               <w:rFonts w:asciiTheme="minorHAnsi" w:eastAsiaTheme="minorEastAsia" w:hAnsiTheme="minorHAnsi"/>
               <w:noProof/>
-              <w:lang w:eastAsia="bg-BG"/>
+              <w:lang w:val="en-US"/>
             </w:rPr>
           </w:pPr>
-          <w:hyperlink w:anchor="_Toc223468468" w:history="1">
+          <w:hyperlink w:anchor="_Toc223545524" w:history="1">
             <w:r>
               <w:rPr>
                 <w:rStyle w:val="Hyperlink"/>
@@ -937,7 +937,7 @@
               <w:rPr>
                 <w:rFonts w:asciiTheme="minorHAnsi" w:eastAsiaTheme="minorEastAsia" w:hAnsiTheme="minorHAnsi"/>
                 <w:noProof/>
-                <w:lang w:eastAsia="bg-BG"/>
+                <w:lang w:val="en-US"/>
               </w:rPr>
               <w:tab/>
             </w:r>
@@ -990,7 +990,7 @@
                 <w:noProof/>
                 <w:webHidden/>
               </w:rPr>
-              <w:instrText xml:space="preserve"> PAGEREF _Toc223468468 \h </w:instrText>
+              <w:instrText xml:space="preserve"> PAGEREF _Toc223545524 \h </w:instrText>
             </w:r>
             <w:r>
               <w:rPr>
@@ -1031,10 +1031,10 @@
             <w:rPr>
               <w:rFonts w:asciiTheme="minorHAnsi" w:eastAsiaTheme="minorEastAsia" w:hAnsiTheme="minorHAnsi"/>
               <w:noProof/>
-              <w:lang w:eastAsia="bg-BG"/>
+              <w:lang w:val="en-US"/>
             </w:rPr>
           </w:pPr>
-          <w:hyperlink w:anchor="_Toc223468469" w:history="1">
+          <w:hyperlink w:anchor="_Toc223545525" w:history="1">
             <w:r>
               <w:rPr>
                 <w:rStyle w:val="Hyperlink"/>
@@ -1047,7 +1047,7 @@
               <w:rPr>
                 <w:rFonts w:asciiTheme="minorHAnsi" w:eastAsiaTheme="minorEastAsia" w:hAnsiTheme="minorHAnsi"/>
                 <w:noProof/>
-                <w:lang w:eastAsia="bg-BG"/>
+                <w:lang w:val="en-US"/>
               </w:rPr>
               <w:tab/>
             </w:r>
@@ -1078,7 +1078,7 @@
                 <w:noProof/>
                 <w:webHidden/>
               </w:rPr>
-              <w:instrText xml:space="preserve"> PAGEREF _Toc223468469 \h </w:instrText>
+              <w:instrText xml:space="preserve"> PAGEREF _Toc223545525 \h </w:instrText>
             </w:r>
             <w:r>
               <w:rPr>
@@ -1119,10 +1119,10 @@
             <w:rPr>
               <w:rFonts w:asciiTheme="minorHAnsi" w:eastAsiaTheme="minorEastAsia" w:hAnsiTheme="minorHAnsi"/>
               <w:noProof/>
-              <w:lang w:eastAsia="bg-BG"/>
+              <w:lang w:val="en-US"/>
             </w:rPr>
           </w:pPr>
-          <w:hyperlink w:anchor="_Toc223468470" w:history="1">
+          <w:hyperlink w:anchor="_Toc223545526" w:history="1">
             <w:r>
               <w:rPr>
                 <w:rStyle w:val="Hyperlink"/>
@@ -1135,7 +1135,7 @@
               <w:rPr>
                 <w:rFonts w:asciiTheme="minorHAnsi" w:eastAsiaTheme="minorEastAsia" w:hAnsiTheme="minorHAnsi"/>
                 <w:noProof/>
-                <w:lang w:eastAsia="bg-BG"/>
+                <w:lang w:val="en-US"/>
               </w:rPr>
               <w:tab/>
             </w:r>
@@ -1188,7 +1188,7 @@
                 <w:noProof/>
                 <w:webHidden/>
               </w:rPr>
-              <w:instrText xml:space="preserve"> PAGEREF _Toc223468470 \h </w:instrText>
+              <w:instrText xml:space="preserve"> PAGEREF _Toc223545526 \h </w:instrText>
             </w:r>
             <w:r>
               <w:rPr>
@@ -1229,10 +1229,10 @@
             <w:rPr>
               <w:rFonts w:asciiTheme="minorHAnsi" w:eastAsiaTheme="minorEastAsia" w:hAnsiTheme="minorHAnsi"/>
               <w:noProof/>
-              <w:lang w:eastAsia="bg-BG"/>
+              <w:lang w:val="en-US"/>
             </w:rPr>
           </w:pPr>
-          <w:hyperlink w:anchor="_Toc223468471" w:history="1">
+          <w:hyperlink w:anchor="_Toc223545527" w:history="1">
             <w:r>
               <w:rPr>
                 <w:rStyle w:val="Hyperlink"/>
@@ -1244,7 +1244,7 @@
               <w:rPr>
                 <w:rFonts w:asciiTheme="minorHAnsi" w:eastAsiaTheme="minorEastAsia" w:hAnsiTheme="minorHAnsi"/>
                 <w:noProof/>
-                <w:lang w:eastAsia="bg-BG"/>
+                <w:lang w:val="en-US"/>
               </w:rPr>
               <w:tab/>
             </w:r>
@@ -1290,7 +1290,7 @@
                 <w:noProof/>
                 <w:webHidden/>
               </w:rPr>
-              <w:instrText xml:space="preserve"> PAGEREF _Toc223468471 \h </w:instrText>
+              <w:instrText xml:space="preserve"> PAGEREF _Toc223545527 \h </w:instrText>
             </w:r>
             <w:r>
               <w:rPr>
@@ -1330,10 +1330,10 @@
             <w:rPr>
               <w:rFonts w:asciiTheme="minorHAnsi" w:eastAsiaTheme="minorEastAsia" w:hAnsiTheme="minorHAnsi"/>
               <w:noProof/>
-              <w:lang w:eastAsia="bg-BG"/>
+              <w:lang w:val="en-US"/>
             </w:rPr>
           </w:pPr>
-          <w:hyperlink w:anchor="_Toc223468472" w:history="1">
+          <w:hyperlink w:anchor="_Toc223545528" w:history="1">
             <w:r>
               <w:rPr>
                 <w:rStyle w:val="Hyperlink"/>
@@ -1390,7 +1390,7 @@
                 <w:noProof/>
                 <w:webHidden/>
               </w:rPr>
-              <w:instrText xml:space="preserve"> PAGEREF _Toc223468472 \h </w:instrText>
+              <w:instrText xml:space="preserve"> PAGEREF _Toc223545528 \h </w:instrText>
             </w:r>
             <w:r>
               <w:rPr>
@@ -1430,10 +1430,10 @@
             <w:rPr>
               <w:rFonts w:asciiTheme="minorHAnsi" w:eastAsiaTheme="minorEastAsia" w:hAnsiTheme="minorHAnsi"/>
               <w:noProof/>
-              <w:lang w:eastAsia="bg-BG"/>
+              <w:lang w:val="en-US"/>
             </w:rPr>
           </w:pPr>
-          <w:hyperlink w:anchor="_Toc223468473" w:history="1">
+          <w:hyperlink w:anchor="_Toc223545529" w:history="1">
             <w:r>
               <w:rPr>
                 <w:rStyle w:val="Hyperlink"/>
@@ -1468,7 +1468,7 @@
                 <w:noProof/>
                 <w:webHidden/>
               </w:rPr>
-              <w:instrText xml:space="preserve"> PAGEREF _Toc223468473 \h </w:instrText>
+              <w:instrText xml:space="preserve"> PAGEREF _Toc223545529 \h </w:instrText>
             </w:r>
             <w:r>
               <w:rPr>
@@ -1508,10 +1508,10 @@
             <w:rPr>
               <w:rFonts w:asciiTheme="minorHAnsi" w:eastAsiaTheme="minorEastAsia" w:hAnsiTheme="minorHAnsi"/>
               <w:noProof/>
-              <w:lang w:eastAsia="bg-BG"/>
+              <w:lang w:val="en-US"/>
             </w:rPr>
           </w:pPr>
-          <w:hyperlink w:anchor="_Toc223468474" w:history="1">
+          <w:hyperlink w:anchor="_Toc223545530" w:history="1">
             <w:r>
               <w:rPr>
                 <w:rStyle w:val="Hyperlink"/>
@@ -1546,7 +1546,7 @@
                 <w:noProof/>
                 <w:webHidden/>
               </w:rPr>
-              <w:instrText xml:space="preserve"> PAGEREF _Toc223468474 \h </w:instrText>
+              <w:instrText xml:space="preserve"> PAGEREF _Toc223545530 \h </w:instrText>
             </w:r>
             <w:r>
               <w:rPr>
@@ -1586,10 +1586,10 @@
             <w:rPr>
               <w:rFonts w:asciiTheme="minorHAnsi" w:eastAsiaTheme="minorEastAsia" w:hAnsiTheme="minorHAnsi"/>
               <w:noProof/>
-              <w:lang w:eastAsia="bg-BG"/>
+              <w:lang w:val="en-US"/>
             </w:rPr>
           </w:pPr>
-          <w:hyperlink w:anchor="_Toc223468475" w:history="1">
+          <w:hyperlink w:anchor="_Toc223545531" w:history="1">
             <w:r>
               <w:rPr>
                 <w:rStyle w:val="Hyperlink"/>
@@ -1616,7 +1616,7 @@
                 <w:noProof/>
                 <w:webHidden/>
               </w:rPr>
-              <w:instrText xml:space="preserve"> PAGEREF _Toc223468475 \h </w:instrText>
+              <w:instrText xml:space="preserve"> PAGEREF _Toc223545531 \h </w:instrText>
             </w:r>
             <w:r>
               <w:rPr>
@@ -1656,10 +1656,10 @@
             <w:rPr>
               <w:rFonts w:asciiTheme="minorHAnsi" w:eastAsiaTheme="minorEastAsia" w:hAnsiTheme="minorHAnsi"/>
               <w:noProof/>
-              <w:lang w:eastAsia="bg-BG"/>
+              <w:lang w:val="en-US"/>
             </w:rPr>
           </w:pPr>
-          <w:hyperlink w:anchor="_Toc223468476" w:history="1">
+          <w:hyperlink w:anchor="_Toc223545532" w:history="1">
             <w:r>
               <w:rPr>
                 <w:rStyle w:val="Hyperlink"/>
@@ -1686,7 +1686,7 @@
                 <w:noProof/>
                 <w:webHidden/>
               </w:rPr>
-              <w:instrText xml:space="preserve"> PAGEREF _Toc223468476 \h </w:instrText>
+              <w:instrText xml:space="preserve"> PAGEREF _Toc223545532 \h </w:instrText>
             </w:r>
             <w:r>
               <w:rPr>
@@ -1726,16 +1726,16 @@
             <w:rPr>
               <w:rFonts w:asciiTheme="minorHAnsi" w:eastAsiaTheme="minorEastAsia" w:hAnsiTheme="minorHAnsi"/>
               <w:noProof/>
-              <w:lang w:eastAsia="bg-BG"/>
+              <w:lang w:val="en-US"/>
             </w:rPr>
           </w:pPr>
-          <w:hyperlink w:anchor="_Toc223468477" w:history="1">
+          <w:hyperlink w:anchor="_Toc223545533" w:history="1">
             <w:r>
               <w:rPr>
                 <w:rStyle w:val="Hyperlink"/>
                 <w:noProof/>
               </w:rPr>
-              <w:t>Жертвата е заплатила откупа:</w:t>
+              <w:t>Потърпевшият е заплатил откупа:</w:t>
             </w:r>
             <w:r>
               <w:rPr>
@@ -1756,7 +1756,7 @@
                 <w:noProof/>
                 <w:webHidden/>
               </w:rPr>
-              <w:instrText xml:space="preserve"> PAGEREF _Toc223468477 \h </w:instrText>
+              <w:instrText xml:space="preserve"> PAGEREF _Toc223545533 \h </w:instrText>
             </w:r>
             <w:r>
               <w:rPr>
@@ -1796,10 +1796,10 @@
             <w:rPr>
               <w:rFonts w:asciiTheme="minorHAnsi" w:eastAsiaTheme="minorEastAsia" w:hAnsiTheme="minorHAnsi"/>
               <w:noProof/>
-              <w:lang w:eastAsia="bg-BG"/>
+              <w:lang w:val="en-US"/>
             </w:rPr>
           </w:pPr>
-          <w:hyperlink w:anchor="_Toc223468478" w:history="1">
+          <w:hyperlink w:anchor="_Toc223545534" w:history="1">
             <w:r>
               <w:rPr>
                 <w:rStyle w:val="Hyperlink"/>
@@ -1834,7 +1834,7 @@
                 <w:noProof/>
                 <w:webHidden/>
               </w:rPr>
-              <w:instrText xml:space="preserve"> PAGEREF _Toc223468478 \h </w:instrText>
+              <w:instrText xml:space="preserve"> PAGEREF _Toc223545534 \h </w:instrText>
             </w:r>
             <w:r>
               <w:rPr>
@@ -1874,10 +1874,10 @@
             <w:rPr>
               <w:rFonts w:asciiTheme="minorHAnsi" w:eastAsiaTheme="minorEastAsia" w:hAnsiTheme="minorHAnsi"/>
               <w:noProof/>
-              <w:lang w:eastAsia="bg-BG"/>
+              <w:lang w:val="en-US"/>
             </w:rPr>
           </w:pPr>
-          <w:hyperlink w:anchor="_Toc223468479" w:history="1">
+          <w:hyperlink w:anchor="_Toc223545535" w:history="1">
             <w:r>
               <w:rPr>
                 <w:rStyle w:val="Hyperlink"/>
@@ -1912,7 +1912,7 @@
                 <w:noProof/>
                 <w:webHidden/>
               </w:rPr>
-              <w:instrText xml:space="preserve"> PAGEREF _Toc223468479 \h </w:instrText>
+              <w:instrText xml:space="preserve"> PAGEREF _Toc223545535 \h </w:instrText>
             </w:r>
             <w:r>
               <w:rPr>
@@ -1953,10 +1953,10 @@
             <w:rPr>
               <w:rFonts w:asciiTheme="minorHAnsi" w:eastAsiaTheme="minorEastAsia" w:hAnsiTheme="minorHAnsi"/>
               <w:noProof/>
-              <w:lang w:eastAsia="bg-BG"/>
+              <w:lang w:val="en-US"/>
             </w:rPr>
           </w:pPr>
-          <w:hyperlink w:anchor="_Toc223468480" w:history="1">
+          <w:hyperlink w:anchor="_Toc223545536" w:history="1">
             <w:r>
               <w:rPr>
                 <w:rStyle w:val="Hyperlink"/>
@@ -1968,7 +1968,7 @@
               <w:rPr>
                 <w:rFonts w:asciiTheme="minorHAnsi" w:eastAsiaTheme="minorEastAsia" w:hAnsiTheme="minorHAnsi"/>
                 <w:noProof/>
-                <w:lang w:eastAsia="bg-BG"/>
+                <w:lang w:val="en-US"/>
               </w:rPr>
               <w:tab/>
             </w:r>
@@ -2013,7 +2013,7 @@
                 <w:noProof/>
                 <w:webHidden/>
               </w:rPr>
-              <w:instrText xml:space="preserve"> PAGEREF _Toc223468480 \h </w:instrText>
+              <w:instrText xml:space="preserve"> PAGEREF _Toc223545536 \h </w:instrText>
             </w:r>
             <w:r>
               <w:rPr>
@@ -2054,10 +2054,10 @@
             <w:rPr>
               <w:rFonts w:asciiTheme="minorHAnsi" w:eastAsiaTheme="minorEastAsia" w:hAnsiTheme="minorHAnsi"/>
               <w:noProof/>
-              <w:lang w:eastAsia="bg-BG"/>
+              <w:lang w:val="en-US"/>
             </w:rPr>
           </w:pPr>
-          <w:hyperlink w:anchor="_Toc223468481" w:history="1">
+          <w:hyperlink w:anchor="_Toc223545537" w:history="1">
             <w:r>
               <w:rPr>
                 <w:rStyle w:val="Hyperlink"/>
@@ -2070,7 +2070,7 @@
               <w:rPr>
                 <w:rFonts w:asciiTheme="minorHAnsi" w:eastAsiaTheme="minorEastAsia" w:hAnsiTheme="minorHAnsi"/>
                 <w:noProof/>
-                <w:lang w:eastAsia="bg-BG"/>
+                <w:lang w:val="en-US"/>
               </w:rPr>
               <w:tab/>
             </w:r>
@@ -2100,7 +2100,7 @@
                 <w:noProof/>
                 <w:webHidden/>
               </w:rPr>
-              <w:instrText xml:space="preserve"> PAGEREF _Toc223468481 \h </w:instrText>
+              <w:instrText xml:space="preserve"> PAGEREF _Toc223545537 \h </w:instrText>
             </w:r>
             <w:r>
               <w:rPr>
@@ -2141,10 +2141,10 @@
             <w:rPr>
               <w:rFonts w:asciiTheme="minorHAnsi" w:eastAsiaTheme="minorEastAsia" w:hAnsiTheme="minorHAnsi"/>
               <w:noProof/>
-              <w:lang w:eastAsia="bg-BG"/>
+              <w:lang w:val="en-US"/>
             </w:rPr>
           </w:pPr>
-          <w:hyperlink w:anchor="_Toc223468482" w:history="1">
+          <w:hyperlink w:anchor="_Toc223545538" w:history="1">
             <w:r>
               <w:rPr>
                 <w:rStyle w:val="Hyperlink"/>
@@ -2156,7 +2156,7 @@
               <w:rPr>
                 <w:rFonts w:asciiTheme="minorHAnsi" w:eastAsiaTheme="minorEastAsia" w:hAnsiTheme="minorHAnsi"/>
                 <w:noProof/>
-                <w:lang w:eastAsia="bg-BG"/>
+                <w:lang w:val="en-US"/>
               </w:rPr>
               <w:tab/>
             </w:r>
@@ -2186,7 +2186,7 @@
                 <w:noProof/>
                 <w:webHidden/>
               </w:rPr>
-              <w:instrText xml:space="preserve"> PAGEREF _Toc223468482 \h </w:instrText>
+              <w:instrText xml:space="preserve"> PAGEREF _Toc223545538 \h </w:instrText>
             </w:r>
             <w:r>
               <w:rPr>
@@ -2227,10 +2227,10 @@
             <w:rPr>
               <w:rFonts w:asciiTheme="minorHAnsi" w:eastAsiaTheme="minorEastAsia" w:hAnsiTheme="minorHAnsi"/>
               <w:noProof/>
-              <w:lang w:eastAsia="bg-BG"/>
+              <w:lang w:val="en-US"/>
             </w:rPr>
           </w:pPr>
-          <w:hyperlink w:anchor="_Toc223468483" w:history="1">
+          <w:hyperlink w:anchor="_Toc223545539" w:history="1">
             <w:r>
               <w:rPr>
                 <w:rStyle w:val="Hyperlink"/>
@@ -2243,7 +2243,7 @@
               <w:rPr>
                 <w:rFonts w:asciiTheme="minorHAnsi" w:eastAsiaTheme="minorEastAsia" w:hAnsiTheme="minorHAnsi"/>
                 <w:noProof/>
-                <w:lang w:eastAsia="bg-BG"/>
+                <w:lang w:val="en-US"/>
               </w:rPr>
               <w:tab/>
             </w:r>
@@ -2281,7 +2281,7 @@
                 <w:noProof/>
                 <w:webHidden/>
               </w:rPr>
-              <w:instrText xml:space="preserve"> PAGEREF _Toc223468483 \h </w:instrText>
+              <w:instrText xml:space="preserve"> PAGEREF _Toc223545539 \h </w:instrText>
             </w:r>
             <w:r>
               <w:rPr>
@@ -2322,10 +2322,10 @@
             <w:rPr>
               <w:rFonts w:asciiTheme="minorHAnsi" w:eastAsiaTheme="minorEastAsia" w:hAnsiTheme="minorHAnsi"/>
               <w:noProof/>
-              <w:lang w:eastAsia="bg-BG"/>
+              <w:lang w:val="en-US"/>
             </w:rPr>
           </w:pPr>
-          <w:hyperlink w:anchor="_Toc223468484" w:history="1">
+          <w:hyperlink w:anchor="_Toc223545540" w:history="1">
             <w:r>
               <w:rPr>
                 <w:rStyle w:val="Hyperlink"/>
@@ -2338,7 +2338,7 @@
               <w:rPr>
                 <w:rFonts w:asciiTheme="minorHAnsi" w:eastAsiaTheme="minorEastAsia" w:hAnsiTheme="minorHAnsi"/>
                 <w:noProof/>
-                <w:lang w:eastAsia="bg-BG"/>
+                <w:lang w:val="en-US"/>
               </w:rPr>
               <w:tab/>
             </w:r>
@@ -2376,7 +2376,7 @@
                 <w:noProof/>
                 <w:webHidden/>
               </w:rPr>
-              <w:instrText xml:space="preserve"> PAGEREF _Toc223468484 \h </w:instrText>
+              <w:instrText xml:space="preserve"> PAGEREF _Toc223545540 \h </w:instrText>
             </w:r>
             <w:r>
               <w:rPr>
@@ -2416,10 +2416,10 @@
             <w:rPr>
               <w:rFonts w:asciiTheme="minorHAnsi" w:eastAsiaTheme="minorEastAsia" w:hAnsiTheme="minorHAnsi"/>
               <w:noProof/>
-              <w:lang w:eastAsia="bg-BG"/>
+              <w:lang w:val="en-US"/>
             </w:rPr>
           </w:pPr>
-          <w:hyperlink w:anchor="_Toc223468485" w:history="1">
+          <w:hyperlink w:anchor="_Toc223545541" w:history="1">
             <w:r>
               <w:rPr>
                 <w:rStyle w:val="Hyperlink"/>
@@ -2461,7 +2461,7 @@
                 <w:noProof/>
                 <w:webHidden/>
               </w:rPr>
-              <w:instrText xml:space="preserve"> PAGEREF _Toc223468485 \h </w:instrText>
+              <w:instrText xml:space="preserve"> PAGEREF _Toc223545541 \h </w:instrText>
             </w:r>
             <w:r>
               <w:rPr>
@@ -2501,10 +2501,10 @@
             <w:rPr>
               <w:rFonts w:asciiTheme="minorHAnsi" w:eastAsiaTheme="minorEastAsia" w:hAnsiTheme="minorHAnsi"/>
               <w:noProof/>
-              <w:lang w:eastAsia="bg-BG"/>
+              <w:lang w:val="en-US"/>
             </w:rPr>
           </w:pPr>
-          <w:hyperlink w:anchor="_Toc223468486" w:history="1">
+          <w:hyperlink w:anchor="_Toc223545542" w:history="1">
             <w:r>
               <w:rPr>
                 <w:rStyle w:val="Hyperlink"/>
@@ -2531,7 +2531,7 @@
                 <w:noProof/>
                 <w:webHidden/>
               </w:rPr>
-              <w:instrText xml:space="preserve"> PAGEREF _Toc223468486 \h </w:instrText>
+              <w:instrText xml:space="preserve"> PAGEREF _Toc223545542 \h </w:instrText>
             </w:r>
             <w:r>
               <w:rPr>
@@ -2594,7 +2594,7 @@
           <w:rFonts w:eastAsia="Aptos"/>
         </w:rPr>
       </w:pPr>
-      <w:bookmarkStart w:id="0" w:name="_Toc223468464"/>
+      <w:bookmarkStart w:id="0" w:name="_Toc223545520"/>
       <w:r>
         <w:rPr>
           <w:rFonts w:eastAsia="Aptos"/>
@@ -2613,23 +2613,59 @@
       </w:r>
       <w:proofErr w:type="spellStart"/>
       <w:r>
+        <w:rPr>
+          <w:highlight w:val="yellow"/>
+        </w:rPr>
         <w:t>Рансъмуерът</w:t>
       </w:r>
       <w:proofErr w:type="spellEnd"/>
       <w:r>
-        <w:t> </w:t>
-      </w:r>
-      <w:r>
-        <w:t xml:space="preserve">е вид зловреден софтуер, който криптира файлове и ограничава достъпа до дадена система. Хакерът изисква откуп от ощетения, обикновено парична сума (в биткойн), в замяна откраднатите данни. </w:t>
-      </w:r>
-      <w:r>
-        <w:t xml:space="preserve">Най-често се използва биткойн или друга криптовалута, понеже е много трудна да бъде проследена. </w:t>
+        <w:rPr>
+          <w:highlight w:val="yellow"/>
+        </w:rPr>
+        <w:t> е вид зловреден софтуер, който криптира файлове</w:t>
+      </w:r>
+      <w:r>
+        <w:t xml:space="preserve"> и ограничава достъпа до дадена система. Хакерът изисква откуп от</w:t>
+      </w:r>
+      <w:r>
+        <w:t xml:space="preserve"> потърпевшия</w:t>
+      </w:r>
+      <w:r>
+        <w:t xml:space="preserve">, обикновено парична сума (в биткойн), в замяна </w:t>
+      </w:r>
+      <w:r>
+        <w:t xml:space="preserve">ощетения си възвръща </w:t>
+      </w:r>
+      <w:r>
+        <w:t xml:space="preserve">откраднатите данни. </w:t>
+      </w:r>
+      <w:r>
+        <w:t xml:space="preserve">Най-често се използва биткойн или друга криптовалута, </w:t>
+      </w:r>
+      <w:r>
+        <w:t xml:space="preserve">тъй като </w:t>
+      </w:r>
+      <w:r>
+        <w:t>е трудн</w:t>
+      </w:r>
+      <w:r>
+        <w:t>о</w:t>
+      </w:r>
+      <w:r>
+        <w:t xml:space="preserve"> да бъде проследена. </w:t>
       </w:r>
       <w:r>
         <w:t>Ако жертвата откаже да заплати, всички файлове ще бъдат унищожени.</w:t>
       </w:r>
       <w:r>
-        <w:t xml:space="preserve"> Дори потребителят да заплати сумата не е сигурно, че хакерът няма да изтрие всичко въпреки това.</w:t>
+        <w:t xml:space="preserve"> Дори потребителят да заплати сумата не е сигурно, че хакерът няма да </w:t>
+      </w:r>
+      <w:r>
+        <w:t xml:space="preserve">ги </w:t>
+      </w:r>
+      <w:r>
+        <w:t>изтрие.</w:t>
       </w:r>
       <w:r>
         <w:t xml:space="preserve"> </w:t>
@@ -2641,7 +2677,25 @@
         <w:ind w:firstLine="708"/>
       </w:pPr>
       <w:r>
-        <w:t xml:space="preserve">В зависимост от открадната информация, жертвата може да бъде притиснат допълнително, като бъде заплашван, че цялата му лична информация ще бъде разпространена в интернет – местожителство, членове на семейство, </w:t>
+        <w:t>В зависимост от открадната информация,</w:t>
+      </w:r>
+      <w:r>
+        <w:t xml:space="preserve"> потърпевшият</w:t>
+      </w:r>
+      <w:r>
+        <w:t xml:space="preserve"> може да бъде заплаш</w:t>
+      </w:r>
+      <w:r>
+        <w:t>е</w:t>
+      </w:r>
+      <w:r>
+        <w:t>н, че лична</w:t>
+      </w:r>
+      <w:r>
+        <w:t>та му</w:t>
+      </w:r>
+      <w:r>
+        <w:t xml:space="preserve"> информация ще бъде разпространена в интернет – местожителство, членове на семейство, </w:t>
       </w:r>
       <w:r>
         <w:t>банкова информация, документи, фирмена информация, работно място</w:t>
@@ -2653,107 +2707,227 @@
         <w:t xml:space="preserve"> </w:t>
       </w:r>
       <w:r>
-        <w:t>и др</w:t>
-      </w:r>
-      <w:r>
-        <w:t xml:space="preserve">. Прилагането на двете тактики </w:t>
-      </w:r>
-      <w:r>
-        <w:t xml:space="preserve">заедно </w:t>
-      </w:r>
-      <w:r>
-        <w:t>е известно като</w:t>
-      </w:r>
-      <w:r>
-        <w:t>:</w:t>
-      </w:r>
-      <w:r>
-        <w:t xml:space="preserve"> </w:t>
-      </w:r>
-      <w:r>
-        <w:t>„</w:t>
-      </w:r>
-      <w:r>
-        <w:rPr>
-          <w:lang w:val="en-US"/>
-        </w:rPr>
-        <w:t xml:space="preserve">double extortion”. </w:t>
-      </w:r>
-      <w:r>
-        <w:t>Колкото е по-силен мотивът, толкова е по-вероятно потърпевшият да се пречупи. Друга тактика, която често се прилага е блъф, хакерът има частичен достъп до дадена система, но е неспособен да й навреди. Тогава хвърля безпочвени закани и разчита потребителя да изпълни наредбите.</w:t>
-      </w:r>
-    </w:p>
-    <w:p>
-      <w:pPr>
-        <w:spacing w:line="360" w:lineRule="auto"/>
-      </w:pPr>
-      <w:r>
-        <w:tab/>
-      </w:r>
-      <w:r>
-        <w:t xml:space="preserve"> Тези атаки с изнудващ зловреден софтуер (</w:t>
-      </w:r>
-      <w:proofErr w:type="spellStart"/>
-      <w:r>
-        <w:t>ransomware</w:t>
-      </w:r>
-      <w:proofErr w:type="spellEnd"/>
-      <w:r>
-        <w:t>) могат сериозно да нарушат бизнес процесите. Организациите често губят достъп до важна информация, необходима за нормалната им работа и предоставяне на критични услуги.</w:t>
-      </w:r>
-      <w:r>
-        <w:t xml:space="preserve"> </w:t>
-      </w:r>
-      <w:r>
-        <w:t xml:space="preserve">Икономическите и щети </w:t>
-      </w:r>
-      <w:r>
-        <w:t xml:space="preserve">по репутацията </w:t>
-      </w:r>
-      <w:r>
-        <w:t>са значителни. Възстановяването след подобна атака е трудно и скъпо. Засегнати могат да бъдат организации от всякакъв мащаб. Последиците се усещат както п</w:t>
-      </w:r>
-      <w:r>
-        <w:rPr>
-          <w:lang w:val="en-US"/>
-        </w:rPr>
-        <w:t>a</w:t>
-      </w:r>
-      <w:r>
-        <w:t>о време на първоначалното прекъсване, така и дълго след това.</w:t>
-      </w:r>
-      <w:r>
-        <w:t xml:space="preserve"> </w:t>
+        <w:t xml:space="preserve">и </w:t>
+      </w:r>
+      <w:r>
+        <w:t>т.н</w:t>
+      </w:r>
+      <w:r>
+        <w:t xml:space="preserve">. </w:t>
       </w:r>
     </w:p>
     <w:p>
       <w:pPr>
         <w:spacing w:line="360" w:lineRule="auto"/>
         <w:ind w:firstLine="708"/>
-        <w:rPr>
-          <w:lang w:val="en-US"/>
-        </w:rPr>
-      </w:pPr>
-      <w:r>
-        <w:t xml:space="preserve">От съществено значение е, компаниите често да прилагат задължителни обучение на служителите си, понеже </w:t>
-      </w:r>
-      <w:r>
-        <w:rPr>
-          <w:lang w:val="en-US"/>
-        </w:rPr>
+      </w:pPr>
+      <w:r>
+        <w:t>Откуп, комбиниран с злоупотреба с лични данни се нарича</w:t>
+      </w:r>
+      <w:r>
+        <w:t>:</w:t>
+      </w:r>
+      <w:r>
+        <w:t xml:space="preserve"> </w:t>
+      </w:r>
+      <w:r>
+        <w:t>„</w:t>
+      </w:r>
+      <w:r>
+        <w:rPr>
+          <w:lang w:val="en-US"/>
+        </w:rPr>
+        <w:t xml:space="preserve">double extortion”. </w:t>
+      </w:r>
+      <w:r>
+        <w:t xml:space="preserve">Колкото е по-силен мотивът, толкова е по-вероятно потърпевшият да се пречупи. </w:t>
+      </w:r>
+    </w:p>
+    <w:p>
+      <w:pPr>
+        <w:spacing w:line="360" w:lineRule="auto"/>
+        <w:ind w:firstLine="709"/>
+      </w:pPr>
+      <w:r>
+        <w:t>Друга тактика, която често се прилага е блъф</w:t>
+      </w:r>
+      <w:r>
+        <w:t>иране. Киберпрестъпникът</w:t>
+      </w:r>
+      <w:r>
+        <w:t xml:space="preserve"> има частичен достъп до дадена система, но е неспособен да й навреди. Тогава </w:t>
+      </w:r>
+      <w:r>
+        <w:t>отправя</w:t>
+      </w:r>
+      <w:r>
+        <w:t xml:space="preserve"> безпочвени закани и разчита потребителя</w:t>
+      </w:r>
+      <w:r>
+        <w:t>т</w:t>
+      </w:r>
+      <w:r>
+        <w:t xml:space="preserve"> да изпълни </w:t>
+      </w:r>
+      <w:r>
+        <w:rPr>
+          <w:highlight w:val="yellow"/>
+        </w:rPr>
+        <w:t>наредбите</w:t>
+      </w:r>
+      <w:r>
+        <w:t>.</w:t>
+      </w:r>
+    </w:p>
+    <w:p>
+      <w:pPr>
+        <w:spacing w:line="360" w:lineRule="auto"/>
+      </w:pPr>
+      <w:r>
+        <w:tab/>
+      </w:r>
+      <w:r>
+        <w:t xml:space="preserve"> Тези атаки с изнудващ зловреден софтуер (</w:t>
+      </w:r>
+      <w:proofErr w:type="spellStart"/>
+      <w:r>
         <w:t>ransomware</w:t>
       </w:r>
+      <w:proofErr w:type="spellEnd"/>
+      <w:r>
+        <w:t xml:space="preserve">) могат сериозно да нарушат бизнес процесите. </w:t>
+      </w:r>
+      <w:r>
+        <w:t>Компаниите</w:t>
+      </w:r>
+      <w:r>
+        <w:t xml:space="preserve"> губят достъп до важна информация, необходима за нормалн</w:t>
+      </w:r>
+      <w:r>
+        <w:t xml:space="preserve">ия работен процес и </w:t>
+      </w:r>
+      <w:r>
+        <w:t>предоставяне на к</w:t>
+      </w:r>
+      <w:r>
+        <w:t xml:space="preserve">онкретни </w:t>
+      </w:r>
+      <w:r>
+        <w:t>услуги.</w:t>
+      </w:r>
+      <w:r>
+        <w:t xml:space="preserve"> </w:t>
+      </w:r>
+      <w:r>
+        <w:t>Икономическите  щети</w:t>
+      </w:r>
+      <w:r>
+        <w:t xml:space="preserve"> за фирмите</w:t>
+      </w:r>
+      <w:r>
+        <w:t xml:space="preserve"> </w:t>
+      </w:r>
+      <w:r>
+        <w:t>са значи</w:t>
+      </w:r>
+      <w:r>
+        <w:t>м</w:t>
+      </w:r>
+      <w:r>
+        <w:t>и</w:t>
+      </w:r>
+      <w:r>
+        <w:t>, а в</w:t>
+      </w:r>
+      <w:r>
+        <w:t xml:space="preserve">ъзстановяването </w:t>
+      </w:r>
+      <w:r>
+        <w:t xml:space="preserve">на репутацията </w:t>
+      </w:r>
+      <w:r>
+        <w:t xml:space="preserve">след подобна атака е трудно и скъпо. Засегнати могат да бъдат организации от всякакъв мащаб. </w:t>
+      </w:r>
+      <w:r>
+        <w:rPr>
+          <w:highlight w:val="yellow"/>
+        </w:rPr>
+        <w:t>Последиците се усещат както по време на първоначалното прекъсване, така и дълго след това.</w:t>
+      </w:r>
+      <w:r>
+        <w:t xml:space="preserve"> </w:t>
+      </w:r>
+    </w:p>
+    <w:p>
+      <w:pPr>
+        <w:spacing w:line="360" w:lineRule="auto"/>
+        <w:ind w:firstLine="708"/>
+        <w:rPr>
+          <w:lang w:val="en-US"/>
+        </w:rPr>
+      </w:pPr>
+      <w:r>
+        <w:t>К</w:t>
+      </w:r>
+      <w:r>
+        <w:t xml:space="preserve">омпаниите </w:t>
+      </w:r>
+      <w:r>
+        <w:t>трябва</w:t>
+      </w:r>
+      <w:r>
+        <w:t xml:space="preserve"> да </w:t>
+      </w:r>
+      <w:r>
+        <w:t>провеждат з</w:t>
+      </w:r>
+      <w:r>
+        <w:t>адължителни обучени</w:t>
+      </w:r>
+      <w:r>
+        <w:t>я</w:t>
+      </w:r>
+      <w:r>
+        <w:t xml:space="preserve"> на служителите си, </w:t>
+      </w:r>
+      <w:r>
+        <w:t xml:space="preserve">тъй като </w:t>
+      </w:r>
+      <w:r>
+        <w:rPr>
+          <w:lang w:val="en-US"/>
+        </w:rPr>
+        <w:t>ra</w:t>
+      </w:r>
+      <w:r>
+        <w:rPr>
+          <w:lang w:val="en-US"/>
+        </w:rPr>
+        <w:t>nsomware</w:t>
+      </w:r>
       <w:r>
         <w:t xml:space="preserve"> може да бъде свален през имейл, </w:t>
       </w:r>
       <w:r>
-        <w:rPr>
-          <w:lang w:val="en-US"/>
-        </w:rPr>
-        <w:t>attachments,</w:t>
-      </w:r>
-      <w:r>
-        <w:t xml:space="preserve"> реклами, линкове, уеб страници с вложени злокачествени софтуери. В реферата, ще бъдат разгледани стратегии и защити от </w:t>
+        <w:t>прикачени файлове</w:t>
+      </w:r>
+      <w:r>
+        <w:rPr>
+          <w:lang w:val="en-US"/>
+        </w:rPr>
+        <w:t>,</w:t>
+      </w:r>
+      <w:r>
+        <w:t xml:space="preserve"> реклами, линкове, уеб страници с вложени злокачествени софтуери. В </w:t>
+      </w:r>
+      <w:r>
+        <w:rPr>
+          <w:highlight w:val="yellow"/>
+        </w:rPr>
+        <w:t>реферата</w:t>
+      </w:r>
+      <w:r>
+        <w:t xml:space="preserve">, ще бъдат разгледани стратегии и защити от </w:t>
       </w:r>
       <w:r>
         <w:rPr>
@@ -2872,7 +3046,7 @@
           <w:lang w:val="en-US"/>
         </w:rPr>
       </w:pPr>
-      <w:bookmarkStart w:id="1" w:name="_Toc223468465"/>
+      <w:bookmarkStart w:id="1" w:name="_Toc223545521"/>
       <w:r>
         <w:lastRenderedPageBreak/>
         <w:t xml:space="preserve">История на </w:t>
@@ -2896,22 +3070,71 @@
         <w:tab/>
       </w:r>
       <w:r>
+        <w:rPr>
+          <w:highlight w:val="yellow"/>
+        </w:rPr>
         <w:t xml:space="preserve">Въпреки че </w:t>
       </w:r>
       <w:r>
         <w:rPr>
+          <w:highlight w:val="yellow"/>
           <w:lang w:val="en-US"/>
         </w:rPr>
         <w:t>Ransomware</w:t>
       </w:r>
       <w:r>
-        <w:t xml:space="preserve"> е нашумял последните 10 години, идеята за </w:t>
-      </w:r>
-      <w:r>
+        <w:rPr>
+          <w:highlight w:val="yellow"/>
+        </w:rPr>
+        <w:t xml:space="preserve"> е </w:t>
+      </w:r>
+      <w:r>
+        <w:rPr>
+          <w:highlight w:val="yellow"/>
+        </w:rPr>
+        <w:t>популярен</w:t>
+      </w:r>
+      <w:r>
+        <w:rPr>
+          <w:highlight w:val="yellow"/>
+        </w:rPr>
+        <w:t xml:space="preserve"> последните 10 години, идеята за </w:t>
+      </w:r>
+      <w:r>
+        <w:rPr>
+          <w:highlight w:val="yellow"/>
+        </w:rPr>
         <w:t>кражба</w:t>
       </w:r>
       <w:r>
-        <w:t xml:space="preserve"> на потребителска информация или за заложник чрез криптиране на файлове, отграничаване на достъпа или чрез други методи и по-късно откуп е доста стара.</w:t>
+        <w:rPr>
+          <w:highlight w:val="yellow"/>
+        </w:rPr>
+        <w:t xml:space="preserve"> на потребителска информация</w:t>
+      </w:r>
+      <w:r>
+        <w:rPr>
+          <w:highlight w:val="yellow"/>
+        </w:rPr>
+        <w:t xml:space="preserve">, </w:t>
+      </w:r>
+      <w:r>
+        <w:rPr>
+          <w:highlight w:val="yellow"/>
+        </w:rPr>
+        <w:t xml:space="preserve">ограничаване на достъпа </w:t>
+      </w:r>
+      <w:r>
+        <w:rPr>
+          <w:highlight w:val="yellow"/>
+        </w:rPr>
+        <w:t xml:space="preserve">и изискване на откуп </w:t>
+      </w:r>
+      <w:r>
+        <w:rPr>
+          <w:highlight w:val="yellow"/>
+        </w:rPr>
+        <w:t>е доста стара.</w:t>
       </w:r>
     </w:p>
     <w:p>
@@ -2920,7 +3143,43 @@
       </w:pPr>
       <w:r>
         <w:tab/>
-        <w:t>В края на 80-те години, престъпниците са можели да криптират файлове и са искали валута изпратена през пощенски услуги за откуп. Една от първите документирани</w:t>
+        <w:t xml:space="preserve">В края на 80-те години, </w:t>
+      </w:r>
+      <w:r>
+        <w:t>кибер</w:t>
+      </w:r>
+      <w:r>
+        <w:t>престъпниците са криптира</w:t>
+      </w:r>
+      <w:r>
+        <w:t>ли</w:t>
+      </w:r>
+      <w:r>
+        <w:t xml:space="preserve"> файлове и са искали </w:t>
+      </w:r>
+      <w:r>
+        <w:t xml:space="preserve">откуп в долари, </w:t>
+      </w:r>
+      <w:r>
+        <w:t>изпратен</w:t>
+      </w:r>
+      <w:r>
+        <w:t>и</w:t>
+      </w:r>
+      <w:r>
+        <w:t xml:space="preserve"> </w:t>
+      </w:r>
+      <w:r>
+        <w:t>по</w:t>
+      </w:r>
+      <w:r>
+        <w:t xml:space="preserve"> пощ</w:t>
+      </w:r>
+      <w:r>
+        <w:t xml:space="preserve">ата. </w:t>
+      </w:r>
+      <w:r>
+        <w:t>Една от първите документирани</w:t>
       </w:r>
       <w:r>
         <w:rPr>
@@ -2965,7 +3224,37 @@
         <w:t>”.</w:t>
       </w:r>
       <w:r>
-        <w:t xml:space="preserve"> Разпространяван е чрез флопи дискети през 1989 година. Потърпевшите са накарани да изпратят 189$ през пощенска кутия в Панама, за да възстановят достъпа до системите си, въпреки че методът за криптирани е бил сравнително прост – чрез симетрично криптиране. Симетричното криптиране  е техника, където един и същи ключ се използва за криптиране и декриптиране на данните. </w:t>
+        <w:t xml:space="preserve"> </w:t>
+      </w:r>
+      <w:r>
+        <w:t>Троянският кон е раз</w:t>
+      </w:r>
+      <w:r>
+        <w:t xml:space="preserve">пространяван чрез флопи дискети през 1989 година. Потърпевшите са </w:t>
+      </w:r>
+      <w:r>
+        <w:t>принудени д</w:t>
+      </w:r>
+      <w:r>
+        <w:t>а изпратят 189$ през пощенска кутия в Панама, за да възстановят достъпа до системите си</w:t>
+      </w:r>
+      <w:r>
+        <w:t>. М</w:t>
+      </w:r>
+      <w:r>
+        <w:t>етодът за криптиран</w:t>
+      </w:r>
+      <w:r>
+        <w:t>е</w:t>
+      </w:r>
+      <w:r>
+        <w:t xml:space="preserve"> е бил сравнително прост – чрез симетрично криптиране. Симетричното криптиране  е техника, </w:t>
+      </w:r>
+      <w:r>
+        <w:t>при която</w:t>
+      </w:r>
+      <w:r>
+        <w:t xml:space="preserve"> един и същи ключ се използва за криптиране и декриптиране на данните. </w:t>
       </w:r>
     </w:p>
     <w:p>
@@ -2982,10 +3271,64 @@
         <w:t>Ransomware</w:t>
       </w:r>
       <w:r>
-        <w:t xml:space="preserve"> става широко разпространен чак през ранните две хилядни</w:t>
-      </w:r>
-      <w:r>
-        <w:t xml:space="preserve"> – вероятно поради трудността хакера да си получи откупа. Появата на биткойна и криптовалутите променят това. Лесен и удобен начин е за получаване на крупната сума от потърпевшия като остават незабелязани. При традиционното банкиране участниците са ясно идентифицирани – име, банка, държава, регулации и т.н. При криптовалутите адрес на сметката не съдържа директна лична информация. Липсва и централизиран контролен орган. Преводите са почти невъзможни да бъдат спрени, замразени, върнати или проследени от институциите.  Изпирането на валутата е сравнително лесно – чрез т.нар. </w:t>
+        <w:t xml:space="preserve"> става широко разпространен </w:t>
+      </w:r>
+      <w:r>
+        <w:t xml:space="preserve">от 2000 г. до настоящия момент. Преди 2000 г. киберпрестъпниците са имали затруднения при получаването на откуп. </w:t>
+      </w:r>
+      <w:r>
+        <w:t xml:space="preserve">Появата на биткойна и криптовалутите променят това. </w:t>
+      </w:r>
+      <w:r>
+        <w:t>Криптовалутите са л</w:t>
+      </w:r>
+      <w:r>
+        <w:t>есен и удобен начин за получаване на крупната сума от потърпевшия</w:t>
+      </w:r>
+      <w:r>
+        <w:t>, тъй като са трудно проследими.</w:t>
+      </w:r>
+      <w:r>
+        <w:t xml:space="preserve"> При традиционното банкиране участниците са ясно идентифицирани – име, банка, </w:t>
+      </w:r>
+      <w:r>
+        <w:t xml:space="preserve">сметки, наличности, </w:t>
+      </w:r>
+      <w:r>
+        <w:t>държава, регулации и т.н. При криптовалутите адрес</w:t>
+      </w:r>
+      <w:r>
+        <w:t xml:space="preserve">ът на получателя </w:t>
+      </w:r>
+      <w:r>
+        <w:t xml:space="preserve">на сметката не съдържа директна лична информация. Липсва и централизиран контролен орган. </w:t>
+      </w:r>
+      <w:r>
+        <w:t>П</w:t>
+      </w:r>
+      <w:r>
+        <w:t>очти невъзможн</w:t>
+      </w:r>
+      <w:r>
+        <w:t>о е п</w:t>
+      </w:r>
+      <w:r>
+        <w:t xml:space="preserve">реводите </w:t>
+      </w:r>
+      <w:r>
+        <w:t xml:space="preserve">да бъдат спрени, замразени, върнати или проследени от институциите.  </w:t>
+      </w:r>
+      <w:r>
+        <w:t>„</w:t>
+      </w:r>
+      <w:r>
+        <w:t>Изпирането</w:t>
+      </w:r>
+      <w:r>
+        <w:t>“</w:t>
+      </w:r>
+      <w:r>
+        <w:t xml:space="preserve"> на валутата е сравнително лесно – чрез т.нар. </w:t>
       </w:r>
       <w:r>
         <w:rPr>
@@ -3003,10 +3346,73 @@
         <w:t>privacy coins.</w:t>
       </w:r>
       <w:r>
-        <w:t xml:space="preserve"> Минус на биткойна, е че не всяка жертва е достатъчно запознат как да го предостави и да се откупи. Някои от хакерите са заловени, понеже са </w:t>
-      </w:r>
-      <w:r>
-        <w:t>пускали видеоконференции, за да покажат как да го направят.</w:t>
+        <w:t xml:space="preserve"> </w:t>
+      </w:r>
+      <w:r>
+        <w:t>Отрицателната страна</w:t>
+      </w:r>
+      <w:r>
+        <w:t xml:space="preserve"> на биткойна е</w:t>
+      </w:r>
+      <w:r>
+        <w:t>,</w:t>
+      </w:r>
+      <w:r>
+        <w:t xml:space="preserve"> че не вс</w:t>
+      </w:r>
+      <w:r>
+        <w:t>е</w:t>
+      </w:r>
+      <w:r>
+        <w:t>к</w:t>
+      </w:r>
+      <w:r>
+        <w:t>и</w:t>
+      </w:r>
+      <w:r>
+        <w:t xml:space="preserve"> </w:t>
+      </w:r>
+      <w:r>
+        <w:t>потърпевш</w:t>
+      </w:r>
+      <w:r>
+        <w:t xml:space="preserve"> е достатъчно запознат как да го предостави</w:t>
+      </w:r>
+      <w:r>
+        <w:t xml:space="preserve">, за да си върне информацията. </w:t>
+      </w:r>
+      <w:r>
+        <w:t xml:space="preserve">Някои от </w:t>
+      </w:r>
+      <w:r>
+        <w:t>компютърните престъпници</w:t>
+      </w:r>
+      <w:r>
+        <w:t xml:space="preserve"> са </w:t>
+      </w:r>
+      <w:r>
+        <w:t xml:space="preserve">разкрити и </w:t>
+      </w:r>
+      <w:r>
+        <w:t xml:space="preserve">заловени, </w:t>
+      </w:r>
+      <w:r>
+        <w:t>защото са провеждали</w:t>
+      </w:r>
+      <w:r>
+        <w:t xml:space="preserve"> видеоконференции, </w:t>
+      </w:r>
+      <w:r>
+        <w:t xml:space="preserve">на които са показвали на засегнатите как </w:t>
+      </w:r>
+      <w:r>
+        <w:t xml:space="preserve">да </w:t>
+      </w:r>
+      <w:r>
+        <w:t>предоставят биткойна</w:t>
+      </w:r>
+      <w:r>
+        <w:t>.</w:t>
       </w:r>
     </w:p>
     <w:p>
@@ -3041,34 +3447,62 @@
       </w:r>
       <w:proofErr w:type="spellEnd"/>
       <w:r>
-        <w:t xml:space="preserve"> и прилага по-съвременни криптографски методи. Той използва 2048-</w:t>
-      </w:r>
-      <w:r>
-        <w:rPr>
+        <w:t xml:space="preserve"> и прилага по-съвременни криптографски методи. </w:t>
+      </w:r>
+      <w:r>
+        <w:rPr>
+          <w:highlight w:val="yellow"/>
+        </w:rPr>
+        <w:t>Той използва 2048-</w:t>
+      </w:r>
+      <w:r>
+        <w:rPr>
+          <w:highlight w:val="yellow"/>
           <w:lang w:val="en-US"/>
         </w:rPr>
         <w:t>bit</w:t>
       </w:r>
       <w:r>
+        <w:rPr>
+          <w:highlight w:val="yellow"/>
+        </w:rPr>
         <w:t xml:space="preserve"> </w:t>
       </w:r>
       <w:r>
         <w:rPr>
+          <w:highlight w:val="yellow"/>
           <w:lang w:val="en-US"/>
         </w:rPr>
         <w:t xml:space="preserve">RSA </w:t>
       </w:r>
       <w:r>
         <w:rPr>
+          <w:highlight w:val="yellow"/>
           <w:lang w:val="en-US"/>
         </w:rPr>
         <w:t>key pairs</w:t>
       </w:r>
       <w:r>
-        <w:t>, генерирани от командно-контролен сървър и изпращани към жертвата.</w:t>
-      </w:r>
-      <w:r>
-        <w:rPr>
+        <w:rPr>
+          <w:highlight w:val="yellow"/>
+        </w:rPr>
+        <w:t xml:space="preserve">, генерирани от командно-контролен сървър и изпращани към </w:t>
+      </w:r>
+      <w:r>
+        <w:rPr>
+          <w:highlight w:val="yellow"/>
+        </w:rPr>
+        <w:t>пострадалия</w:t>
+      </w:r>
+      <w:r>
+        <w:rPr>
+          <w:highlight w:val="yellow"/>
+        </w:rPr>
+        <w:t>.</w:t>
+      </w:r>
+      <w:r>
+        <w:rPr>
+          <w:highlight w:val="yellow"/>
           <w:lang w:val="en-US"/>
         </w:rPr>
         <w:t xml:space="preserve"> </w:t>
@@ -3076,6 +3510,7 @@
       <w:sdt>
         <w:sdtPr>
           <w:rPr>
+            <w:highlight w:val="yellow"/>
             <w:lang w:val="en-US"/>
           </w:rPr>
           <w:id w:val="1977027603"/>
@@ -3084,15 +3519,20 @@
         <w:sdtContent>
           <w:r>
             <w:rPr>
+              <w:highlight w:val="yellow"/>
               <w:lang w:val="en-US"/>
             </w:rPr>
             <w:fldChar w:fldCharType="begin"/>
           </w:r>
           <w:r>
+            <w:rPr>
+              <w:highlight w:val="yellow"/>
+            </w:rPr>
             <w:instrText xml:space="preserve"> CITATION Kur22 \l 1026 </w:instrText>
           </w:r>
           <w:r>
             <w:rPr>
+              <w:highlight w:val="yellow"/>
               <w:lang w:val="en-US"/>
             </w:rPr>
             <w:fldChar w:fldCharType="separate"/>
@@ -3100,11 +3540,13 @@
           <w:r>
             <w:rPr>
               <w:noProof/>
+              <w:highlight w:val="yellow"/>
             </w:rPr>
             <w:t>[3]</w:t>
           </w:r>
           <w:r>
             <w:rPr>
+              <w:highlight w:val="yellow"/>
               <w:lang w:val="en-US"/>
             </w:rPr>
             <w:fldChar w:fldCharType="end"/>
@@ -3121,7 +3563,7 @@
       <w:pPr>
         <w:pStyle w:val="Heading1"/>
       </w:pPr>
-      <w:bookmarkStart w:id="2" w:name="_Toc223468466"/>
+      <w:bookmarkStart w:id="2" w:name="_Toc223545522"/>
       <w:r>
         <w:lastRenderedPageBreak/>
         <w:t xml:space="preserve">Еволюция на </w:t>
@@ -3148,7 +3590,7 @@
           <w:numId w:val="2"/>
         </w:numPr>
       </w:pPr>
-      <w:bookmarkStart w:id="3" w:name="_Toc223468467"/>
+      <w:bookmarkStart w:id="3" w:name="_Toc223545523"/>
       <w:r>
         <w:t xml:space="preserve">Ранна фаза на </w:t>
       </w:r>
@@ -3166,7 +3608,13 @@
         <w:ind w:firstLine="708"/>
       </w:pPr>
       <w:r>
-        <w:t>Първичната форма на софтуера за изнудване е, както вече споменахме, инфектирани флопидискове</w:t>
+        <w:t>Първичната форма на софтуера за изнудване е, както вече споменахме, инфектирани флопи</w:t>
+      </w:r>
+      <w:r>
+        <w:t xml:space="preserve"> </w:t>
+      </w:r>
+      <w:r>
+        <w:t>дискове</w:t>
       </w:r>
       <w:r>
         <w:rPr>
@@ -3181,7 +3629,13 @@
         <w:t>1</w:t>
       </w:r>
       <w:r>
-        <w:t xml:space="preserve"> е показано, съобщението, което се визуализира на системата афектирана от троянския кон - </w:t>
+        <w:t xml:space="preserve"> е показано съобщението, което се визуализира на системата</w:t>
+      </w:r>
+      <w:r>
+        <w:t>,</w:t>
+      </w:r>
+      <w:r>
+        <w:t xml:space="preserve"> афектирана от троянския кон - </w:t>
       </w:r>
       <w:r>
         <w:t xml:space="preserve">AIDS </w:t>
@@ -3232,7 +3686,19 @@
         <w:t xml:space="preserve"> </w:t>
       </w:r>
       <w:r>
-        <w:t xml:space="preserve">файла, който по-късно се използва да преброи колко пъти компютъра е стартиран. Когато стигне до 90, </w:t>
+        <w:t>файла, който по-късно се използва да преброи колко пъти компютър</w:t>
+      </w:r>
+      <w:r>
+        <w:t>ът</w:t>
+      </w:r>
+      <w:r>
+        <w:t xml:space="preserve"> е стартиран. Когато </w:t>
+      </w:r>
+      <w:r>
+        <w:t>броячът до</w:t>
+      </w:r>
+      <w:r>
+        <w:t xml:space="preserve">стигне до 90, </w:t>
       </w:r>
       <w:r>
         <w:rPr>
@@ -3241,7 +3707,13 @@
         <w:t>AIDS</w:t>
       </w:r>
       <w:r>
-        <w:t xml:space="preserve"> скрива всички директории и криптира имената на всички файлове намиращи се на </w:t>
+        <w:t xml:space="preserve"> скрива всички директории и криптира имената на всички файлове</w:t>
+      </w:r>
+      <w:r>
+        <w:t>,</w:t>
+      </w:r>
+      <w:r>
+        <w:t xml:space="preserve"> намиращи се на </w:t>
       </w:r>
       <w:r>
         <w:rPr>
@@ -3250,6 +3722,16 @@
           <w:lang w:val="en-US"/>
         </w:rPr>
         <w:t>C:</w:t>
+      </w:r>
+      <w:r>
+        <w:rPr>
+          <w:b/>
+          <w:bCs/>
+        </w:rPr>
+        <w:t xml:space="preserve"> </w:t>
+      </w:r>
+      <w:r>
+        <w:t>драйв</w:t>
       </w:r>
       <w:r>
         <w:rPr>
@@ -3369,14 +3851,27 @@
       <w:r>
         <w:t xml:space="preserve">Фигура </w:t>
       </w:r>
-      <w:fldSimple w:instr=" SEQ Фигура \* ARABIC ">
-        <w:r>
-          <w:rPr>
-            <w:noProof/>
-          </w:rPr>
-          <w:t>1</w:t>
-        </w:r>
-      </w:fldSimple>
+      <w:r>
+        <w:fldChar w:fldCharType="begin"/>
+      </w:r>
+      <w:r>
+        <w:instrText xml:space="preserve"> SEQ Фигура \* ARABIC </w:instrText>
+      </w:r>
+      <w:r>
+        <w:fldChar w:fldCharType="separate"/>
+      </w:r>
+      <w:r>
+        <w:rPr>
+          <w:noProof/>
+        </w:rPr>
+        <w:t>1</w:t>
+      </w:r>
+      <w:r>
+        <w:rPr>
+          <w:noProof/>
+        </w:rPr>
+        <w:fldChar w:fldCharType="end"/>
+      </w:r>
       <w:r>
         <w:rPr>
           <w:lang w:val="en-US"/>
@@ -3402,7 +3897,7 @@
           <w:sz w:val="20"/>
           <w:szCs w:val="20"/>
         </w:rPr>
-        <w:t xml:space="preserve">ъобщението за откуп на </w:t>
+        <w:t xml:space="preserve">ъобщение за откуп на </w:t>
       </w:r>
       <w:r>
         <w:rPr>
@@ -3436,7 +3931,7 @@
           <w:numId w:val="2"/>
         </w:numPr>
       </w:pPr>
-      <w:bookmarkStart w:id="5" w:name="_Toc223468468"/>
+      <w:bookmarkStart w:id="5" w:name="_Toc223545524"/>
       <w:r>
         <w:rPr>
           <w:lang w:val="en-US"/>
@@ -3490,7 +3985,13 @@
         <w:t xml:space="preserve"> Trojan</w:t>
       </w:r>
       <w:r>
-        <w:t xml:space="preserve"> е първият вирус да използва асиметричен алгоритъм за криптиране на данни – </w:t>
+        <w:t xml:space="preserve"> е първият вирус</w:t>
+      </w:r>
+      <w:r>
+        <w:t xml:space="preserve">, който </w:t>
+      </w:r>
+      <w:r>
+        <w:t xml:space="preserve">използва асиметричен алгоритъм за криптиране на данни – </w:t>
       </w:r>
       <w:r>
         <w:rPr>
@@ -3499,7 +4000,13 @@
         <w:t>RSA</w:t>
       </w:r>
       <w:r>
-        <w:t xml:space="preserve"> (фиг. 3). </w:t>
+        <w:t xml:space="preserve"> (фиг. </w:t>
+      </w:r>
+      <w:r>
+        <w:t>2</w:t>
+      </w:r>
+      <w:r>
+        <w:t xml:space="preserve">). </w:t>
       </w:r>
       <w:sdt>
         <w:sdtPr>
@@ -3598,14 +4105,27 @@
       <w:r>
         <w:t xml:space="preserve">Фигура </w:t>
       </w:r>
-      <w:fldSimple w:instr=" SEQ Фигура \* ARABIC ">
-        <w:r>
-          <w:rPr>
-            <w:noProof/>
-          </w:rPr>
-          <w:t>2</w:t>
-        </w:r>
-      </w:fldSimple>
+      <w:r>
+        <w:fldChar w:fldCharType="begin"/>
+      </w:r>
+      <w:r>
+        <w:instrText xml:space="preserve"> SEQ Фигура \* ARABIC </w:instrText>
+      </w:r>
+      <w:r>
+        <w:fldChar w:fldCharType="separate"/>
+      </w:r>
+      <w:r>
+        <w:rPr>
+          <w:noProof/>
+        </w:rPr>
+        <w:t>2</w:t>
+      </w:r>
+      <w:r>
+        <w:rPr>
+          <w:noProof/>
+        </w:rPr>
+        <w:fldChar w:fldCharType="end"/>
+      </w:r>
       <w:r>
         <w:rPr>
           <w:lang w:val="en-US"/>
@@ -3675,13 +4195,52 @@
         <w:ind w:firstLine="708"/>
       </w:pPr>
       <w:r>
-        <w:t xml:space="preserve">Алгоритъмът използва два ключа, с които се криптира и декриптира информация. </w:t>
-      </w:r>
-      <w:r>
-        <w:t>Основната идея е имайки единия ключ да е математически много трудно да бъде изчислен какъв е другия. По този начин става възможно свободно</w:t>
-      </w:r>
-      <w:r>
-        <w:t>то използвана на</w:t>
+        <w:t xml:space="preserve">Алгоритъмът използва два ключа, </w:t>
+      </w:r>
+      <w:r>
+        <w:t>чрез</w:t>
+      </w:r>
+      <w:r>
+        <w:t xml:space="preserve"> които се криптира и декриптира информация. </w:t>
+      </w:r>
+      <w:r>
+        <w:t>Основната идея е</w:t>
+      </w:r>
+      <w:r>
+        <w:t>:</w:t>
+      </w:r>
+      <w:r>
+        <w:t xml:space="preserve"> </w:t>
+      </w:r>
+      <w:r>
+        <w:t>разполагайки с</w:t>
+      </w:r>
+      <w:r>
+        <w:t xml:space="preserve"> единия ключ да е </w:t>
+      </w:r>
+      <w:r>
+        <w:t>много трудно</w:t>
+      </w:r>
+      <w:r>
+        <w:t xml:space="preserve"> </w:t>
+      </w:r>
+      <w:r>
+        <w:t>математически да бъде изчислен какъв е другия</w:t>
+      </w:r>
+      <w:r>
+        <w:t>т</w:t>
+      </w:r>
+      <w:r>
+        <w:t>. По този начин става възможно свободно</w:t>
+      </w:r>
+      <w:r>
+        <w:t>то използван</w:t>
+      </w:r>
+      <w:r>
+        <w:t>е</w:t>
+      </w:r>
+      <w:r>
+        <w:t xml:space="preserve"> на</w:t>
       </w:r>
       <w:r>
         <w:t xml:space="preserve"> единия от ключовете като "публичен"</w:t>
@@ -3690,10 +4249,52 @@
         <w:t>,</w:t>
       </w:r>
       <w:r>
-        <w:t xml:space="preserve"> а другия да остане "таен" (само собственика го притежава и никой друг не може в разумно време да го намери).</w:t>
-      </w:r>
-      <w:r>
-        <w:t xml:space="preserve"> Хакерът притежава частния ключ.</w:t>
+        <w:t xml:space="preserve"> а другия</w:t>
+      </w:r>
+      <w:r>
+        <w:t>т</w:t>
+      </w:r>
+      <w:r>
+        <w:t xml:space="preserve"> да остане "таен" (само собственик</w:t>
+      </w:r>
+      <w:r>
+        <w:t>ът</w:t>
+      </w:r>
+      <w:r>
+        <w:t xml:space="preserve"> го притежава и никой друг не може в разумно време да го намери).</w:t>
+      </w:r>
+      <w:r>
+        <w:t xml:space="preserve"> </w:t>
+      </w:r>
+      <w:r>
+        <w:t xml:space="preserve">В конкретния случай </w:t>
+      </w:r>
+      <w:r>
+        <w:t>х</w:t>
+      </w:r>
+      <w:r>
+        <w:t>акерът</w:t>
+      </w:r>
+      <w:r>
+        <w:t xml:space="preserve"> играе роля на собственик, който </w:t>
+      </w:r>
+      <w:r>
+        <w:t xml:space="preserve">притежава частния </w:t>
+      </w:r>
+      <w:r>
+        <w:t>(</w:t>
+      </w:r>
+      <w:r>
+        <w:t>тайния</w:t>
+      </w:r>
+      <w:r>
+        <w:t>)</w:t>
+      </w:r>
+      <w:r>
+        <w:t xml:space="preserve"> </w:t>
+      </w:r>
+      <w:r>
+        <w:t>ключ.</w:t>
       </w:r>
       <w:r>
         <w:t xml:space="preserve"> </w:t>
@@ -3802,22 +4403,38 @@
       </w:r>
       <w:proofErr w:type="spellEnd"/>
       <w:r>
-        <w:t xml:space="preserve"> директорията (фиг. 4) и изисква от потърпевшия да закупи артикули от онлайн аптека, в замяна ще получи 30 символен код, за да възстанови всичките си файлове.</w:t>
-      </w:r>
-      <w:r>
-        <w:t xml:space="preserve"> Известен „недостатък“ на вируса, е че дори жертвата да заплати откупа</w:t>
+        <w:t xml:space="preserve"> директорията (фиг. </w:t>
+      </w:r>
+      <w:r>
+        <w:t>3</w:t>
+      </w:r>
+      <w:r>
+        <w:t>) и изисква от потърпевшия да закупи артикули от онлайн аптека, в замяна ще получи 30 символен код, за да възстанови всичките си файлове.</w:t>
+      </w:r>
+      <w:r>
+        <w:t xml:space="preserve"> Известен „недостатък“ на вируса е</w:t>
       </w:r>
       <w:r>
         <w:t>,</w:t>
       </w:r>
       <w:r>
+        <w:t xml:space="preserve"> че дори </w:t>
+      </w:r>
+      <w:r>
+        <w:t>пострадалият</w:t>
+      </w:r>
+      <w:r>
+        <w:t xml:space="preserve"> да заплати откупа</w:t>
+      </w:r>
+      <w:r>
+        <w:t>,</w:t>
+      </w:r>
+      <w:r>
         <w:t xml:space="preserve"> някои от файловете остават </w:t>
       </w:r>
-      <w:proofErr w:type="spellStart"/>
-      <w:r>
-        <w:t>коруптнати</w:t>
-      </w:r>
-      <w:proofErr w:type="spellEnd"/>
+      <w:r>
+        <w:t>безвъзвратно увредени</w:t>
+      </w:r>
       <w:r>
         <w:t xml:space="preserve">. </w:t>
       </w:r>
@@ -3927,14 +4544,27 @@
       <w:r>
         <w:t xml:space="preserve">Фигура </w:t>
       </w:r>
-      <w:fldSimple w:instr=" SEQ Фигура \* ARABIC ">
-        <w:r>
-          <w:rPr>
-            <w:noProof/>
-          </w:rPr>
-          <w:t>3</w:t>
-        </w:r>
-      </w:fldSimple>
+      <w:r>
+        <w:fldChar w:fldCharType="begin"/>
+      </w:r>
+      <w:r>
+        <w:instrText xml:space="preserve"> SEQ Фигура \* ARABIC </w:instrText>
+      </w:r>
+      <w:r>
+        <w:fldChar w:fldCharType="separate"/>
+      </w:r>
+      <w:r>
+        <w:rPr>
+          <w:noProof/>
+        </w:rPr>
+        <w:t>3</w:t>
+      </w:r>
+      <w:r>
+        <w:rPr>
+          <w:noProof/>
+        </w:rPr>
+        <w:fldChar w:fldCharType="end"/>
+      </w:r>
       <w:r>
         <w:rPr>
           <w:lang w:val="en-US"/>
@@ -3989,7 +4619,7 @@
           <w:lang w:val="en-US"/>
         </w:rPr>
       </w:pPr>
-      <w:bookmarkStart w:id="8" w:name="_Toc223468469"/>
+      <w:bookmarkStart w:id="8" w:name="_Toc223545525"/>
       <w:r>
         <w:rPr>
           <w:lang w:val="en-US"/>
@@ -4318,14 +4948,27 @@
       <w:r>
         <w:t xml:space="preserve">Фигура </w:t>
       </w:r>
-      <w:fldSimple w:instr=" SEQ Фигура \* ARABIC ">
-        <w:r>
-          <w:rPr>
-            <w:noProof/>
-          </w:rPr>
-          <w:t>4</w:t>
-        </w:r>
-      </w:fldSimple>
+      <w:r>
+        <w:fldChar w:fldCharType="begin"/>
+      </w:r>
+      <w:r>
+        <w:instrText xml:space="preserve"> SEQ Фигура \* ARABIC </w:instrText>
+      </w:r>
+      <w:r>
+        <w:fldChar w:fldCharType="separate"/>
+      </w:r>
+      <w:r>
+        <w:rPr>
+          <w:noProof/>
+        </w:rPr>
+        <w:t>4</w:t>
+      </w:r>
+      <w:r>
+        <w:rPr>
+          <w:noProof/>
+        </w:rPr>
+        <w:fldChar w:fldCharType="end"/>
+      </w:r>
       <w:r>
         <w:t xml:space="preserve">: </w:t>
       </w:r>
@@ -4427,14 +5070,27 @@
       <w:r>
         <w:t xml:space="preserve">Фигура </w:t>
       </w:r>
-      <w:fldSimple w:instr=" SEQ Фигура \* ARABIC ">
-        <w:r>
-          <w:rPr>
-            <w:noProof/>
-          </w:rPr>
-          <w:t>5</w:t>
-        </w:r>
-      </w:fldSimple>
+      <w:r>
+        <w:fldChar w:fldCharType="begin"/>
+      </w:r>
+      <w:r>
+        <w:instrText xml:space="preserve"> SEQ Фигура \* ARABIC </w:instrText>
+      </w:r>
+      <w:r>
+        <w:fldChar w:fldCharType="separate"/>
+      </w:r>
+      <w:r>
+        <w:rPr>
+          <w:noProof/>
+        </w:rPr>
+        <w:t>5</w:t>
+      </w:r>
+      <w:r>
+        <w:rPr>
+          <w:noProof/>
+        </w:rPr>
+        <w:fldChar w:fldCharType="end"/>
+      </w:r>
       <w:r>
         <w:t xml:space="preserve">: </w:t>
       </w:r>
@@ -4470,7 +5126,7 @@
           <w:lang w:val="en-US"/>
         </w:rPr>
       </w:pPr>
-      <w:bookmarkStart w:id="11" w:name="_Toc223468470"/>
+      <w:bookmarkStart w:id="11" w:name="_Toc223545526"/>
       <w:r>
         <w:rPr>
           <w:lang w:val="en-US"/>
@@ -4632,14 +5288,27 @@
       <w:r>
         <w:t xml:space="preserve">Фигура </w:t>
       </w:r>
-      <w:fldSimple w:instr=" SEQ Фигура \* ARABIC ">
-        <w:r>
-          <w:rPr>
-            <w:noProof/>
-          </w:rPr>
-          <w:t>6</w:t>
-        </w:r>
-      </w:fldSimple>
+      <w:r>
+        <w:fldChar w:fldCharType="begin"/>
+      </w:r>
+      <w:r>
+        <w:instrText xml:space="preserve"> SEQ Фигура \* ARABIC </w:instrText>
+      </w:r>
+      <w:r>
+        <w:fldChar w:fldCharType="separate"/>
+      </w:r>
+      <w:r>
+        <w:rPr>
+          <w:noProof/>
+        </w:rPr>
+        <w:t>6</w:t>
+      </w:r>
+      <w:r>
+        <w:rPr>
+          <w:noProof/>
+        </w:rPr>
+        <w:fldChar w:fldCharType="end"/>
+      </w:r>
       <w:r>
         <w:t xml:space="preserve">: </w:t>
       </w:r>
@@ -4672,7 +5341,7 @@
           <w:numId w:val="2"/>
         </w:numPr>
       </w:pPr>
-      <w:bookmarkStart w:id="13" w:name="_Toc223468471"/>
+      <w:bookmarkStart w:id="13" w:name="_Toc223545527"/>
       <w:r>
         <w:rPr>
           <w:lang w:val="en-US"/>
@@ -4759,14 +5428,27 @@
       <w:r>
         <w:t xml:space="preserve">Фигура </w:t>
       </w:r>
-      <w:fldSimple w:instr=" SEQ Фигура \* ARABIC ">
-        <w:r>
-          <w:rPr>
-            <w:noProof/>
-          </w:rPr>
-          <w:t>7</w:t>
-        </w:r>
-      </w:fldSimple>
+      <w:r>
+        <w:fldChar w:fldCharType="begin"/>
+      </w:r>
+      <w:r>
+        <w:instrText xml:space="preserve"> SEQ Фигура \* ARABIC </w:instrText>
+      </w:r>
+      <w:r>
+        <w:fldChar w:fldCharType="separate"/>
+      </w:r>
+      <w:r>
+        <w:rPr>
+          <w:noProof/>
+        </w:rPr>
+        <w:t>7</w:t>
+      </w:r>
+      <w:r>
+        <w:rPr>
+          <w:noProof/>
+        </w:rPr>
+        <w:fldChar w:fldCharType="end"/>
+      </w:r>
       <w:r>
         <w:t xml:space="preserve">: </w:t>
       </w:r>
@@ -4943,8 +5625,13 @@
         </w:rPr>
         <w:t>ransomware-</w:t>
       </w:r>
-      <w:r>
-        <w:t>ът и се изисква откуп в биткойни.</w:t>
+      <w:proofErr w:type="spellStart"/>
+      <w:r>
+        <w:t>ът</w:t>
+      </w:r>
+      <w:proofErr w:type="spellEnd"/>
+      <w:r>
+        <w:t xml:space="preserve"> и се изисква откуп в биткойни.</w:t>
       </w:r>
     </w:p>
     <w:p>
@@ -4962,7 +5649,7 @@
           <w:lang w:val="en-US"/>
         </w:rPr>
       </w:pPr>
-      <w:bookmarkStart w:id="15" w:name="_Toc223468472"/>
+      <w:bookmarkStart w:id="15" w:name="_Toc223545528"/>
       <w:r>
         <w:lastRenderedPageBreak/>
         <w:t xml:space="preserve">Ролята на </w:t>
@@ -5269,6 +5956,9 @@
         <w:jc w:val="center"/>
       </w:pPr>
       <w:r>
+        <w:rPr>
+          <w:noProof/>
+        </w:rPr>
         <w:drawing>
           <wp:inline distT="0" distB="0" distL="0" distR="0" wp14:anchorId="02891911" wp14:editId="4B6B4122">
             <wp:extent cx="5427980" cy="2679773"/>
@@ -5376,7 +6066,7 @@
           <w:lang w:val="en-US"/>
         </w:rPr>
       </w:pPr>
-      <w:bookmarkStart w:id="16" w:name="_Toc223468473"/>
+      <w:bookmarkStart w:id="16" w:name="_Toc223545529"/>
       <w:r>
         <w:lastRenderedPageBreak/>
         <w:t xml:space="preserve">Имплементация на </w:t>
@@ -5730,14 +6420,27 @@
       <w:r>
         <w:t xml:space="preserve">Фигура </w:t>
       </w:r>
-      <w:fldSimple w:instr=" SEQ Фигура \* ARABIC ">
-        <w:r>
-          <w:rPr>
-            <w:noProof/>
-          </w:rPr>
-          <w:t>9</w:t>
-        </w:r>
-      </w:fldSimple>
+      <w:r>
+        <w:fldChar w:fldCharType="begin"/>
+      </w:r>
+      <w:r>
+        <w:instrText xml:space="preserve"> SEQ Фигура \* ARABIC </w:instrText>
+      </w:r>
+      <w:r>
+        <w:fldChar w:fldCharType="separate"/>
+      </w:r>
+      <w:r>
+        <w:rPr>
+          <w:noProof/>
+        </w:rPr>
+        <w:t>9</w:t>
+      </w:r>
+      <w:r>
+        <w:rPr>
+          <w:noProof/>
+        </w:rPr>
+        <w:fldChar w:fldCharType="end"/>
+      </w:r>
       <w:r>
         <w:t>:</w:t>
       </w:r>
@@ -5868,15 +6571,7 @@
         <w:t xml:space="preserve">    </w:t>
       </w:r>
       <w:r>
-        <w:t xml:space="preserve">String </w:t>
-      </w:r>
-      <w:proofErr w:type="gramStart"/>
-      <w:r>
-        <w:t>decrypt(</w:t>
-      </w:r>
-      <w:proofErr w:type="gramEnd"/>
-      <w:r>
-        <w:t xml:space="preserve">String </w:t>
+        <w:t xml:space="preserve">String decrypt(String </w:t>
       </w:r>
       <w:proofErr w:type="spellStart"/>
       <w:r>
@@ -5899,14 +6594,27 @@
       <w:r>
         <w:t xml:space="preserve">Фигура </w:t>
       </w:r>
-      <w:fldSimple w:instr=" SEQ Фигура \* ARABIC ">
-        <w:r>
-          <w:rPr>
-            <w:noProof/>
-          </w:rPr>
-          <w:t>10</w:t>
-        </w:r>
-      </w:fldSimple>
+      <w:r>
+        <w:fldChar w:fldCharType="begin"/>
+      </w:r>
+      <w:r>
+        <w:instrText xml:space="preserve"> SEQ Фигура \* ARABIC </w:instrText>
+      </w:r>
+      <w:r>
+        <w:fldChar w:fldCharType="separate"/>
+      </w:r>
+      <w:r>
+        <w:rPr>
+          <w:noProof/>
+        </w:rPr>
+        <w:t>10</w:t>
+      </w:r>
+      <w:r>
+        <w:rPr>
+          <w:noProof/>
+        </w:rPr>
+        <w:fldChar w:fldCharType="end"/>
+      </w:r>
       <w:r>
         <w:rPr>
           <w:lang w:val="en-US"/>
@@ -5964,7 +6672,6 @@
         <w:t xml:space="preserve">    return new </w:t>
       </w:r>
       <w:proofErr w:type="spellStart"/>
-      <w:proofErr w:type="gramStart"/>
       <w:r>
         <w:t>HexEncodingTextEncryptor</w:t>
       </w:r>
@@ -5980,11 +6687,7 @@
         <w:t>standard</w:t>
       </w:r>
       <w:r>
-        <w:t>(</w:t>
-      </w:r>
-      <w:proofErr w:type="gramEnd"/>
-      <w:r>
-        <w:t>password, salt));</w:t>
+        <w:t>(password, salt));</w:t>
       </w:r>
       <w:r>
         <w:br/>
@@ -5999,14 +6702,27 @@
       <w:r>
         <w:t xml:space="preserve">Фигура </w:t>
       </w:r>
-      <w:fldSimple w:instr=" SEQ Фигура \* ARABIC ">
-        <w:r>
-          <w:rPr>
-            <w:noProof/>
-          </w:rPr>
-          <w:t>11</w:t>
-        </w:r>
-      </w:fldSimple>
+      <w:r>
+        <w:fldChar w:fldCharType="begin"/>
+      </w:r>
+      <w:r>
+        <w:instrText xml:space="preserve"> SEQ Фигура \* ARABIC </w:instrText>
+      </w:r>
+      <w:r>
+        <w:fldChar w:fldCharType="separate"/>
+      </w:r>
+      <w:r>
+        <w:rPr>
+          <w:noProof/>
+        </w:rPr>
+        <w:t>11</w:t>
+      </w:r>
+      <w:r>
+        <w:rPr>
+          <w:noProof/>
+        </w:rPr>
+        <w:fldChar w:fldCharType="end"/>
+      </w:r>
       <w:r>
         <w:t>: Метод от класа, която се използва в демото</w:t>
       </w:r>
@@ -6837,7 +7553,7 @@
           <w:lang w:val="en-US"/>
         </w:rPr>
       </w:pPr>
-      <w:bookmarkStart w:id="18" w:name="_Toc223468474"/>
+      <w:bookmarkStart w:id="18" w:name="_Toc223545530"/>
       <w:r>
         <w:lastRenderedPageBreak/>
         <w:t xml:space="preserve">Демонстрация на </w:t>
@@ -6854,7 +7570,7 @@
       <w:pPr>
         <w:pStyle w:val="Heading3"/>
       </w:pPr>
-      <w:bookmarkStart w:id="19" w:name="_Toc223468475"/>
+      <w:bookmarkStart w:id="19" w:name="_Toc223545531"/>
       <w:r>
         <w:t>Съдържание на текстовите файлове преди криптирането:</w:t>
       </w:r>
@@ -6880,14 +7596,27 @@
       <w:r>
         <w:t xml:space="preserve">Фигура </w:t>
       </w:r>
-      <w:fldSimple w:instr=" SEQ Фигура \* ARABIC ">
-        <w:r>
-          <w:rPr>
-            <w:noProof/>
-          </w:rPr>
-          <w:t>12</w:t>
-        </w:r>
-      </w:fldSimple>
+      <w:r>
+        <w:fldChar w:fldCharType="begin"/>
+      </w:r>
+      <w:r>
+        <w:instrText xml:space="preserve"> SEQ Фигура \* ARABIC </w:instrText>
+      </w:r>
+      <w:r>
+        <w:fldChar w:fldCharType="separate"/>
+      </w:r>
+      <w:r>
+        <w:rPr>
+          <w:noProof/>
+        </w:rPr>
+        <w:t>12</w:t>
+      </w:r>
+      <w:r>
+        <w:rPr>
+          <w:noProof/>
+        </w:rPr>
+        <w:fldChar w:fldCharType="end"/>
+      </w:r>
       <w:r>
         <w:t xml:space="preserve">: </w:t>
       </w:r>
@@ -6918,14 +7647,27 @@
       <w:r>
         <w:t xml:space="preserve">Фигура </w:t>
       </w:r>
-      <w:fldSimple w:instr=" SEQ Фигура \* ARABIC ">
-        <w:r>
-          <w:rPr>
-            <w:noProof/>
-          </w:rPr>
-          <w:t>13</w:t>
-        </w:r>
-      </w:fldSimple>
+      <w:r>
+        <w:fldChar w:fldCharType="begin"/>
+      </w:r>
+      <w:r>
+        <w:instrText xml:space="preserve"> SEQ Фигура \* ARABIC </w:instrText>
+      </w:r>
+      <w:r>
+        <w:fldChar w:fldCharType="separate"/>
+      </w:r>
+      <w:r>
+        <w:rPr>
+          <w:noProof/>
+        </w:rPr>
+        <w:t>13</w:t>
+      </w:r>
+      <w:r>
+        <w:rPr>
+          <w:noProof/>
+        </w:rPr>
+        <w:fldChar w:fldCharType="end"/>
+      </w:r>
       <w:r>
         <w:rPr>
           <w:lang w:val="en-US"/>
@@ -6950,14 +7692,27 @@
       <w:r>
         <w:t xml:space="preserve">Фигура </w:t>
       </w:r>
-      <w:fldSimple w:instr=" SEQ Фигура \* ARABIC ">
-        <w:r>
-          <w:rPr>
-            <w:noProof/>
-          </w:rPr>
-          <w:t>14</w:t>
-        </w:r>
-      </w:fldSimple>
+      <w:r>
+        <w:fldChar w:fldCharType="begin"/>
+      </w:r>
+      <w:r>
+        <w:instrText xml:space="preserve"> SEQ Фигура \* ARABIC </w:instrText>
+      </w:r>
+      <w:r>
+        <w:fldChar w:fldCharType="separate"/>
+      </w:r>
+      <w:r>
+        <w:rPr>
+          <w:noProof/>
+        </w:rPr>
+        <w:t>14</w:t>
+      </w:r>
+      <w:r>
+        <w:rPr>
+          <w:noProof/>
+        </w:rPr>
+        <w:fldChar w:fldCharType="end"/>
+      </w:r>
       <w:r>
         <w:rPr>
           <w:lang w:val="en-US"/>
@@ -6981,7 +7736,7 @@
       <w:pPr>
         <w:pStyle w:val="Heading3"/>
       </w:pPr>
-      <w:bookmarkStart w:id="20" w:name="_Toc223468476"/>
+      <w:bookmarkStart w:id="20" w:name="_Toc223545532"/>
       <w:r>
         <w:t>Стартиране на демото:</w:t>
       </w:r>
@@ -7039,14 +7794,27 @@
       <w:r>
         <w:t xml:space="preserve">Фигура </w:t>
       </w:r>
-      <w:fldSimple w:instr=" SEQ Фигура \* ARABIC ">
-        <w:r>
-          <w:rPr>
-            <w:noProof/>
-          </w:rPr>
-          <w:t>15</w:t>
-        </w:r>
-      </w:fldSimple>
+      <w:r>
+        <w:fldChar w:fldCharType="begin"/>
+      </w:r>
+      <w:r>
+        <w:instrText xml:space="preserve"> SEQ Фигура \* ARABIC </w:instrText>
+      </w:r>
+      <w:r>
+        <w:fldChar w:fldCharType="separate"/>
+      </w:r>
+      <w:r>
+        <w:rPr>
+          <w:noProof/>
+        </w:rPr>
+        <w:t>15</w:t>
+      </w:r>
+      <w:r>
+        <w:rPr>
+          <w:noProof/>
+        </w:rPr>
+        <w:fldChar w:fldCharType="end"/>
+      </w:r>
       <w:r>
         <w:t>: Какво се визуализира първо на потребителя</w:t>
       </w:r>
@@ -7167,14 +7935,27 @@
       <w:r>
         <w:t xml:space="preserve">Фигура </w:t>
       </w:r>
-      <w:fldSimple w:instr=" SEQ Фигура \* ARABIC ">
-        <w:r>
-          <w:rPr>
-            <w:noProof/>
-          </w:rPr>
-          <w:t>16</w:t>
-        </w:r>
-      </w:fldSimple>
+      <w:r>
+        <w:fldChar w:fldCharType="begin"/>
+      </w:r>
+      <w:r>
+        <w:instrText xml:space="preserve"> SEQ Фигура \* ARABIC </w:instrText>
+      </w:r>
+      <w:r>
+        <w:fldChar w:fldCharType="separate"/>
+      </w:r>
+      <w:r>
+        <w:rPr>
+          <w:noProof/>
+        </w:rPr>
+        <w:t>16</w:t>
+      </w:r>
+      <w:r>
+        <w:rPr>
+          <w:noProof/>
+        </w:rPr>
+        <w:fldChar w:fldCharType="end"/>
+      </w:r>
       <w:r>
         <w:t>: Симулация на атаката. Файловете са криптирани. Потребителят трябва да потвърди, че е заплатил.</w:t>
       </w:r>
@@ -7199,14 +7980,27 @@
       <w:r>
         <w:t xml:space="preserve">Фигура </w:t>
       </w:r>
-      <w:fldSimple w:instr=" SEQ Фигура \* ARABIC ">
-        <w:r>
-          <w:rPr>
-            <w:noProof/>
-          </w:rPr>
-          <w:t>17</w:t>
-        </w:r>
-      </w:fldSimple>
+      <w:r>
+        <w:fldChar w:fldCharType="begin"/>
+      </w:r>
+      <w:r>
+        <w:instrText xml:space="preserve"> SEQ Фигура \* ARABIC </w:instrText>
+      </w:r>
+      <w:r>
+        <w:fldChar w:fldCharType="separate"/>
+      </w:r>
+      <w:r>
+        <w:rPr>
+          <w:noProof/>
+        </w:rPr>
+        <w:t>17</w:t>
+      </w:r>
+      <w:r>
+        <w:rPr>
+          <w:noProof/>
+        </w:rPr>
+        <w:fldChar w:fldCharType="end"/>
+      </w:r>
       <w:r>
         <w:t xml:space="preserve">: </w:t>
       </w:r>
@@ -7240,14 +8034,27 @@
       <w:r>
         <w:t xml:space="preserve">Фигура </w:t>
       </w:r>
-      <w:fldSimple w:instr=" SEQ Фигура \* ARABIC ">
-        <w:r>
-          <w:rPr>
-            <w:noProof/>
-          </w:rPr>
-          <w:t>18</w:t>
-        </w:r>
-      </w:fldSimple>
+      <w:r>
+        <w:fldChar w:fldCharType="begin"/>
+      </w:r>
+      <w:r>
+        <w:instrText xml:space="preserve"> SEQ Фигура \* ARABIC </w:instrText>
+      </w:r>
+      <w:r>
+        <w:fldChar w:fldCharType="separate"/>
+      </w:r>
+      <w:r>
+        <w:rPr>
+          <w:noProof/>
+        </w:rPr>
+        <w:t>18</w:t>
+      </w:r>
+      <w:r>
+        <w:rPr>
+          <w:noProof/>
+        </w:rPr>
+        <w:fldChar w:fldCharType="end"/>
+      </w:r>
       <w:r>
         <w:t xml:space="preserve">: </w:t>
       </w:r>
@@ -7278,14 +8085,27 @@
       <w:r>
         <w:t xml:space="preserve">Фигура </w:t>
       </w:r>
-      <w:fldSimple w:instr=" SEQ Фигура \* ARABIC ">
-        <w:r>
-          <w:rPr>
-            <w:noProof/>
-          </w:rPr>
-          <w:t>19</w:t>
-        </w:r>
-      </w:fldSimple>
+      <w:r>
+        <w:fldChar w:fldCharType="begin"/>
+      </w:r>
+      <w:r>
+        <w:instrText xml:space="preserve"> SEQ Фигура \* ARABIC </w:instrText>
+      </w:r>
+      <w:r>
+        <w:fldChar w:fldCharType="separate"/>
+      </w:r>
+      <w:r>
+        <w:rPr>
+          <w:noProof/>
+        </w:rPr>
+        <w:t>19</w:t>
+      </w:r>
+      <w:r>
+        <w:rPr>
+          <w:noProof/>
+        </w:rPr>
+        <w:fldChar w:fldCharType="end"/>
+      </w:r>
       <w:r>
         <w:rPr>
           <w:lang w:val="en-US"/>
@@ -7319,10 +8139,13 @@
       <w:pPr>
         <w:pStyle w:val="Heading3"/>
       </w:pPr>
-      <w:bookmarkStart w:id="21" w:name="_Toc223468477"/>
+      <w:bookmarkStart w:id="21" w:name="_Toc223545533"/>
       <w:r>
         <w:lastRenderedPageBreak/>
-        <w:t>Жертвата е заплатила откупа:</w:t>
+        <w:t xml:space="preserve">Потърпевшият </w:t>
+      </w:r>
+      <w:r>
+        <w:t>е заплатил откупа:</w:t>
       </w:r>
       <w:bookmarkEnd w:id="21"/>
     </w:p>
@@ -7424,14 +8247,27 @@
       <w:r>
         <w:t xml:space="preserve">Фигура </w:t>
       </w:r>
-      <w:fldSimple w:instr=" SEQ Фигура \* ARABIC ">
-        <w:r>
-          <w:rPr>
-            <w:noProof/>
-          </w:rPr>
-          <w:t>20</w:t>
-        </w:r>
-      </w:fldSimple>
+      <w:r>
+        <w:fldChar w:fldCharType="begin"/>
+      </w:r>
+      <w:r>
+        <w:instrText xml:space="preserve"> SEQ Фигура \* ARABIC </w:instrText>
+      </w:r>
+      <w:r>
+        <w:fldChar w:fldCharType="separate"/>
+      </w:r>
+      <w:r>
+        <w:rPr>
+          <w:noProof/>
+        </w:rPr>
+        <w:t>20</w:t>
+      </w:r>
+      <w:r>
+        <w:rPr>
+          <w:noProof/>
+        </w:rPr>
+        <w:fldChar w:fldCharType="end"/>
+      </w:r>
       <w:r>
         <w:t>: Файловете са възстановени</w:t>
       </w:r>
@@ -7461,14 +8297,27 @@
       <w:r>
         <w:t xml:space="preserve">Фигура </w:t>
       </w:r>
-      <w:fldSimple w:instr=" SEQ Фигура \* ARABIC ">
-        <w:r>
-          <w:rPr>
-            <w:noProof/>
-          </w:rPr>
-          <w:t>21</w:t>
-        </w:r>
-      </w:fldSimple>
+      <w:r>
+        <w:fldChar w:fldCharType="begin"/>
+      </w:r>
+      <w:r>
+        <w:instrText xml:space="preserve"> SEQ Фигура \* ARABIC </w:instrText>
+      </w:r>
+      <w:r>
+        <w:fldChar w:fldCharType="separate"/>
+      </w:r>
+      <w:r>
+        <w:rPr>
+          <w:noProof/>
+        </w:rPr>
+        <w:t>21</w:t>
+      </w:r>
+      <w:r>
+        <w:rPr>
+          <w:noProof/>
+        </w:rPr>
+        <w:fldChar w:fldCharType="end"/>
+      </w:r>
       <w:r>
         <w:t>:</w:t>
       </w:r>
@@ -7501,14 +8350,27 @@
       <w:r>
         <w:t xml:space="preserve">Фигура </w:t>
       </w:r>
-      <w:fldSimple w:instr=" SEQ Фигура \* ARABIC ">
-        <w:r>
-          <w:rPr>
-            <w:noProof/>
-          </w:rPr>
-          <w:t>22</w:t>
-        </w:r>
-      </w:fldSimple>
+      <w:r>
+        <w:fldChar w:fldCharType="begin"/>
+      </w:r>
+      <w:r>
+        <w:instrText xml:space="preserve"> SEQ Фигура \* ARABIC </w:instrText>
+      </w:r>
+      <w:r>
+        <w:fldChar w:fldCharType="separate"/>
+      </w:r>
+      <w:r>
+        <w:rPr>
+          <w:noProof/>
+        </w:rPr>
+        <w:t>22</w:t>
+      </w:r>
+      <w:r>
+        <w:rPr>
+          <w:noProof/>
+        </w:rPr>
+        <w:fldChar w:fldCharType="end"/>
+      </w:r>
       <w:r>
         <w:t xml:space="preserve">: </w:t>
       </w:r>
@@ -7538,14 +8400,27 @@
       <w:r>
         <w:t xml:space="preserve">Фигура </w:t>
       </w:r>
-      <w:fldSimple w:instr=" SEQ Фигура \* ARABIC ">
-        <w:r>
-          <w:rPr>
-            <w:noProof/>
-          </w:rPr>
-          <w:t>23</w:t>
-        </w:r>
-      </w:fldSimple>
+      <w:r>
+        <w:fldChar w:fldCharType="begin"/>
+      </w:r>
+      <w:r>
+        <w:instrText xml:space="preserve"> SEQ Фигура \* ARABIC </w:instrText>
+      </w:r>
+      <w:r>
+        <w:fldChar w:fldCharType="separate"/>
+      </w:r>
+      <w:r>
+        <w:rPr>
+          <w:noProof/>
+        </w:rPr>
+        <w:t>23</w:t>
+      </w:r>
+      <w:r>
+        <w:rPr>
+          <w:noProof/>
+        </w:rPr>
+        <w:fldChar w:fldCharType="end"/>
+      </w:r>
       <w:r>
         <w:rPr>
           <w:lang w:val="en-US"/>
@@ -7575,7 +8450,7 @@
       <w:pPr>
         <w:pStyle w:val="Heading3"/>
       </w:pPr>
-      <w:bookmarkStart w:id="22" w:name="_Toc223468478"/>
+      <w:bookmarkStart w:id="22" w:name="_Toc223545534"/>
       <w:r>
         <w:rPr>
           <w:lang w:val="en-US"/>
@@ -7659,7 +8534,7 @@
           <w:lang w:val="en-US"/>
         </w:rPr>
       </w:pPr>
-      <w:bookmarkStart w:id="23" w:name="_Toc223468479"/>
+      <w:bookmarkStart w:id="23" w:name="_Toc223545535"/>
       <w:r>
         <w:lastRenderedPageBreak/>
         <w:t xml:space="preserve">Стратегии и защита от </w:t>
@@ -7721,7 +8596,7 @@
           <w:numId w:val="6"/>
         </w:numPr>
       </w:pPr>
-      <w:bookmarkStart w:id="24" w:name="_Toc223468480"/>
+      <w:bookmarkStart w:id="24" w:name="_Toc223545536"/>
       <w:r>
         <w:t xml:space="preserve">Подготовка за </w:t>
       </w:r>
@@ -7935,7 +8810,7 @@
           <w:lang w:val="en-US"/>
         </w:rPr>
       </w:pPr>
-      <w:bookmarkStart w:id="25" w:name="_Toc223468481"/>
+      <w:bookmarkStart w:id="25" w:name="_Toc223545537"/>
       <w:r>
         <w:lastRenderedPageBreak/>
         <w:t xml:space="preserve">Превенция </w:t>
@@ -8288,14 +9163,27 @@
       <w:r>
         <w:t xml:space="preserve">Фигура </w:t>
       </w:r>
-      <w:fldSimple w:instr=" SEQ Фигура \* ARABIC ">
-        <w:r>
-          <w:rPr>
-            <w:noProof/>
-          </w:rPr>
-          <w:t>24</w:t>
-        </w:r>
-      </w:fldSimple>
+      <w:r>
+        <w:fldChar w:fldCharType="begin"/>
+      </w:r>
+      <w:r>
+        <w:instrText xml:space="preserve"> SEQ Фигура \* ARABIC </w:instrText>
+      </w:r>
+      <w:r>
+        <w:fldChar w:fldCharType="separate"/>
+      </w:r>
+      <w:r>
+        <w:rPr>
+          <w:noProof/>
+        </w:rPr>
+        <w:t>24</w:t>
+      </w:r>
+      <w:r>
+        <w:rPr>
+          <w:noProof/>
+        </w:rPr>
+        <w:fldChar w:fldCharType="end"/>
+      </w:r>
       <w:r>
         <w:rPr>
           <w:lang w:val="en-US"/>
@@ -8345,13 +9233,27 @@
         <w:rPr>
           <w:lang w:val="en-US"/>
         </w:rPr>
-        <w:t xml:space="preserve"> на internet-facing vulnerabilities. </w:t>
+        <w:t xml:space="preserve"> </w:t>
       </w:r>
       <w:proofErr w:type="spellStart"/>
       <w:r>
         <w:rPr>
           <w:lang w:val="en-US"/>
         </w:rPr>
+        <w:t>на</w:t>
+      </w:r>
+      <w:proofErr w:type="spellEnd"/>
+      <w:r>
+        <w:rPr>
+          <w:lang w:val="en-US"/>
+        </w:rPr>
+        <w:t xml:space="preserve"> internet-facing vulnerabilities. </w:t>
+      </w:r>
+      <w:proofErr w:type="spellStart"/>
+      <w:r>
+        <w:rPr>
+          <w:lang w:val="en-US"/>
+        </w:rPr>
         <w:t>Експлоатация</w:t>
       </w:r>
       <w:proofErr w:type="spellEnd"/>
@@ -8359,7 +9261,21 @@
         <w:rPr>
           <w:lang w:val="en-US"/>
         </w:rPr>
-        <w:t xml:space="preserve"> на </w:t>
+        <w:t xml:space="preserve"> </w:t>
+      </w:r>
+      <w:proofErr w:type="spellStart"/>
+      <w:r>
+        <w:rPr>
+          <w:lang w:val="en-US"/>
+        </w:rPr>
+        <w:t>на</w:t>
+      </w:r>
+      <w:proofErr w:type="spellEnd"/>
+      <w:r>
+        <w:rPr>
+          <w:lang w:val="en-US"/>
+        </w:rPr>
+        <w:t xml:space="preserve"> </w:t>
       </w:r>
       <w:proofErr w:type="spellStart"/>
       <w:r>
@@ -8433,14 +9349,27 @@
       <w:r>
         <w:t xml:space="preserve">Фигура </w:t>
       </w:r>
-      <w:fldSimple w:instr=" SEQ Фигура \* ARABIC ">
-        <w:r>
-          <w:rPr>
-            <w:noProof/>
-          </w:rPr>
-          <w:t>25</w:t>
-        </w:r>
-      </w:fldSimple>
+      <w:r>
+        <w:fldChar w:fldCharType="begin"/>
+      </w:r>
+      <w:r>
+        <w:instrText xml:space="preserve"> SEQ Фигура \* ARABIC </w:instrText>
+      </w:r>
+      <w:r>
+        <w:fldChar w:fldCharType="separate"/>
+      </w:r>
+      <w:r>
+        <w:rPr>
+          <w:noProof/>
+        </w:rPr>
+        <w:t>25</w:t>
+      </w:r>
+      <w:r>
+        <w:rPr>
+          <w:noProof/>
+        </w:rPr>
+        <w:fldChar w:fldCharType="end"/>
+      </w:r>
       <w:r>
         <w:t>: Д</w:t>
       </w:r>
@@ -8480,7 +9409,7 @@
           <w:szCs w:val="20"/>
         </w:rPr>
       </w:pPr>
-      <w:bookmarkStart w:id="28" w:name="_Toc223468482"/>
+      <w:bookmarkStart w:id="28" w:name="_Toc223545538"/>
       <w:r>
         <w:lastRenderedPageBreak/>
         <w:t xml:space="preserve">Компрометирани </w:t>
@@ -8902,14 +9831,27 @@
       <w:r>
         <w:t xml:space="preserve">Фигура </w:t>
       </w:r>
-      <w:fldSimple w:instr=" SEQ Фигура \* ARABIC ">
-        <w:r>
-          <w:rPr>
-            <w:noProof/>
-          </w:rPr>
-          <w:t>26</w:t>
-        </w:r>
-      </w:fldSimple>
+      <w:r>
+        <w:fldChar w:fldCharType="begin"/>
+      </w:r>
+      <w:r>
+        <w:instrText xml:space="preserve"> SEQ Фигура \* ARABIC </w:instrText>
+      </w:r>
+      <w:r>
+        <w:fldChar w:fldCharType="separate"/>
+      </w:r>
+      <w:r>
+        <w:rPr>
+          <w:noProof/>
+        </w:rPr>
+        <w:t>26</w:t>
+      </w:r>
+      <w:r>
+        <w:rPr>
+          <w:noProof/>
+        </w:rPr>
+        <w:fldChar w:fldCharType="end"/>
+      </w:r>
       <w:r>
         <w:t xml:space="preserve">: </w:t>
       </w:r>
@@ -8932,7 +9874,7 @@
       <w:r>
         <w:br w:type="page"/>
       </w:r>
-      <w:bookmarkStart w:id="30" w:name="_Toc223468483"/>
+      <w:bookmarkStart w:id="30" w:name="_Toc223545539"/>
       <w:r>
         <w:rPr>
           <w:lang w:val="en-US"/>
@@ -9192,14 +10134,27 @@
       <w:r>
         <w:t xml:space="preserve">Фигура </w:t>
       </w:r>
-      <w:fldSimple w:instr=" SEQ Фигура \* ARABIC ">
-        <w:r>
-          <w:rPr>
-            <w:noProof/>
-          </w:rPr>
-          <w:t>27</w:t>
-        </w:r>
-      </w:fldSimple>
+      <w:r>
+        <w:fldChar w:fldCharType="begin"/>
+      </w:r>
+      <w:r>
+        <w:instrText xml:space="preserve"> SEQ Фигура \* ARABIC </w:instrText>
+      </w:r>
+      <w:r>
+        <w:fldChar w:fldCharType="separate"/>
+      </w:r>
+      <w:r>
+        <w:rPr>
+          <w:noProof/>
+        </w:rPr>
+        <w:t>27</w:t>
+      </w:r>
+      <w:r>
+        <w:rPr>
+          <w:noProof/>
+        </w:rPr>
+        <w:fldChar w:fldCharType="end"/>
+      </w:r>
       <w:r>
         <w:t xml:space="preserve">: </w:t>
       </w:r>
@@ -9227,7 +10182,7 @@
           <w:lang w:val="en-US"/>
         </w:rPr>
       </w:pPr>
-      <w:bookmarkStart w:id="32" w:name="_Toc223468484"/>
+      <w:bookmarkStart w:id="32" w:name="_Toc223545540"/>
       <w:r>
         <w:lastRenderedPageBreak/>
         <w:t xml:space="preserve">Други форми на </w:t>
@@ -9455,7 +10410,7 @@
       <w:pPr>
         <w:pStyle w:val="Heading1"/>
       </w:pPr>
-      <w:bookmarkStart w:id="33" w:name="_Toc223468485"/>
+      <w:bookmarkStart w:id="33" w:name="_Toc223545541"/>
       <w:r>
         <w:lastRenderedPageBreak/>
         <w:t>Какво да направим, ако станем жертва на</w:t>
@@ -9817,7 +10772,7 @@
         <w:br w:type="page"/>
       </w:r>
     </w:p>
-    <w:bookmarkStart w:id="34" w:name="_Toc223468486" w:displacedByCustomXml="next"/>
+    <w:bookmarkStart w:id="34" w:name="_Toc223545542" w:displacedByCustomXml="next"/>
     <w:sdt>
       <w:sdtPr>
         <w:rPr>
@@ -12309,6 +13264,7 @@
   <w:style w:type="character" w:default="1" w:styleId="DefaultParagraphFont">
     <w:name w:val="Default Paragraph Font"/>
     <w:uiPriority w:val="1"/>
+    <w:semiHidden/>
     <w:unhideWhenUsed/>
   </w:style>
   <w:style w:type="table" w:default="1" w:styleId="TableNormal">
@@ -13152,12 +14108,11 @@
 </file>
 
 <file path=customXml/item1.xml><?xml version="1.0" encoding="utf-8"?>
-<?mso-contentType ?>
-<FormTemplates xmlns="http://schemas.microsoft.com/sharepoint/v3/contenttype/forms">
-  <Display>DocumentLibraryForm</Display>
-  <Edit>DocumentLibraryForm</Edit>
-  <New>DocumentLibraryForm</New>
-</FormTemplates>
+<p:properties xmlns:p="http://schemas.microsoft.com/office/2006/metadata/properties" xmlns:xsi="http://www.w3.org/2001/XMLSchema-instance" xmlns:pc="http://schemas.microsoft.com/office/infopath/2007/PartnerControls">
+  <documentManagement>
+    <_activity xmlns="16eb03e4-fe34-41e0-b148-6c2f228be8b6" xsi:nil="true"/>
+  </documentManagement>
+</p:properties>
 </file>
 
 <file path=customXml/item2.xml><?xml version="1.0" encoding="utf-8"?>
@@ -13356,11 +14311,12 @@
 </file>
 
 <file path=customXml/item3.xml><?xml version="1.0" encoding="utf-8"?>
-<p:properties xmlns:p="http://schemas.microsoft.com/office/2006/metadata/properties" xmlns:xsi="http://www.w3.org/2001/XMLSchema-instance" xmlns:pc="http://schemas.microsoft.com/office/infopath/2007/PartnerControls">
-  <documentManagement>
-    <_activity xmlns="16eb03e4-fe34-41e0-b148-6c2f228be8b6" xsi:nil="true"/>
-  </documentManagement>
-</p:properties>
+<?mso-contentType ?>
+<FormTemplates xmlns="http://schemas.microsoft.com/sharepoint/v3/contenttype/forms">
+  <Display>DocumentLibraryForm</Display>
+  <Edit>DocumentLibraryForm</Edit>
+  <New>DocumentLibraryForm</New>
+</FormTemplates>
 </file>
 
 <file path=customXml/item4.xml><?xml version="1.0" encoding="utf-8"?>
@@ -13524,9 +14480,11 @@
 </file>
 
 <file path=customXml/itemProps1.xml><?xml version="1.0" encoding="utf-8"?>
-<ds:datastoreItem xmlns:ds="http://schemas.openxmlformats.org/officeDocument/2006/customXml" ds:itemID="{95434D9A-8BA9-420D-93D1-CF746F074EA1}">
+<ds:datastoreItem xmlns:ds="http://schemas.openxmlformats.org/officeDocument/2006/customXml" ds:itemID="{6C2A65B6-C891-4DE3-96AA-342988F8CBF9}">
   <ds:schemaRefs>
-    <ds:schemaRef ds:uri="http://schemas.microsoft.com/sharepoint/v3/contenttype/forms"/>
+    <ds:schemaRef ds:uri="http://schemas.microsoft.com/office/2006/metadata/properties"/>
+    <ds:schemaRef ds:uri="http://schemas.microsoft.com/office/infopath/2007/PartnerControls"/>
+    <ds:schemaRef ds:uri="16eb03e4-fe34-41e0-b148-6c2f228be8b6"/>
   </ds:schemaRefs>
 </ds:datastoreItem>
 </file>
@@ -13551,11 +14509,9 @@
 </file>
 
 <file path=customXml/itemProps3.xml><?xml version="1.0" encoding="utf-8"?>
-<ds:datastoreItem xmlns:ds="http://schemas.openxmlformats.org/officeDocument/2006/customXml" ds:itemID="{6C2A65B6-C891-4DE3-96AA-342988F8CBF9}">
+<ds:datastoreItem xmlns:ds="http://schemas.openxmlformats.org/officeDocument/2006/customXml" ds:itemID="{95434D9A-8BA9-420D-93D1-CF746F074EA1}">
   <ds:schemaRefs>
-    <ds:schemaRef ds:uri="http://schemas.microsoft.com/office/2006/metadata/properties"/>
-    <ds:schemaRef ds:uri="http://schemas.microsoft.com/office/infopath/2007/PartnerControls"/>
-    <ds:schemaRef ds:uri="16eb03e4-fe34-41e0-b148-6c2f228be8b6"/>
+    <ds:schemaRef ds:uri="http://schemas.microsoft.com/sharepoint/v3/contenttype/forms"/>
   </ds:schemaRefs>
 </ds:datastoreItem>
 </file>

</xml_diff>